<commit_message>
Reforça contratos contra abandono/desvio e gera solicitação de corpo clínico por locatário
Cláusulas novas (Conceitualle e Face), inseridas após a 23ª (LGPD), com renumeração de Foro (28ª) e Descumprimento (29ª):
- 24ª Não aliciamento de pacientes (carteira/fundo de comércio; comunicação pela clínica; multa)
- 25ª Transição e comunicação de saída (contatos atualizados, resposta em 5 dias, entrega ordenada)
- 26ª Não aliciamento de profissionais (12 meses, multa)
- 27ª Confidencialidade e uso da marca

Solicitação de Integração ao Corpo Clínico agora pré-preenchida e por locatário,
dinâmica conforme o nº de locatários do HTML, via marcadores condicionais
{{LOCATARIO 2_INICIO}}/_FIM e {{LOCATARIO 3_...}} (sem alterar index.html/Apps Script).

.gitignore: blinda dados de casos reais (notificações/ofícios/contranotificações), .claude/ e scripts auxiliares.

Co-Authored-By: Claude Opus 4.8 (1M context) <noreply@anthropic.com>
</commit_message>
<xml_diff>
--- a/clinica.docx
+++ b/clinica.docx
@@ -1561,18 +1561,186 @@
     </w:p>
     <w:p>
       <w:pPr>
-        <w:spacing w:after="150" w:line="276"/>
-        <w:jc w:val="both"/>
-      </w:pPr>
-      <w:r>
-        <w:rPr>
-          <w:rFonts w:ascii="Arial" w:cs="Arial" w:eastAsia="Arial" w:hAnsi="Arial"/>
-          <w:b/>
-          <w:bCs/>
-          <w:sz w:val="22"/>
-          <w:szCs w:val="22"/>
-        </w:rPr>
-        <w:t xml:space="preserve">CLÁUSULA VIGÉSIMA QUARTA – DO FORO: </w:t>
+        <w:spacing w:after="150"/>
+        <w:jc w:val="both"/>
+      </w:pPr>
+      <w:r>
+        <w:rPr>
+          <w:rFonts w:ascii="Arial" w:hAnsi="Arial" w:cs="Arial"/>
+          <w:b/>
+          <w:sz w:val="22"/>
+        </w:rPr>
+        <w:t xml:space="preserve">CLÁUSULA VIGÉSIMA QUARTA – DO NÃO ALICIAMENTO DE PACIENTES: </w:t>
+      </w:r>
+      <w:r>
+        <w:rPr>
+          <w:rFonts w:ascii="Arial" w:hAnsi="Arial" w:cs="Arial"/>
+          <w:sz w:val="22"/>
+        </w:rPr>
+        <w:t>Os pacientes atendidos por intermédio do credenciamento, dos convênios, da recepção, da captação, do marketing e da estrutura do LOCADOR integram a carteira e o fundo de comércio da clínica, não se confundindo com a clientela própria que o LOCATÁRIO comprovadamente já possuía antes do início desta locação. O LOCATÁRIO obriga-se a não desviar, transferir, captar ou aliciar, direta ou indiretamente, por si ou por interposta pessoa, para outro endereço ou estabelecimento, os pacientes a ele encaminhados ou por ele atendidos em razão da estrutura e dos convênios do LOCADOR, durante a vigência deste contrato e pelo prazo de 12 (doze) meses contados do seu término.</w:t>
+      </w:r>
+    </w:p>
+    <w:p>
+      <w:pPr>
+        <w:spacing w:after="150"/>
+        <w:jc w:val="both"/>
+      </w:pPr>
+      <w:r>
+        <w:rPr>
+          <w:rFonts w:ascii="Arial" w:hAnsi="Arial" w:cs="Arial"/>
+          <w:b/>
+          <w:sz w:val="22"/>
+        </w:rPr>
+        <w:t xml:space="preserve">Parágrafo Primeiro – </w:t>
+      </w:r>
+      <w:r>
+        <w:rPr>
+          <w:rFonts w:ascii="Arial" w:hAnsi="Arial" w:cs="Arial"/>
+          <w:sz w:val="22"/>
+        </w:rPr>
+        <w:t>A comunicação aos pacientes em tratamento sobre eventual descontinuidade do atendimento será realizada pelo LOCADOR ou de forma conjunta com ele, observado o art. 11, inciso VI, do Código de Ética Odontológica, sendo vedado ao LOCATÁRIO valer-se de tal comunicação, dos dados de contato ou dos prontuários para captar pacientes para novo local de atendimento.</w:t>
+      </w:r>
+    </w:p>
+    <w:p>
+      <w:pPr>
+        <w:spacing w:after="150"/>
+        <w:jc w:val="both"/>
+      </w:pPr>
+      <w:r>
+        <w:rPr>
+          <w:rFonts w:ascii="Arial" w:hAnsi="Arial" w:cs="Arial"/>
+          <w:b/>
+          <w:sz w:val="22"/>
+        </w:rPr>
+        <w:t xml:space="preserve">Parágrafo Segundo – </w:t>
+      </w:r>
+      <w:r>
+        <w:rPr>
+          <w:rFonts w:ascii="Arial" w:hAnsi="Arial" w:cs="Arial"/>
+          <w:sz w:val="22"/>
+        </w:rPr>
+        <w:t>A infração ao disposto nesta cláusula constitui falta grave e sujeita o LOCATÁRIO à multa prevista na Cláusula Décima Sétima, Parágrafo Segundo, sem prejuízo da reparação das perdas e danos efetivamente apurados, inclusive lucros cessantes.</w:t>
+      </w:r>
+    </w:p>
+    <w:p>
+      <w:pPr>
+        <w:spacing w:after="150"/>
+        <w:jc w:val="both"/>
+      </w:pPr>
+      <w:r>
+        <w:rPr>
+          <w:rFonts w:ascii="Arial" w:hAnsi="Arial" w:cs="Arial"/>
+          <w:b/>
+          <w:sz w:val="22"/>
+        </w:rPr>
+        <w:t xml:space="preserve">CLÁUSULA VIGÉSIMA QUINTA – DA TRANSIÇÃO E DA COMUNICAÇÃO DE SAÍDA: </w:t>
+      </w:r>
+      <w:r>
+        <w:rPr>
+          <w:rFonts w:ascii="Arial" w:hAnsi="Arial" w:cs="Arial"/>
+          <w:sz w:val="22"/>
+        </w:rPr>
+        <w:t>O LOCATÁRIO obriga-se a manter atualizados, durante toda a locação, os seus dados de contato (endereço, telefone, e-mail e WhatsApp constantes da qualificação) e a responder às comunicações do LOCADOR no prazo de 5 (cinco) dias. As notificações e comunicações enviadas aos referidos contatos reputam-se recebidas para todos os fins de direito.</w:t>
+      </w:r>
+    </w:p>
+    <w:p>
+      <w:pPr>
+        <w:spacing w:after="150"/>
+        <w:jc w:val="both"/>
+      </w:pPr>
+      <w:r>
+        <w:rPr>
+          <w:rFonts w:ascii="Arial" w:hAnsi="Arial" w:cs="Arial"/>
+          <w:b/>
+          <w:sz w:val="22"/>
+        </w:rPr>
+        <w:t xml:space="preserve">Parágrafo Primeiro – </w:t>
+      </w:r>
+      <w:r>
+        <w:rPr>
+          <w:rFonts w:ascii="Arial" w:hAnsi="Arial" w:cs="Arial"/>
+          <w:sz w:val="22"/>
+        </w:rPr>
+        <w:t>Em qualquer hipótese de término, rescisão ou desocupação, e como condição da regular entrega do imóvel, o LOCATÁRIO realizará a transição ordenada do atendimento, mediante: (i) comunicação prévia e por escrito ao LOCADOR, na forma da Cláusula Décima Quinta; (ii) entrega das chaves acompanhada da vistoria de saída; e (iii) apresentação de relação dos pacientes em tratamento, com o respectivo estágio, para viabilizar a continuidade do cuidado.</w:t>
+      </w:r>
+    </w:p>
+    <w:p>
+      <w:pPr>
+        <w:spacing w:after="150"/>
+        <w:jc w:val="both"/>
+      </w:pPr>
+      <w:r>
+        <w:rPr>
+          <w:rFonts w:ascii="Arial" w:hAnsi="Arial" w:cs="Arial"/>
+          <w:b/>
+          <w:sz w:val="22"/>
+        </w:rPr>
+        <w:t xml:space="preserve">Parágrafo Segundo – </w:t>
+      </w:r>
+      <w:r>
+        <w:rPr>
+          <w:rFonts w:ascii="Arial" w:hAnsi="Arial" w:cs="Arial"/>
+          <w:sz w:val="22"/>
+        </w:rPr>
+        <w:t>A ausência de resposta às comunicações do LOCADOR, somada à cessação do atendimento, reforça a caracterização do abandono prevista na Cláusula Décima Sexta, autorizando as providências ali estabelecidas.</w:t>
+      </w:r>
+    </w:p>
+    <w:p>
+      <w:pPr>
+        <w:spacing w:after="150"/>
+        <w:jc w:val="both"/>
+      </w:pPr>
+      <w:r>
+        <w:rPr>
+          <w:rFonts w:ascii="Arial" w:hAnsi="Arial" w:cs="Arial"/>
+          <w:b/>
+          <w:sz w:val="22"/>
+        </w:rPr>
+        <w:t xml:space="preserve">CLÁUSULA VIGÉSIMA SEXTA – DO NÃO ALICIAMENTO DE PROFISSIONAIS: </w:t>
+      </w:r>
+      <w:r>
+        <w:rPr>
+          <w:rFonts w:ascii="Arial" w:hAnsi="Arial" w:cs="Arial"/>
+          <w:sz w:val="22"/>
+        </w:rPr>
+        <w:t>É vedado ao LOCATÁRIO, durante a vigência deste contrato e pelo prazo de 12 (doze) meses contados do seu término, contratar, aliciar ou desviar, direta ou indiretamente, funcionários, auxiliares ou demais profissionais que integrem ou tenham integrado o quadro da clínica do LOCADOR, salvo prévia e expressa concordância escrita deste. O descumprimento sujeita o LOCATÁRIO à multa prevista na Cláusula Décima Sétima, Parágrafo Segundo, sem prejuízo das perdas e danos.</w:t>
+      </w:r>
+    </w:p>
+    <w:p>
+      <w:pPr>
+        <w:spacing w:after="150"/>
+        <w:jc w:val="both"/>
+      </w:pPr>
+      <w:r>
+        <w:rPr>
+          <w:rFonts w:ascii="Arial" w:hAnsi="Arial" w:cs="Arial"/>
+          <w:b/>
+          <w:sz w:val="22"/>
+        </w:rPr>
+        <w:t xml:space="preserve">CLÁUSULA VIGÉSIMA SÉTIMA – DA CONFIDENCIALIDADE E DO USO DA MARCA: </w:t>
+      </w:r>
+      <w:r>
+        <w:rPr>
+          <w:rFonts w:ascii="Arial" w:hAnsi="Arial" w:cs="Arial"/>
+          <w:sz w:val="22"/>
+        </w:rPr>
+        <w:t>O LOCATÁRIO obriga-se a manter sigilo sobre as informações comerciais, administrativas, financeiras e cadastrais a que tiver acesso em razão da locação, bem como sobre dados de pacientes, fornecedores e convênios do LOCADOR, não podendo utilizá-los, reproduzi-los ou divulgá-los para finalidade estranha ao contrato. Encerrada a locação, cessa imediatamente qualquer direito de uso do nome, da marca, do logotipo, das redes sociais, do endereço e dos canais de comunicação do LOCADOR, vedada a sua utilização ou a indução dos pacientes a erro quanto ao local de atendimento. A infração sujeita o LOCATÁRIO às perdas e danos e à multa prevista na Cláusula Décima Sétima, Parágrafo Segundo.</w:t>
+      </w:r>
+    </w:p>
+    <w:p>
+      <w:pPr>
+        <w:spacing w:after="150" w:line="276"/>
+        <w:jc w:val="both"/>
+      </w:pPr>
+      <w:r>
+        <w:rPr>
+          <w:rFonts w:ascii="Arial" w:cs="Arial" w:eastAsia="Arial" w:hAnsi="Arial"/>
+          <w:b/>
+          <w:bCs/>
+          <w:sz w:val="22"/>
+          <w:szCs w:val="22"/>
+        </w:rPr>
+        <w:t xml:space="preserve">CLÁUSULA VIGÉSIMA OITAVA – DO FORO: </w:t>
       </w:r>
       <w:r>
         <w:rPr>
@@ -1596,7 +1764,7 @@
           <w:sz w:val="22"/>
           <w:szCs w:val="22"/>
         </w:rPr>
-        <w:t xml:space="preserve">CLÁUSULA VIGÉSIMA QUINTA – </w:t>
+        <w:t xml:space="preserve">CLÁUSULA VIGÉSIMA NONA – </w:t>
       </w:r>
       <w:r>
         <w:rPr>
@@ -2483,6 +2651,7 @@
     </w:p>
     <w:p>
       <w:pPr>
+        <w:pageBreakBefore/>
         <w:spacing w:after="160" w:before="280"/>
         <w:jc w:val="center"/>
       </w:pPr>
@@ -2508,7 +2677,7 @@
           <w:sz w:val="22"/>
           <w:szCs w:val="22"/>
         </w:rPr>
-        <w:t xml:space="preserve">EU, __________________________________________________, portador do CRO _______________ e CPF ______________________, solicito a minha integração ao corpo clínico para realizar atendimentos dos convênios em que a empresa é credenciada.</w:t>
+        <w:t>EU, {{nomeLoc1}}, portador(a) do CRO {{rgLoc1}} e CPF {{cpfLoc1}}, solicito a minha integração ao corpo clínico para realizar atendimentos dos convênios em que a empresa é credenciada.</w:t>
       </w:r>
     </w:p>
     <w:p>
@@ -2607,6 +2776,374 @@
           <w:szCs w:val="22"/>
         </w:rPr>
         <w:t xml:space="preserve">Cuiabá-MT, {{inicioContrato}}</w:t>
+      </w:r>
+    </w:p>
+    <w:p>
+      <w:pPr>
+        <w:spacing w:after="150"/>
+        <w:jc w:val="center"/>
+      </w:pPr>
+      <w:r>
+        <w:rPr>
+          <w:rFonts w:ascii="Arial" w:hAnsi="Arial" w:cs="Arial"/>
+          <w:sz w:val="22"/>
+        </w:rPr>
+        <w:t>_________________________________________</w:t>
+      </w:r>
+    </w:p>
+    <w:p>
+      <w:pPr>
+        <w:spacing w:after="150"/>
+        <w:jc w:val="center"/>
+      </w:pPr>
+      <w:r>
+        <w:rPr>
+          <w:rFonts w:ascii="Arial" w:hAnsi="Arial" w:cs="Arial"/>
+          <w:sz w:val="22"/>
+        </w:rPr>
+        <w:t>{{nomeLoc1}} – CRO {{rgLoc1}}</w:t>
+      </w:r>
+    </w:p>
+    <w:p>
+      <w:pPr>
+        <w:spacing w:after="150"/>
+        <w:jc w:val="both"/>
+      </w:pPr>
+      <w:r>
+        <w:rPr>
+          <w:rFonts w:ascii="Arial" w:hAnsi="Arial" w:cs="Arial"/>
+          <w:sz w:val="22"/>
+        </w:rPr>
+        <w:t>{{LOCATARIO 2_INICIO}}</w:t>
+      </w:r>
+    </w:p>
+    <w:p>
+      <w:pPr>
+        <w:pageBreakBefore/>
+        <w:spacing w:after="150"/>
+        <w:jc w:val="center"/>
+      </w:pPr>
+      <w:r>
+        <w:rPr>
+          <w:rFonts w:ascii="Arial" w:hAnsi="Arial" w:cs="Arial"/>
+          <w:b/>
+          <w:sz w:val="24"/>
+        </w:rPr>
+        <w:t>SOLICITAÇÃO DE INTEGRAÇÃO AO CORPO CLÍNICO</w:t>
+      </w:r>
+    </w:p>
+    <w:p>
+      <w:pPr>
+        <w:spacing w:after="150"/>
+        <w:jc w:val="both"/>
+      </w:pPr>
+      <w:r>
+        <w:rPr>
+          <w:rFonts w:ascii="Arial" w:hAnsi="Arial" w:cs="Arial"/>
+          <w:sz w:val="22"/>
+        </w:rPr>
+        <w:t>EU, {{nomeLoc2}}, portador(a) do CRO {{rgLoc2}} e CPF {{cpfLoc2}}, solicito a minha integração ao corpo clínico para realizar atendimentos dos convênios em que a empresa é credenciada.</w:t>
+      </w:r>
+    </w:p>
+    <w:p>
+      <w:pPr>
+        <w:spacing w:after="150"/>
+        <w:jc w:val="both"/>
+      </w:pPr>
+      <w:r>
+        <w:rPr>
+          <w:rFonts w:ascii="Arial" w:hAnsi="Arial" w:cs="Arial"/>
+          <w:sz w:val="22"/>
+        </w:rPr>
+        <w:t>Comprometo-me a respeitar as exigências de cada convênio quanto aos procedimentos e à elaboração de guias. Em caso de apuração de fraude pelo convênio, tenho ciência da responsabilização cível e criminal, perante a empresa e o convênio, além do afastamento imediato do corpo clínico.</w:t>
+      </w:r>
+    </w:p>
+    <w:p>
+      <w:pPr>
+        <w:spacing w:after="150"/>
+        <w:jc w:val="both"/>
+      </w:pPr>
+      <w:r>
+        <w:rPr>
+          <w:rFonts w:ascii="Arial" w:hAnsi="Arial" w:cs="Arial"/>
+          <w:sz w:val="22"/>
+        </w:rPr>
+        <w:t>Tenho ciência dos prazos de pagamento dos convênios e de que podem ocorrer glosas de guias, que são decisões dos convênios e não da empresa conveniada.</w:t>
+      </w:r>
+    </w:p>
+    <w:p>
+      <w:pPr>
+        <w:spacing w:after="150"/>
+        <w:jc w:val="both"/>
+      </w:pPr>
+      <w:r>
+        <w:rPr>
+          <w:rFonts w:ascii="Arial" w:hAnsi="Arial" w:cs="Arial"/>
+          <w:sz w:val="22"/>
+        </w:rPr>
+        <w:t>Os valores apurados serão pagos na conta da empresa conveniada, descontados apenas os custos de impostos, sem qualquer percentual de comissão para a empresa.</w:t>
+      </w:r>
+    </w:p>
+    <w:p>
+      <w:pPr>
+        <w:spacing w:after="150"/>
+        <w:jc w:val="both"/>
+      </w:pPr>
+      <w:r>
+        <w:rPr>
+          <w:rFonts w:ascii="Arial" w:hAnsi="Arial" w:cs="Arial"/>
+          <w:sz w:val="22"/>
+        </w:rPr>
+        <w:t>Tenho ciência de que a empresa pode, sem aviso prévio, excluir-me do corpo clínico por infração perante o plano ou por estratégias administrativas, sem prejuízo ao contrato de locação. A integração ao corpo clínico é concessão revogável a critério da empresa.</w:t>
+      </w:r>
+    </w:p>
+    <w:p>
+      <w:pPr>
+        <w:spacing w:after="150"/>
+        <w:jc w:val="both"/>
+      </w:pPr>
+      <w:r>
+        <w:rPr>
+          <w:rFonts w:ascii="Arial" w:hAnsi="Arial" w:cs="Arial"/>
+          <w:sz w:val="22"/>
+        </w:rPr>
+        <w:t>Declaro que o faturamento dos atendimentos é de exclusiva responsabilidade do dentista, não sendo a única fonte de renda, e que a exclusão do corpo clínico não afetará a manutenção do consultório.</w:t>
+      </w:r>
+    </w:p>
+    <w:p>
+      <w:pPr>
+        <w:spacing w:after="150"/>
+        <w:jc w:val="both"/>
+      </w:pPr>
+      <w:r>
+        <w:rPr>
+          <w:rFonts w:ascii="Arial" w:hAnsi="Arial" w:cs="Arial"/>
+          <w:sz w:val="22"/>
+        </w:rPr>
+        <w:t>A responsabilidade da empresa credenciada restringe-se ao repasse dos atendimentos já depositados em conta corrente. Valores futuros não serão considerados, pois carecem de auditoria e/ou glosas do convênio.</w:t>
+      </w:r>
+    </w:p>
+    <w:p>
+      <w:pPr>
+        <w:spacing w:after="150"/>
+        <w:jc w:val="both"/>
+      </w:pPr>
+      <w:r>
+        <w:rPr>
+          <w:rFonts w:ascii="Arial" w:hAnsi="Arial" w:cs="Arial"/>
+          <w:sz w:val="22"/>
+        </w:rPr>
+        <w:t>Cuiabá-MT, {{inicioContrato}}</w:t>
+      </w:r>
+    </w:p>
+    <w:p>
+      <w:pPr>
+        <w:spacing w:after="150"/>
+        <w:jc w:val="center"/>
+      </w:pPr>
+      <w:r>
+        <w:rPr>
+          <w:rFonts w:ascii="Arial" w:hAnsi="Arial" w:cs="Arial"/>
+          <w:sz w:val="22"/>
+        </w:rPr>
+        <w:t>_________________________________________</w:t>
+      </w:r>
+    </w:p>
+    <w:p>
+      <w:pPr>
+        <w:spacing w:after="150"/>
+        <w:jc w:val="center"/>
+      </w:pPr>
+      <w:r>
+        <w:rPr>
+          <w:rFonts w:ascii="Arial" w:hAnsi="Arial" w:cs="Arial"/>
+          <w:sz w:val="22"/>
+        </w:rPr>
+        <w:t>{{nomeLoc2}} – CRO {{rgLoc2}}</w:t>
+      </w:r>
+    </w:p>
+    <w:p>
+      <w:pPr>
+        <w:spacing w:after="150"/>
+        <w:jc w:val="both"/>
+      </w:pPr>
+      <w:r>
+        <w:rPr>
+          <w:rFonts w:ascii="Arial" w:hAnsi="Arial" w:cs="Arial"/>
+          <w:sz w:val="22"/>
+        </w:rPr>
+        <w:t>{{LOCATARIO 2_FIM}}</w:t>
+      </w:r>
+    </w:p>
+    <w:p>
+      <w:pPr>
+        <w:spacing w:after="150"/>
+        <w:jc w:val="both"/>
+      </w:pPr>
+      <w:r>
+        <w:rPr>
+          <w:rFonts w:ascii="Arial" w:hAnsi="Arial" w:cs="Arial"/>
+          <w:sz w:val="22"/>
+        </w:rPr>
+        <w:t>{{LOCATARIO 3_INICIO}}</w:t>
+      </w:r>
+    </w:p>
+    <w:p>
+      <w:pPr>
+        <w:pageBreakBefore/>
+        <w:spacing w:after="150"/>
+        <w:jc w:val="center"/>
+      </w:pPr>
+      <w:r>
+        <w:rPr>
+          <w:rFonts w:ascii="Arial" w:hAnsi="Arial" w:cs="Arial"/>
+          <w:b/>
+          <w:sz w:val="24"/>
+        </w:rPr>
+        <w:t>SOLICITAÇÃO DE INTEGRAÇÃO AO CORPO CLÍNICO</w:t>
+      </w:r>
+    </w:p>
+    <w:p>
+      <w:pPr>
+        <w:spacing w:after="150"/>
+        <w:jc w:val="both"/>
+      </w:pPr>
+      <w:r>
+        <w:rPr>
+          <w:rFonts w:ascii="Arial" w:hAnsi="Arial" w:cs="Arial"/>
+          <w:sz w:val="22"/>
+        </w:rPr>
+        <w:t>EU, {{nomeLoc3}}, portador(a) do CRO {{rgLoc3}} e CPF {{cpfLoc3}}, solicito a minha integração ao corpo clínico para realizar atendimentos dos convênios em que a empresa é credenciada.</w:t>
+      </w:r>
+    </w:p>
+    <w:p>
+      <w:pPr>
+        <w:spacing w:after="150"/>
+        <w:jc w:val="both"/>
+      </w:pPr>
+      <w:r>
+        <w:rPr>
+          <w:rFonts w:ascii="Arial" w:hAnsi="Arial" w:cs="Arial"/>
+          <w:sz w:val="22"/>
+        </w:rPr>
+        <w:t>Comprometo-me a respeitar as exigências de cada convênio quanto aos procedimentos e à elaboração de guias. Em caso de apuração de fraude pelo convênio, tenho ciência da responsabilização cível e criminal, perante a empresa e o convênio, além do afastamento imediato do corpo clínico.</w:t>
+      </w:r>
+    </w:p>
+    <w:p>
+      <w:pPr>
+        <w:spacing w:after="150"/>
+        <w:jc w:val="both"/>
+      </w:pPr>
+      <w:r>
+        <w:rPr>
+          <w:rFonts w:ascii="Arial" w:hAnsi="Arial" w:cs="Arial"/>
+          <w:sz w:val="22"/>
+        </w:rPr>
+        <w:t>Tenho ciência dos prazos de pagamento dos convênios e de que podem ocorrer glosas de guias, que são decisões dos convênios e não da empresa conveniada.</w:t>
+      </w:r>
+    </w:p>
+    <w:p>
+      <w:pPr>
+        <w:spacing w:after="150"/>
+        <w:jc w:val="both"/>
+      </w:pPr>
+      <w:r>
+        <w:rPr>
+          <w:rFonts w:ascii="Arial" w:hAnsi="Arial" w:cs="Arial"/>
+          <w:sz w:val="22"/>
+        </w:rPr>
+        <w:t>Os valores apurados serão pagos na conta da empresa conveniada, descontados apenas os custos de impostos, sem qualquer percentual de comissão para a empresa.</w:t>
+      </w:r>
+    </w:p>
+    <w:p>
+      <w:pPr>
+        <w:spacing w:after="150"/>
+        <w:jc w:val="both"/>
+      </w:pPr>
+      <w:r>
+        <w:rPr>
+          <w:rFonts w:ascii="Arial" w:hAnsi="Arial" w:cs="Arial"/>
+          <w:sz w:val="22"/>
+        </w:rPr>
+        <w:t>Tenho ciência de que a empresa pode, sem aviso prévio, excluir-me do corpo clínico por infração perante o plano ou por estratégias administrativas, sem prejuízo ao contrato de locação. A integração ao corpo clínico é concessão revogável a critério da empresa.</w:t>
+      </w:r>
+    </w:p>
+    <w:p>
+      <w:pPr>
+        <w:spacing w:after="150"/>
+        <w:jc w:val="both"/>
+      </w:pPr>
+      <w:r>
+        <w:rPr>
+          <w:rFonts w:ascii="Arial" w:hAnsi="Arial" w:cs="Arial"/>
+          <w:sz w:val="22"/>
+        </w:rPr>
+        <w:t>Declaro que o faturamento dos atendimentos é de exclusiva responsabilidade do dentista, não sendo a única fonte de renda, e que a exclusão do corpo clínico não afetará a manutenção do consultório.</w:t>
+      </w:r>
+    </w:p>
+    <w:p>
+      <w:pPr>
+        <w:spacing w:after="150"/>
+        <w:jc w:val="both"/>
+      </w:pPr>
+      <w:r>
+        <w:rPr>
+          <w:rFonts w:ascii="Arial" w:hAnsi="Arial" w:cs="Arial"/>
+          <w:sz w:val="22"/>
+        </w:rPr>
+        <w:t>A responsabilidade da empresa credenciada restringe-se ao repasse dos atendimentos já depositados em conta corrente. Valores futuros não serão considerados, pois carecem de auditoria e/ou glosas do convênio.</w:t>
+      </w:r>
+    </w:p>
+    <w:p>
+      <w:pPr>
+        <w:spacing w:after="150"/>
+        <w:jc w:val="both"/>
+      </w:pPr>
+      <w:r>
+        <w:rPr>
+          <w:rFonts w:ascii="Arial" w:hAnsi="Arial" w:cs="Arial"/>
+          <w:sz w:val="22"/>
+        </w:rPr>
+        <w:t>Cuiabá-MT, {{inicioContrato}}</w:t>
+      </w:r>
+    </w:p>
+    <w:p>
+      <w:pPr>
+        <w:spacing w:after="150"/>
+        <w:jc w:val="center"/>
+      </w:pPr>
+      <w:r>
+        <w:rPr>
+          <w:rFonts w:ascii="Arial" w:hAnsi="Arial" w:cs="Arial"/>
+          <w:sz w:val="22"/>
+        </w:rPr>
+        <w:t>_________________________________________</w:t>
+      </w:r>
+    </w:p>
+    <w:p>
+      <w:pPr>
+        <w:spacing w:after="150"/>
+        <w:jc w:val="center"/>
+      </w:pPr>
+      <w:r>
+        <w:rPr>
+          <w:rFonts w:ascii="Arial" w:hAnsi="Arial" w:cs="Arial"/>
+          <w:sz w:val="22"/>
+        </w:rPr>
+        <w:t>{{nomeLoc3}} – CRO {{rgLoc3}}</w:t>
+      </w:r>
+    </w:p>
+    <w:p>
+      <w:pPr>
+        <w:spacing w:after="150"/>
+        <w:jc w:val="both"/>
+      </w:pPr>
+      <w:r>
+        <w:rPr>
+          <w:rFonts w:ascii="Arial" w:hAnsi="Arial" w:cs="Arial"/>
+          <w:sz w:val="22"/>
+        </w:rPr>
+        <w:t>{{LOCATARIO 3_FIM}}</w:t>
       </w:r>
     </w:p>
     <w:p>

</xml_diff>

<commit_message>
Documentos separados, blocos de assinatura com espaço e maiúscula após título de cláusula
- 4 documentos independentes, cada um iniciando em nova página com bloco de título
  (eyebrow + título + subtítulo + filete): CONTRATO, NORMAS E ROTINAS,
  PROCEDIMENTO OPERACIONAL PADRÃO e SOLICITAÇÃO DE INTEGRAÇÃO AO CORPO CLÍNICO.
  (Procedimento Operacional Padrão deixou de ser subseção de Normas.)
- Blocos de assinatura profissionais: espaço para assinar acima da linha, nome em
  negrito, CPF e papel da parte; testemunhas com linha/nome/CPF e espaçamento.
- Primeira letra do corpo de cada cláusula/parágrafo em maiúscula (após o título).
- CPF do fiador e do cônjuge incluídos na assinatura; CNPJ na assinatura do locador.

Co-Authored-By: Claude Opus 4.8 (1M context) <noreply@anthropic.com>
</commit_message>
<xml_diff>
--- a/clinica.docx
+++ b/clinica.docx
@@ -4,7 +4,7 @@
   <w:body>
     <w:p>
       <w:pPr>
-        <w:spacing w:after="40" w:before="0" w:line="240" w:lineRule="auto"/>
+        <w:spacing w:after="60" w:before="0" w:line="240" w:lineRule="auto"/>
         <w:jc w:val="center"/>
       </w:pPr>
       <w:r>
@@ -21,7 +21,7 @@
     </w:p>
     <w:p>
       <w:pPr>
-        <w:spacing w:after="40" w:before="0" w:line="240" w:lineRule="auto"/>
+        <w:spacing w:after="60" w:before="0" w:line="240" w:lineRule="auto"/>
         <w:jc w:val="center"/>
       </w:pPr>
       <w:r>
@@ -30,14 +30,14 @@
           <w:b/>
           <w:i w:val="0"/>
           <w:color w:val="1A1A1A"/>
-          <w:sz w:val="30"/>
+          <w:sz w:val="32"/>
         </w:rPr>
         <w:t>CONTRATO DE LOCAÇÃO DE CONSULTÓRIO ODONTOLÓGICO</w:t>
       </w:r>
     </w:p>
     <w:p>
       <w:pPr>
-        <w:spacing w:after="200" w:before="0" w:line="240" w:lineRule="auto"/>
+        <w:spacing w:after="280" w:before="0" w:line="240" w:lineRule="auto"/>
         <w:jc w:val="center"/>
         <w:pBdr>
           <w:bottom w:val="single" w:sz="6" w:space="6" w:color="8A6520"/>
@@ -235,7 +235,7 @@
     </w:p>
     <w:p>
       <w:pPr>
-        <w:spacing w:after="120" w:before="80" w:line="269" w:lineRule="auto"/>
+        <w:spacing w:after="120" w:before="180" w:line="269" w:lineRule="auto"/>
         <w:jc w:val="both"/>
       </w:pPr>
       <w:r>
@@ -255,7 +255,7 @@
           <w:i w:val="0"/>
           <w:sz w:val="23"/>
         </w:rPr>
-        <w:t>a presente locação tem por objeto sala comercial montada com equipamentos e mobília para consultório odontológico, situada na ODONTO CONCEITUALLE, à Rua Estevão de Mendonça, 552, Cuiabá/MT, que o LOCATÁRIO declara receber em perfeitas condições de uso, com as instalações hidráulicas e elétricas em funcionamento, garantia de 90 (noventa) dias e pintura nova. Os equipamentos, a mobília e os demais itens que compõem a sala são de propriedade do LOCADOR, devendo o LOCATÁRIO conservá-los e restituí-los nas mesmas condições em que os recebeu. No ato da entrega das chaves será firmado laudo de vistoria relacionando todos os itens da sala.</w:t>
+        <w:t>A presente locação tem por objeto sala comercial montada com equipamentos e mobília para consultório odontológico, situada na ODONTO CONCEITUALLE, à Rua Estevão de Mendonça, 552, Cuiabá/MT, que o LOCATÁRIO declara receber em perfeitas condições de uso, com as instalações hidráulicas e elétricas em funcionamento, garantia de 90 (noventa) dias e pintura nova. Os equipamentos, a mobília e os demais itens que compõem a sala são de propriedade do LOCADOR, devendo o LOCATÁRIO conservá-los e restituí-los nas mesmas condições em que os recebeu. No ato da entrega das chaves será firmado laudo de vistoria relacionando todos os itens da sala.</w:t>
       </w:r>
     </w:p>
     <w:p>
@@ -279,7 +279,7 @@
           <w:i w:val="0"/>
           <w:sz w:val="23"/>
         </w:rPr>
-        <w:t>o LOCATÁRIO utilizará o imóvel exclusivamente como consultório odontológico para atendimento de pacientes, sendo-lhe vedado alterar a destinação da coisa locada, no todo ou em parte, e operando suas atividades dentro do horário de funcionamento da clínica Odonto Conceitualle, de segunda a sexta-feira, das 8h00 às 18h00 (respeitado o intervalo intrajornada dos funcionários), e aos sábados, das 8h00 às 12h00.</w:t>
+        <w:t>O LOCATÁRIO utilizará o imóvel exclusivamente como consultório odontológico para atendimento de pacientes, sendo-lhe vedado alterar a destinação da coisa locada, no todo ou em parte, e operando suas atividades dentro do horário de funcionamento da clínica Odonto Conceitualle, de segunda a sexta-feira, das 8h00 às 18h00 (respeitado o intervalo intrajornada dos funcionários), e aos sábados, das 8h00 às 12h00.</w:t>
       </w:r>
     </w:p>
     <w:p>
@@ -303,12 +303,12 @@
           <w:i w:val="0"/>
           <w:sz w:val="23"/>
         </w:rPr>
-        <w:t>o LOCATÁRIO providenciará, às suas expensas, todos os documentos exigidos por lei para o funcionamento do consultório, em especial alvará sanitário, alvará de funcionamento, credenciamento do consultório no CRO-MT, responsabilidade técnica perante o CRO-MT e demais licenças cabíveis.</w:t>
+        <w:t>O LOCATÁRIO providenciará, às suas expensas, todos os documentos exigidos por lei para o funcionamento do consultório, em especial alvará sanitário, alvará de funcionamento, credenciamento do consultório no CRO-MT, responsabilidade técnica perante o CRO-MT e demais licenças cabíveis.</w:t>
       </w:r>
     </w:p>
     <w:p>
       <w:pPr>
-        <w:spacing w:after="120" w:before="80" w:line="269" w:lineRule="auto"/>
+        <w:spacing w:after="120" w:before="180" w:line="269" w:lineRule="auto"/>
         <w:jc w:val="both"/>
       </w:pPr>
       <w:r>
@@ -328,7 +328,7 @@
           <w:i w:val="0"/>
           <w:sz w:val="23"/>
         </w:rPr>
-        <w:t>o prazo da locação é de 36 (trinta e seis) meses, com permanência mínima de {{prazoContrato}}, nos termos do art. 4º da Lei nº 8.245/1991. Findo o prazo, o LOCATÁRIO obriga-se a restituir a SALA ao LOCADOR livre e desocupada, pintada de novo e em perfeito estado de conservação, independentemente de notificação judicial ou extrajudicial.</w:t>
+        <w:t>O prazo da locação é de 36 (trinta e seis) meses, com permanência mínima de {{prazoContrato}}, nos termos do art. 4º da Lei nº 8.245/1991. Findo o prazo, o LOCATÁRIO obriga-se a restituir a SALA ao LOCADOR livre e desocupada, pintada de novo e em perfeito estado de conservação, independentemente de notificação judicial ou extrajudicial.</w:t>
       </w:r>
     </w:p>
     <w:p>
@@ -352,7 +352,7 @@
           <w:i w:val="0"/>
           <w:sz w:val="23"/>
         </w:rPr>
-        <w:t>o prazo poderá ser prorrogado, por consentimento tácito ou por manifestação de uma das partes aceita pela outra, com antecedência mínima de 30 (trinta) dias do vencimento, mantendo-se em vigor todas as cláusulas e condições deste Contrato.</w:t>
+        <w:t>O prazo poderá ser prorrogado, por consentimento tácito ou por manifestação de uma das partes aceita pela outra, com antecedência mínima de 30 (trinta) dias do vencimento, mantendo-se em vigor todas as cláusulas e condições deste Contrato.</w:t>
       </w:r>
     </w:p>
     <w:p>
@@ -376,12 +376,12 @@
           <w:i w:val="0"/>
           <w:sz w:val="23"/>
         </w:rPr>
-        <w:t>antes do vencimento, o LOCADOR não poderá reaver a SALA senão ressarcindo ao LOCATÁRIO as perdas e danos resultantes, nem o LOCATÁRIO devolvê-la senão pagando a multa contratual cabível.</w:t>
+        <w:t>Antes do vencimento, o LOCADOR não poderá reaver a SALA senão ressarcindo ao LOCATÁRIO as perdas e danos resultantes, nem o LOCATÁRIO devolvê-la senão pagando a multa contratual cabível.</w:t>
       </w:r>
     </w:p>
     <w:p>
       <w:pPr>
-        <w:spacing w:after="120" w:before="80" w:line="269" w:lineRule="auto"/>
+        <w:spacing w:after="120" w:before="180" w:line="269" w:lineRule="auto"/>
         <w:jc w:val="both"/>
       </w:pPr>
       <w:r>
@@ -401,7 +401,7 @@
           <w:i w:val="0"/>
           <w:sz w:val="23"/>
         </w:rPr>
-        <w:t>a fiança é prestada em caráter solidário. O FIADOR e, sendo casado, o seu cônjuge anuente respondem juntamente com o LOCATÁRIO por todas as obrigações deste contrato — aluguéis, encargos, multas, juros, despesas de uso comum, danos ao imóvel e demais verbas —, renunciando expressamente ao benefício de ordem previsto nos arts. 827 e 828 do Código Civil e podendo ser demandados diretamente, independentemente de prévia excussão dos bens do LOCATÁRIO. Havendo mais de um fiador, todos respondem solidariamente entre si.</w:t>
+        <w:t>A fiança é prestada em caráter solidário. O FIADOR e, sendo casado, o seu cônjuge anuente respondem juntamente com o LOCATÁRIO por todas as obrigações deste contrato — aluguéis, encargos, multas, juros, despesas de uso comum, danos ao imóvel e demais verbas —, renunciando expressamente ao benefício de ordem previsto nos arts. 827 e 828 do Código Civil e podendo ser demandados diretamente, independentemente de prévia excussão dos bens do LOCATÁRIO. Havendo mais de um fiador, todos respondem solidariamente entre si.</w:t>
       </w:r>
     </w:p>
     <w:p>
@@ -425,7 +425,7 @@
           <w:i w:val="0"/>
           <w:sz w:val="23"/>
         </w:rPr>
-        <w:t>a fiança subsiste até a efetiva entrega das chaves e a integral quitação de todas as obrigações, ainda que a locação seja prorrogada por prazo determinado ou indeterminado, na forma do art. 39 da Lei nº 8.245/1991, não se exonerando o FIADOR enquanto não devolvido o imóvel e quitado o débito.</w:t>
+        <w:t>A fiança subsiste até a efetiva entrega das chaves e a integral quitação de todas as obrigações, ainda que a locação seja prorrogada por prazo determinado ou indeterminado, na forma do art. 39 da Lei nº 8.245/1991, não se exonerando o FIADOR enquanto não devolvido o imóvel e quitado o débito.</w:t>
       </w:r>
     </w:p>
     <w:p>
@@ -449,12 +449,12 @@
           <w:i w:val="0"/>
           <w:sz w:val="23"/>
         </w:rPr>
-        <w:t>o FIADOR declara idoneidade financeira e obriga-se a comprová-la mediante comprovante de renda e última declaração de imposto de renda. A superveniente insolvência, o falecimento ou a exoneração do FIADOR obrigam o LOCATÁRIO a apresentar novo fiador idôneo no prazo de 30 (trinta) dias, sob pena de infração contratual.</w:t>
+        <w:t>O FIADOR declara idoneidade financeira e obriga-se a comprová-la mediante comprovante de renda e última declaração de imposto de renda. A superveniente insolvência, o falecimento ou a exoneração do FIADOR obrigam o LOCATÁRIO a apresentar novo fiador idôneo no prazo de 30 (trinta) dias, sob pena de infração contratual.</w:t>
       </w:r>
     </w:p>
     <w:p>
       <w:pPr>
-        <w:spacing w:after="120" w:before="80" w:line="269" w:lineRule="auto"/>
+        <w:spacing w:after="120" w:before="180" w:line="269" w:lineRule="auto"/>
         <w:jc w:val="both"/>
       </w:pPr>
       <w:r>
@@ -474,7 +474,7 @@
           <w:i w:val="0"/>
           <w:sz w:val="23"/>
         </w:rPr>
-        <w:t>o aluguel mensal, livremente convencionado, é de R$ {{valorAluguel}}.</w:t>
+        <w:t>O aluguel mensal, livremente convencionado, é de R$ {{valorAluguel}}.</w:t>
       </w:r>
     </w:p>
     <w:p>
@@ -498,7 +498,7 @@
           <w:i w:val="0"/>
           <w:sz w:val="23"/>
         </w:rPr>
-        <w:t>ao final do prazo contratual, não desocupado o imóvel, o LOCADOR poderá reajustar o aluguel, independentemente de aviso ou notificação, pela variação do IGP-M no período ou por outro índice que vier a substituí-lo. O reajuste poderá decorrer de alteração de prazo legal, prorrogação da locação, acordo entre as partes, acordo tácito, decisão judicial ou determinação legal.</w:t>
+        <w:t>Ao final do prazo contratual, não desocupado o imóvel, o LOCADOR poderá reajustar o aluguel, independentemente de aviso ou notificação, pela variação do IGP-M no período ou por outro índice que vier a substituí-lo. O reajuste poderá decorrer de alteração de prazo legal, prorrogação da locação, acordo entre as partes, acordo tácito, decisão judicial ou determinação legal.</w:t>
       </w:r>
     </w:p>
     <w:p>
@@ -522,12 +522,12 @@
           <w:i w:val="0"/>
           <w:sz w:val="23"/>
         </w:rPr>
-        <w:t>ao término da locação ou de sua prorrogação, o LOCATÁRIO restituirá o imóvel pintado de novo com as cores originais, com as instalações elétricas e hidráulicas em funcionamento e substituído tudo o que estiver danificado, devolvendo-o exatamente como o recebeu. Quaisquer acessões, instalações ou benfeitorias cuja remoção danifique o espaço incorporam-se a ele, sem direito do LOCATÁRIO a indenização ou retenção, ao que desde já renuncia.</w:t>
+        <w:t>Ao término da locação ou de sua prorrogação, o LOCATÁRIO restituirá o imóvel pintado de novo com as cores originais, com as instalações elétricas e hidráulicas em funcionamento e substituído tudo o que estiver danificado, devolvendo-o exatamente como o recebeu. Quaisquer acessões, instalações ou benfeitorias cuja remoção danifique o espaço incorporam-se a ele, sem direito do LOCATÁRIO a indenização ou retenção, ao que desde já renuncia.</w:t>
       </w:r>
     </w:p>
     <w:p>
       <w:pPr>
-        <w:spacing w:after="120" w:before="80" w:line="269" w:lineRule="auto"/>
+        <w:spacing w:after="120" w:before="180" w:line="269" w:lineRule="auto"/>
         <w:jc w:val="both"/>
       </w:pPr>
       <w:r>
@@ -547,7 +547,7 @@
           <w:i w:val="0"/>
           <w:sz w:val="23"/>
         </w:rPr>
-        <w:t xml:space="preserve">o aluguel será pago todo dia {{vencimento}} de cada mês. </w:t>
+        <w:t xml:space="preserve">O aluguel será pago todo dia {{vencimento}} de cada mês. </w:t>
       </w:r>
       <w:r>
         <w:rPr>
@@ -589,7 +589,7 @@
           <w:i w:val="0"/>
           <w:sz w:val="23"/>
         </w:rPr>
-        <w:t>os aluguéis e encargos pagos fora do prazo serão acrescidos de multa de 10% (dez por cento) sobre o débito e de juros de mora de 2% (dois por cento) ao mês, independentemente de ação judicial e sem prejuízo de custas e honorários advocatícios, inclusive em ação de despejo por falta de pagamento, ação de cobrança ou protesto de título.</w:t>
+        <w:t>Os aluguéis e encargos pagos fora do prazo serão acrescidos de multa de 10% (dez por cento) sobre o débito e de juros de mora de 2% (dois por cento) ao mês, independentemente de ação judicial e sem prejuízo de custas e honorários advocatícios, inclusive em ação de despejo por falta de pagamento, ação de cobrança ou protesto de título.</w:t>
       </w:r>
     </w:p>
     <w:p>
@@ -613,7 +613,7 @@
           <w:i w:val="0"/>
           <w:sz w:val="23"/>
         </w:rPr>
-        <w:t>havendo atraso superior a 10 (dez) dias em qualquer pagamento, o LOCADOR poderá encaminhar a cobrança por meio de advogado, respondendo o LOCATÁRIO por honorários advocatícios de 20% (vinte por cento), além das custas processuais, se a cobrança for judicial.</w:t>
+        <w:t>Havendo atraso superior a 10 (dez) dias em qualquer pagamento, o LOCADOR poderá encaminhar a cobrança por meio de advogado, respondendo o LOCATÁRIO por honorários advocatícios de 20% (vinte por cento), além das custas processuais, se a cobrança for judicial.</w:t>
       </w:r>
     </w:p>
     <w:p>
@@ -638,7 +638,7 @@
           <w:i w:val="0"/>
           <w:sz w:val="23"/>
         </w:rPr>
-        <w:t>durante a locação, é de responsabilidade do LOCATÁRIO o pagamento das despesas de uso comum da clínica Odonto Conceitualle, a saber: impostos e taxas (IPTU, alvará de funcionamento, alvará da vigilância sanitária, alvará do corpo de bombeiros e alvará de publicidade); despesas ordinárias (energia elétrica, água, taxas de cobrança bancária e multas por atraso, fundos de reserva, telefone, internet, salários e impostos dos funcionários registrados e honorários mensais de contabilidade); manutenção dos equipamentos de uso comum a todas as salas (RX, compressor, bomba a vácuo, autoclave, seladora e instalações hidráulicas e elétricas da cadeira odontológica); e manutenções de uso comum da recepção (porta blindex, portas de madeira de acesso, ar-condicionado, armários, televisão, bebedouro, impressora, notebook, monitoramento/alarme, interfone, telefone, troca de lâmpadas, sofás e cadeiras dos pacientes e central de alarme). O rateio é proporcional ao número de salas em funcionamento na clínica.</w:t>
+        <w:t>Durante a locação, é de responsabilidade do LOCATÁRIO o pagamento das despesas de uso comum da clínica Odonto Conceitualle, a saber: impostos e taxas (IPTU, alvará de funcionamento, alvará da vigilância sanitária, alvará do corpo de bombeiros e alvará de publicidade); despesas ordinárias (energia elétrica, água, taxas de cobrança bancária e multas por atraso, fundos de reserva, telefone, internet, salários e impostos dos funcionários registrados e honorários mensais de contabilidade); manutenção dos equipamentos de uso comum a todas as salas (RX, compressor, bomba a vácuo, autoclave, seladora e instalações hidráulicas e elétricas da cadeira odontológica); e manutenções de uso comum da recepção (porta blindex, portas de madeira de acesso, ar-condicionado, armários, televisão, bebedouro, impressora, notebook, monitoramento/alarme, interfone, telefone, troca de lâmpadas, sofás e cadeiras dos pacientes e central de alarme). O rateio é proporcional ao número de salas em funcionamento na clínica.</w:t>
       </w:r>
     </w:p>
     <w:p>
@@ -673,7 +673,7 @@
     </w:p>
     <w:p>
       <w:pPr>
-        <w:spacing w:after="120" w:before="80" w:line="269" w:lineRule="auto"/>
+        <w:spacing w:after="120" w:before="180" w:line="269" w:lineRule="auto"/>
         <w:jc w:val="both"/>
       </w:pPr>
       <w:r>
@@ -693,12 +693,12 @@
           <w:i w:val="0"/>
           <w:sz w:val="23"/>
         </w:rPr>
-        <w:t>é expressamente vedado ao LOCATÁRIO e/ou ao FIADOR ceder, a qualquer título, total ou parcialmente, o imóvel locado, bem como transferir os direitos relativos a este contrato. Constitui falta grave o empréstimo, a sublocação ou qualquer atendimento compartilhado com profissional que não seja parte deste contrato, aplicando-se, nesse caso, 100% (cem por cento) da multa pactuada, independentemente do tempo de vigência.</w:t>
+        <w:t>É expressamente vedado ao LOCATÁRIO e/ou ao FIADOR ceder, a qualquer título, total ou parcialmente, o imóvel locado, bem como transferir os direitos relativos a este contrato. Constitui falta grave o empréstimo, a sublocação ou qualquer atendimento compartilhado com profissional que não seja parte deste contrato, aplicando-se, nesse caso, 100% (cem por cento) da multa pactuada, independentemente do tempo de vigência.</w:t>
       </w:r>
     </w:p>
     <w:p>
       <w:pPr>
-        <w:spacing w:after="120" w:before="80" w:line="269" w:lineRule="auto"/>
+        <w:spacing w:after="120" w:before="180" w:line="269" w:lineRule="auto"/>
         <w:jc w:val="both"/>
       </w:pPr>
       <w:r>
@@ -718,12 +718,12 @@
           <w:i w:val="0"/>
           <w:sz w:val="23"/>
         </w:rPr>
-        <w:t>o LOCATÁRIO obriga-se a manter ativos e regulares, durante toda a locação, os alvarás exigidos, o credenciamento do consultório e a respectiva responsabilidade técnica junto ao CRO-MT. A perda, suspensão ou irregularidade de qualquer dessas condições constitui infração contratual e autoriza a rescisão, sem prejuízo das responsabilidades próprias do LOCATÁRIO perante os órgãos competentes.</w:t>
+        <w:t>O LOCATÁRIO obriga-se a manter ativos e regulares, durante toda a locação, os alvarás exigidos, o credenciamento do consultório e a respectiva responsabilidade técnica junto ao CRO-MT. A perda, suspensão ou irregularidade de qualquer dessas condições constitui infração contratual e autoriza a rescisão, sem prejuízo das responsabilidades próprias do LOCATÁRIO perante os órgãos competentes.</w:t>
       </w:r>
     </w:p>
     <w:p>
       <w:pPr>
-        <w:spacing w:after="120" w:before="80" w:line="269" w:lineRule="auto"/>
+        <w:spacing w:after="120" w:before="180" w:line="269" w:lineRule="auto"/>
         <w:jc w:val="both"/>
       </w:pPr>
       <w:r>
@@ -743,12 +743,12 @@
           <w:i w:val="0"/>
           <w:sz w:val="23"/>
         </w:rPr>
-        <w:t>decretada a falência do LOCADOR ou deferida a sua recuperação judicial ou extrajudicial, e desde que tais medidas atinjam a continuidade da locação, poderá este contrato ser extinto na forma da legislação aplicável, resguardados os direitos e obrigações vencidos até a data da extinção.</w:t>
+        <w:t>Decretada a falência do LOCADOR ou deferida a sua recuperação judicial ou extrajudicial, e desde que tais medidas atinjam a continuidade da locação, poderá este contrato ser extinto na forma da legislação aplicável, resguardados os direitos e obrigações vencidos até a data da extinção.</w:t>
       </w:r>
     </w:p>
     <w:p>
       <w:pPr>
-        <w:spacing w:after="120" w:before="80" w:line="269" w:lineRule="auto"/>
+        <w:spacing w:after="120" w:before="180" w:line="269" w:lineRule="auto"/>
         <w:jc w:val="both"/>
       </w:pPr>
       <w:r>
@@ -768,12 +768,12 @@
           <w:i w:val="0"/>
           <w:sz w:val="23"/>
         </w:rPr>
-        <w:t>toda obra ou melhoria que o LOCATÁRIO pretenda introduzir na SALA dependerá de prévia autorização escrita do LOCADOR e incorporar-se-á ao imóvel, sem custo ao LOCADOR e passando à sua propriedade. Fica facultado ao LOCADOR, ao término da locação, exigir que o LOCATÁRIO desfaça ou retire, no todo ou em parte, qualquer benfeitoria cuja incorporação não aceite.</w:t>
+        <w:t>Toda obra ou melhoria que o LOCATÁRIO pretenda introduzir na SALA dependerá de prévia autorização escrita do LOCADOR e incorporar-se-á ao imóvel, sem custo ao LOCADOR e passando à sua propriedade. Fica facultado ao LOCADOR, ao término da locação, exigir que o LOCATÁRIO desfaça ou retire, no todo ou em parte, qualquer benfeitoria cuja incorporação não aceite.</w:t>
       </w:r>
     </w:p>
     <w:p>
       <w:pPr>
-        <w:spacing w:after="120" w:before="80" w:line="269" w:lineRule="auto"/>
+        <w:spacing w:after="120" w:before="180" w:line="269" w:lineRule="auto"/>
         <w:jc w:val="both"/>
       </w:pPr>
       <w:r>
@@ -793,7 +793,7 @@
           <w:i w:val="0"/>
           <w:sz w:val="23"/>
         </w:rPr>
-        <w:t xml:space="preserve">o LOCATÁRIO declara receber o imóvel em perfeito estado e condições de uso, obrigando-se a mantê-lo assim e a zelar pelo perfeito funcionamento de todos os equipamentos. </w:t>
+        <w:t xml:space="preserve">O LOCATÁRIO declara receber o imóvel em perfeito estado e condições de uso, obrigando-se a mantê-lo assim e a zelar pelo perfeito funcionamento de todos os equipamentos. </w:t>
       </w:r>
       <w:r>
         <w:rPr>
@@ -855,7 +855,7 @@
     </w:p>
     <w:p>
       <w:pPr>
-        <w:spacing w:after="120" w:before="80" w:line="269" w:lineRule="auto"/>
+        <w:spacing w:after="120" w:before="180" w:line="269" w:lineRule="auto"/>
         <w:jc w:val="both"/>
       </w:pPr>
       <w:r>
@@ -875,12 +875,12 @@
           <w:i w:val="0"/>
           <w:sz w:val="23"/>
         </w:rPr>
-        <w:t>o LOCATÁRIO obriga-se a cumprir a legislação aplicável, a convenção e o regulamento interno da clínica, constituindo sua infração violação contratual, que enseja a rescisão e torna aplicável a multa contratual.</w:t>
+        <w:t>O LOCATÁRIO obriga-se a cumprir a legislação aplicável, a convenção e o regulamento interno da clínica, constituindo sua infração violação contratual, que enseja a rescisão e torna aplicável a multa contratual.</w:t>
       </w:r>
     </w:p>
     <w:p>
       <w:pPr>
-        <w:spacing w:after="120" w:before="80" w:line="269" w:lineRule="auto"/>
+        <w:spacing w:after="120" w:before="180" w:line="269" w:lineRule="auto"/>
         <w:jc w:val="both"/>
       </w:pPr>
       <w:r>
@@ -900,12 +900,12 @@
           <w:i w:val="0"/>
           <w:sz w:val="23"/>
         </w:rPr>
-        <w:t>o LOCATÁRIO faculta ao LOCADOR examinar e vistoriar o imóvel sempre que necessário, em horários previamente combinados, não podendo impedir o ingresso para reparos no interesse da clínica ou de unidade confrontante.</w:t>
+        <w:t>O LOCATÁRIO faculta ao LOCADOR examinar e vistoriar o imóvel sempre que necessário, em horários previamente combinados, não podendo impedir o ingresso para reparos no interesse da clínica ou de unidade confrontante.</w:t>
       </w:r>
     </w:p>
     <w:p>
       <w:pPr>
-        <w:spacing w:after="120" w:before="80" w:line="269" w:lineRule="auto"/>
+        <w:spacing w:after="120" w:before="180" w:line="269" w:lineRule="auto"/>
         <w:jc w:val="both"/>
       </w:pPr>
       <w:r>
@@ -925,12 +925,12 @@
           <w:i w:val="0"/>
           <w:sz w:val="23"/>
         </w:rPr>
-        <w:t>prorrogada esta locação por acordo entre as partes, por lei, por sentença ou por consentimento tácito, permanecerão em vigor todas as cláusulas e condições deste Contrato.</w:t>
+        <w:t>Prorrogada esta locação por acordo entre as partes, por lei, por sentença ou por consentimento tácito, permanecerão em vigor todas as cláusulas e condições deste Contrato.</w:t>
       </w:r>
     </w:p>
     <w:p>
       <w:pPr>
-        <w:spacing w:after="120" w:before="80" w:line="269" w:lineRule="auto"/>
+        <w:spacing w:after="120" w:before="180" w:line="269" w:lineRule="auto"/>
         <w:jc w:val="both"/>
       </w:pPr>
       <w:r>
@@ -950,12 +950,12 @@
           <w:i w:val="0"/>
           <w:sz w:val="23"/>
         </w:rPr>
-        <w:t>a desocupação do imóvel pelo LOCATÁRIO, a qualquer tempo, dependerá de comunicação prévia e por escrito ao LOCADOR, com antecedência mínima de 30 (trinta) dias, sem prejuízo da multa contratual cabível. A saída sem o aviso prévio aqui exigido caracteriza abandono, na forma da cláusula seguinte.</w:t>
+        <w:t>A desocupação do imóvel pelo LOCATÁRIO, a qualquer tempo, dependerá de comunicação prévia e por escrito ao LOCADOR, com antecedência mínima de 30 (trinta) dias, sem prejuízo da multa contratual cabível. A saída sem o aviso prévio aqui exigido caracteriza abandono, na forma da cláusula seguinte.</w:t>
       </w:r>
     </w:p>
     <w:p>
       <w:pPr>
-        <w:spacing w:after="120" w:before="80" w:line="269" w:lineRule="auto"/>
+        <w:spacing w:after="120" w:before="180" w:line="269" w:lineRule="auto"/>
         <w:jc w:val="both"/>
       </w:pPr>
       <w:r>
@@ -975,7 +975,7 @@
           <w:i w:val="0"/>
           <w:sz w:val="23"/>
         </w:rPr>
-        <w:t>caracteriza abandono do imóvel a cessação do uso regular do consultório acompanhada de ao menos uma das seguintes circunstâncias: (i) ausência de atendimento e de comparecimento do LOCATÁRIO por período igual ou superior a 10 (dez) dias, sem justificativa comunicada ao LOCADOR; (ii) inadimplemento de aluguel e/ou encargos; ou (iii) retirada de bens com aparente intenção de não retornar.</w:t>
+        <w:t>Caracteriza abandono do imóvel a cessação do uso regular do consultório acompanhada de ao menos uma das seguintes circunstâncias: (i) ausência de atendimento e de comparecimento do LOCATÁRIO por período igual ou superior a 10 (dez) dias, sem justificativa comunicada ao LOCADOR; (ii) inadimplemento de aluguel e/ou encargos; ou (iii) retirada de bens com aparente intenção de não retornar.</w:t>
       </w:r>
     </w:p>
     <w:p>
@@ -999,7 +999,7 @@
           <w:i w:val="0"/>
           <w:sz w:val="23"/>
         </w:rPr>
-        <w:t>constatado o abandono, o LOCADOR fica desde já autorizado a reaver a posse do imóvel, mediante vistoria documentada por fotografias e por 2 (duas) testemunhas ou por ata notarial, lavrando-se termo do estado em que o imóvel for encontrado e da data da retomada.</w:t>
+        <w:t>Constatado o abandono, o LOCADOR fica desde já autorizado a reaver a posse do imóvel, mediante vistoria documentada por fotografias e por 2 (duas) testemunhas ou por ata notarial, lavrando-se termo do estado em que o imóvel for encontrado e da data da retomada.</w:t>
       </w:r>
     </w:p>
     <w:p>
@@ -1023,12 +1023,12 @@
           <w:i w:val="0"/>
           <w:sz w:val="23"/>
         </w:rPr>
-        <w:t>o abandono configura infração contratual grave e acarreta o vencimento antecipado de todo o débito, a incidência integral da multa por infração prevista na Cláusula Décima Sétima, os aluguéis e encargos devidos até a data da retomada da posse e a responsabilidade por todos os danos apurados, sem prejuízo das demais cominações deste contrato.</w:t>
+        <w:t>O abandono configura infração contratual grave e acarreta o vencimento antecipado de todo o débito, a incidência integral da multa por infração prevista na Cláusula Décima Sétima, os aluguéis e encargos devidos até a data da retomada da posse e a responsabilidade por todos os danos apurados, sem prejuízo das demais cominações deste contrato.</w:t>
       </w:r>
     </w:p>
     <w:p>
       <w:pPr>
-        <w:spacing w:after="120" w:before="80" w:line="269" w:lineRule="auto"/>
+        <w:spacing w:after="120" w:before="180" w:line="269" w:lineRule="auto"/>
         <w:jc w:val="both"/>
       </w:pPr>
       <w:r>
@@ -1072,7 +1072,7 @@
           <w:i w:val="0"/>
           <w:sz w:val="23"/>
         </w:rPr>
-        <w:t>na devolução antecipada regular do imóvel, precedida do aviso prévio da Cláusula Décima Quinta, a multa será proporcional ao período restante da permanência mínima, na forma do art. 4º da Lei nº 8.245/1991.</w:t>
+        <w:t>Na devolução antecipada regular do imóvel, precedida do aviso prévio da Cláusula Décima Quinta, a multa será proporcional ao período restante da permanência mínima, na forma do art. 4º da Lei nº 8.245/1991.</w:t>
       </w:r>
     </w:p>
     <w:p>
@@ -1096,12 +1096,12 @@
           <w:i w:val="0"/>
           <w:sz w:val="23"/>
         </w:rPr>
-        <w:t>na infração contratual grave, inclusive o abandono e as demais hipóteses de falta grave previstas neste contrato, aplica-se, a título de cláusula penal compensatória, a multa de 3 (três) aluguéis vigentes. Para contratos com permanência mínima de 6 (seis) meses, a multa será de 2 (dois) aluguéis integrais, dispensada a proporcionalidade do tempo decorrido.</w:t>
+        <w:t>Na infração contratual grave, inclusive o abandono e as demais hipóteses de falta grave previstas neste contrato, aplica-se, a título de cláusula penal compensatória, a multa de 3 (três) aluguéis vigentes. Para contratos com permanência mínima de 6 (seis) meses, a multa será de 2 (dois) aluguéis integrais, dispensada a proporcionalidade do tempo decorrido.</w:t>
       </w:r>
     </w:p>
     <w:p>
       <w:pPr>
-        <w:spacing w:after="120" w:before="80" w:line="269" w:lineRule="auto"/>
+        <w:spacing w:after="120" w:before="180" w:line="269" w:lineRule="auto"/>
         <w:jc w:val="both"/>
       </w:pPr>
       <w:r>
@@ -1121,12 +1121,12 @@
           <w:i w:val="0"/>
           <w:sz w:val="23"/>
         </w:rPr>
-        <w:t>os bens, móveis e equipamentos de propriedade do LOCATÁRIO que permanecerem no imóvel após a desocupação ou o abandono serão considerados abandonados se não retirados no prazo de 15 (quinze) dias contados da notificação do LOCADOR, ficando este autorizado a removê-los e armazená-los às expensas do LOCATÁRIO, ou a dar-lhes destinação, sem que isso importe renúncia ao crédito ou obrigação de guarda indefinida.</w:t>
+        <w:t>Os bens, móveis e equipamentos de propriedade do LOCATÁRIO que permanecerem no imóvel após a desocupação ou o abandono serão considerados abandonados se não retirados no prazo de 15 (quinze) dias contados da notificação do LOCADOR, ficando este autorizado a removê-los e armazená-los às expensas do LOCATÁRIO, ou a dar-lhes destinação, sem que isso importe renúncia ao crédito ou obrigação de guarda indefinida.</w:t>
       </w:r>
     </w:p>
     <w:p>
       <w:pPr>
-        <w:spacing w:after="120" w:before="80" w:line="269" w:lineRule="auto"/>
+        <w:spacing w:after="120" w:before="180" w:line="269" w:lineRule="auto"/>
         <w:jc w:val="both"/>
       </w:pPr>
       <w:r>
@@ -1146,12 +1146,12 @@
           <w:i w:val="0"/>
           <w:sz w:val="23"/>
         </w:rPr>
-        <w:t>optando o LOCADOR por alienar ou permutar o imóvel, o LOCATÁRIO terá direito de preferência e de ser comunicado por escrito, na forma da lei.</w:t>
+        <w:t>Optando o LOCADOR por alienar ou permutar o imóvel, o LOCATÁRIO terá direito de preferência e de ser comunicado por escrito, na forma da lei.</w:t>
       </w:r>
     </w:p>
     <w:p>
       <w:pPr>
-        <w:spacing w:after="120" w:before="80" w:line="269" w:lineRule="auto"/>
+        <w:spacing w:after="120" w:before="180" w:line="269" w:lineRule="auto"/>
         <w:jc w:val="both"/>
       </w:pPr>
       <w:r>
@@ -1171,7 +1171,7 @@
           <w:i w:val="0"/>
           <w:sz w:val="23"/>
         </w:rPr>
-        <w:t>o LOCATÁRIO poderá, caso manifeste interesse, integrar o corpo clínico do LOCADOR para atendimento de pacientes vinculados aos convênios odontológicos já credenciados, condicionada a integração à prévia aprovação em processo de avaliação conduzido pelo LOCADOR.</w:t>
+        <w:t>O LOCATÁRIO poderá, caso manifeste interesse, integrar o corpo clínico do LOCADOR para atendimento de pacientes vinculados aos convênios odontológicos já credenciados, condicionada a integração à prévia aprovação em processo de avaliação conduzido pelo LOCADOR.</w:t>
       </w:r>
     </w:p>
     <w:p>
@@ -1195,7 +1195,7 @@
           <w:i w:val="0"/>
           <w:sz w:val="23"/>
         </w:rPr>
-        <w:t>a aprovação é de exclusivo critério do LOCADOR, não constituindo esta cláusula qualquer obrigação de aceitação do LOCATÁRIO no corpo clínico.</w:t>
+        <w:t>A aprovação é de exclusivo critério do LOCADOR, não constituindo esta cláusula qualquer obrigação de aceitação do LOCATÁRIO no corpo clínico.</w:t>
       </w:r>
     </w:p>
     <w:p>
@@ -1219,7 +1219,7 @@
           <w:i w:val="0"/>
           <w:sz w:val="23"/>
         </w:rPr>
-        <w:t>a eventual integração não constitui garantia de faturamento mínimo, nem pode ser interpretada como valor a receber, crédito ou compensação em favor do LOCATÁRIO no âmbito deste contrato.</w:t>
+        <w:t>A eventual integração não constitui garantia de faturamento mínimo, nem pode ser interpretada como valor a receber, crédito ou compensação em favor do LOCATÁRIO no âmbito deste contrato.</w:t>
       </w:r>
     </w:p>
     <w:p>
@@ -1243,12 +1243,12 @@
           <w:i w:val="0"/>
           <w:sz w:val="23"/>
         </w:rPr>
-        <w:t>os valores dos atendimentos a pacientes de convênios não constituem obrigação de pagamento do LOCADOR; a responsabilidade é exclusiva das operadoras dos planos, condicionada a análise, auditoria, eventuais glosas e deferimento destas.</w:t>
+        <w:t>Os valores dos atendimentos a pacientes de convênios não constituem obrigação de pagamento do LOCADOR; a responsabilidade é exclusiva das operadoras dos planos, condicionada a análise, auditoria, eventuais glosas e deferimento destas.</w:t>
       </w:r>
     </w:p>
     <w:p>
       <w:pPr>
-        <w:spacing w:after="120" w:before="80" w:line="269" w:lineRule="auto"/>
+        <w:spacing w:after="120" w:before="180" w:line="269" w:lineRule="auto"/>
         <w:jc w:val="both"/>
       </w:pPr>
       <w:r>
@@ -1268,7 +1268,7 @@
           <w:i w:val="0"/>
           <w:sz w:val="23"/>
         </w:rPr>
-        <w:t>em qualquer hipótese de término, rescisão ou desocupação, e como condição da entrega das chaves, o LOCATÁRIO obriga-se, previamente, a: (i) comunicar por escrito os pacientes em tratamento sobre a descontinuidade; (ii) disponibilizar a documentação necessária à continuidade; e (iii) adotar as providências de encaminhamento exigidas pelo Código de Ética Odontológica, notadamente o art. 11, inciso VI, que veda o abandono de paciente.</w:t>
+        <w:t>Em qualquer hipótese de término, rescisão ou desocupação, e como condição da entrega das chaves, o LOCATÁRIO obriga-se, previamente, a: (i) comunicar por escrito os pacientes em tratamento sobre a descontinuidade; (ii) disponibilizar a documentação necessária à continuidade; e (iii) adotar as providências de encaminhamento exigidas pelo Código de Ética Odontológica, notadamente o art. 11, inciso VI, que veda o abandono de paciente.</w:t>
       </w:r>
     </w:p>
     <w:p>
@@ -1292,12 +1292,12 @@
           <w:i w:val="0"/>
           <w:sz w:val="23"/>
         </w:rPr>
-        <w:t>o LOCATÁRIO é o único responsável, perante os pacientes e o Conselho Regional de Odontologia, pelos tratamentos por ele iniciados. Caso o LOCADOR venha a ser responsabilizado — administrativa, ética ou judicialmente — por abandono de paciente atribuível ao LOCATÁRIO, este o indenizará regressivamente por todos os valores, custas e honorários despendidos.</w:t>
+        <w:t>O LOCATÁRIO é o único responsável, perante os pacientes e o Conselho Regional de Odontologia, pelos tratamentos por ele iniciados. Caso o LOCADOR venha a ser responsabilizado — administrativa, ética ou judicialmente — por abandono de paciente atribuível ao LOCATÁRIO, este o indenizará regressivamente por todos os valores, custas e honorários despendidos.</w:t>
       </w:r>
     </w:p>
     <w:p>
       <w:pPr>
-        <w:spacing w:after="120" w:before="80" w:line="269" w:lineRule="auto"/>
+        <w:spacing w:after="120" w:before="180" w:line="269" w:lineRule="auto"/>
         <w:jc w:val="both"/>
       </w:pPr>
       <w:r>
@@ -1317,12 +1317,12 @@
           <w:i w:val="0"/>
           <w:sz w:val="23"/>
         </w:rPr>
-        <w:t>os prontuários e a documentação odontológica dos pacientes atendidos por intermédio do credenciamento e dos convênios do LOCADOR permanecerão sob a guarda do LOCADOR. É vedada a retirada dos prontuários do estabelecimento sem autorização escrita do LOCADOR, devendo o LOCATÁRIO, ao sair, entregá-los ou disponibilizar cópia íntegra, sob pena de infração contratual e de comunicação ao Conselho Regional de Odontologia.</w:t>
+        <w:t>Os prontuários e a documentação odontológica dos pacientes atendidos por intermédio do credenciamento e dos convênios do LOCADOR permanecerão sob a guarda do LOCADOR. É vedada a retirada dos prontuários do estabelecimento sem autorização escrita do LOCADOR, devendo o LOCATÁRIO, ao sair, entregá-los ou disponibilizar cópia íntegra, sob pena de infração contratual e de comunicação ao Conselho Regional de Odontologia.</w:t>
       </w:r>
     </w:p>
     <w:p>
       <w:pPr>
-        <w:spacing w:after="120" w:before="80" w:line="269" w:lineRule="auto"/>
+        <w:spacing w:after="120" w:before="180" w:line="269" w:lineRule="auto"/>
         <w:jc w:val="both"/>
       </w:pPr>
       <w:r>
@@ -1342,12 +1342,12 @@
           <w:i w:val="0"/>
           <w:sz w:val="23"/>
         </w:rPr>
-        <w:t>as partes observarão a Lei nº 13.709/2018 (LGPD) no tratamento de dados pessoais de pacientes. Encerrada a relação, o LOCATÁRIO não poderá utilizar, reter ou compartilhar dados de pacientes obtidos no âmbito do estabelecimento para finalidade diversa da continuidade do cuidado, respondendo pelos danos decorrentes de uso indevido.</w:t>
+        <w:t>As partes observarão a Lei nº 13.709/2018 (LGPD) no tratamento de dados pessoais de pacientes. Encerrada a relação, o LOCATÁRIO não poderá utilizar, reter ou compartilhar dados de pacientes obtidos no âmbito do estabelecimento para finalidade diversa da continuidade do cuidado, respondendo pelos danos decorrentes de uso indevido.</w:t>
       </w:r>
     </w:p>
     <w:p>
       <w:pPr>
-        <w:spacing w:after="120" w:before="80" w:line="269" w:lineRule="auto"/>
+        <w:spacing w:after="120" w:before="180" w:line="269" w:lineRule="auto"/>
         <w:jc w:val="both"/>
       </w:pPr>
       <w:r>
@@ -1367,7 +1367,7 @@
           <w:i w:val="0"/>
           <w:sz w:val="23"/>
         </w:rPr>
-        <w:t>os pacientes atendidos por intermédio do credenciamento, dos convênios, da recepção, da captação, do marketing e da estrutura do LOCADOR integram a carteira e o fundo de comércio da clínica, não se confundindo com a clientela própria que o LOCATÁRIO comprovadamente já possuía antes do início desta locação. O LOCATÁRIO obriga-se a não desviar, transferir, captar ou aliciar, direta ou indiretamente, por si ou por interposta pessoa, para outro endereço ou estabelecimento, os pacientes a ele encaminhados ou por ele atendidos em razão da estrutura e dos convênios do LOCADOR, durante a vigência deste contrato e pelo prazo de 12 (doze) meses contados do seu término.</w:t>
+        <w:t>Os pacientes atendidos por intermédio do credenciamento, dos convênios, da recepção, da captação, do marketing e da estrutura do LOCADOR integram a carteira e o fundo de comércio da clínica, não se confundindo com a clientela própria que o LOCATÁRIO comprovadamente já possuía antes do início desta locação. O LOCATÁRIO obriga-se a não desviar, transferir, captar ou aliciar, direta ou indiretamente, por si ou por interposta pessoa, para outro endereço ou estabelecimento, os pacientes a ele encaminhados ou por ele atendidos em razão da estrutura e dos convênios do LOCADOR, durante a vigência deste contrato e pelo prazo de 12 (doze) meses contados do seu término.</w:t>
       </w:r>
     </w:p>
     <w:p>
@@ -1391,7 +1391,7 @@
           <w:i w:val="0"/>
           <w:sz w:val="23"/>
         </w:rPr>
-        <w:t>a comunicação aos pacientes em tratamento sobre eventual descontinuidade do atendimento será realizada pelo LOCADOR ou de forma conjunta com ele, observado o art. 11, inciso VI, do Código de Ética Odontológica, sendo vedado ao LOCATÁRIO valer-se de tal comunicação, dos dados de contato ou dos prontuários para captar pacientes para novo local de atendimento.</w:t>
+        <w:t>A comunicação aos pacientes em tratamento sobre eventual descontinuidade do atendimento será realizada pelo LOCADOR ou de forma conjunta com ele, observado o art. 11, inciso VI, do Código de Ética Odontológica, sendo vedado ao LOCATÁRIO valer-se de tal comunicação, dos dados de contato ou dos prontuários para captar pacientes para novo local de atendimento.</w:t>
       </w:r>
     </w:p>
     <w:p>
@@ -1415,12 +1415,12 @@
           <w:i w:val="0"/>
           <w:sz w:val="23"/>
         </w:rPr>
-        <w:t>a infração a esta cláusula constitui falta grave e sujeita o LOCATÁRIO à multa prevista na Cláusula Décima Sétima, Parágrafo Segundo, sem prejuízo da reparação das perdas e danos efetivamente apurados, inclusive lucros cessantes.</w:t>
+        <w:t>A infração a esta cláusula constitui falta grave e sujeita o LOCATÁRIO à multa prevista na Cláusula Décima Sétima, Parágrafo Segundo, sem prejuízo da reparação das perdas e danos efetivamente apurados, inclusive lucros cessantes.</w:t>
       </w:r>
     </w:p>
     <w:p>
       <w:pPr>
-        <w:spacing w:after="120" w:before="80" w:line="269" w:lineRule="auto"/>
+        <w:spacing w:after="120" w:before="180" w:line="269" w:lineRule="auto"/>
         <w:jc w:val="both"/>
       </w:pPr>
       <w:r>
@@ -1440,7 +1440,7 @@
           <w:i w:val="0"/>
           <w:sz w:val="23"/>
         </w:rPr>
-        <w:t>o LOCATÁRIO obriga-se a manter atualizados, durante toda a locação, os seus dados de contato (endereço, telefone, e-mail e WhatsApp constantes da qualificação) e a responder às comunicações do LOCADOR no prazo de 5 (cinco) dias. As notificações e comunicações enviadas a esses contatos reputam-se recebidas para todos os fins de direito.</w:t>
+        <w:t>O LOCATÁRIO obriga-se a manter atualizados, durante toda a locação, os seus dados de contato (endereço, telefone, e-mail e WhatsApp constantes da qualificação) e a responder às comunicações do LOCADOR no prazo de 5 (cinco) dias. As notificações e comunicações enviadas a esses contatos reputam-se recebidas para todos os fins de direito.</w:t>
       </w:r>
     </w:p>
     <w:p>
@@ -1464,7 +1464,7 @@
           <w:i w:val="0"/>
           <w:sz w:val="23"/>
         </w:rPr>
-        <w:t>em qualquer hipótese de término, rescisão ou desocupação, e como condição da regular entrega do imóvel, o LOCATÁRIO realizará a transição ordenada do atendimento, mediante: (i) comunicação prévia e por escrito ao LOCADOR, na forma da Cláusula Décima Quinta; (ii) entrega das chaves acompanhada da vistoria de saída; e (iii) apresentação de relação dos pacientes em tratamento, com o respectivo estágio, para viabilizar a continuidade do cuidado.</w:t>
+        <w:t>Em qualquer hipótese de término, rescisão ou desocupação, e como condição da regular entrega do imóvel, o LOCATÁRIO realizará a transição ordenada do atendimento, mediante: (i) comunicação prévia e por escrito ao LOCADOR, na forma da Cláusula Décima Quinta; (ii) entrega das chaves acompanhada da vistoria de saída; e (iii) apresentação de relação dos pacientes em tratamento, com o respectivo estágio, para viabilizar a continuidade do cuidado.</w:t>
       </w:r>
     </w:p>
     <w:p>
@@ -1488,12 +1488,12 @@
           <w:i w:val="0"/>
           <w:sz w:val="23"/>
         </w:rPr>
-        <w:t>a ausência de resposta às comunicações do LOCADOR, somada à cessação do atendimento, reforça a caracterização do abandono prevista na Cláusula Décima Sexta, autorizando as providências ali estabelecidas.</w:t>
+        <w:t>A ausência de resposta às comunicações do LOCADOR, somada à cessação do atendimento, reforça a caracterização do abandono prevista na Cláusula Décima Sexta, autorizando as providências ali estabelecidas.</w:t>
       </w:r>
     </w:p>
     <w:p>
       <w:pPr>
-        <w:spacing w:after="120" w:before="80" w:line="269" w:lineRule="auto"/>
+        <w:spacing w:after="120" w:before="180" w:line="269" w:lineRule="auto"/>
         <w:jc w:val="both"/>
       </w:pPr>
       <w:r>
@@ -1513,12 +1513,12 @@
           <w:i w:val="0"/>
           <w:sz w:val="23"/>
         </w:rPr>
-        <w:t>é vedado ao LOCATÁRIO, durante a vigência deste contrato e pelo prazo de 12 (doze) meses contados do seu término, contratar, aliciar ou desviar, direta ou indiretamente, funcionários, auxiliares ou demais profissionais que integrem ou tenham integrado o quadro da clínica do LOCADOR, salvo prévia e expressa concordância escrita deste. O descumprimento sujeita o LOCATÁRIO à multa prevista na Cláusula Décima Sétima, Parágrafo Segundo, sem prejuízo das perdas e danos.</w:t>
+        <w:t>É vedado ao LOCATÁRIO, durante a vigência deste contrato e pelo prazo de 12 (doze) meses contados do seu término, contratar, aliciar ou desviar, direta ou indiretamente, funcionários, auxiliares ou demais profissionais que integrem ou tenham integrado o quadro da clínica do LOCADOR, salvo prévia e expressa concordância escrita deste. O descumprimento sujeita o LOCATÁRIO à multa prevista na Cláusula Décima Sétima, Parágrafo Segundo, sem prejuízo das perdas e danos.</w:t>
       </w:r>
     </w:p>
     <w:p>
       <w:pPr>
-        <w:spacing w:after="120" w:before="80" w:line="269" w:lineRule="auto"/>
+        <w:spacing w:after="120" w:before="180" w:line="269" w:lineRule="auto"/>
         <w:jc w:val="both"/>
       </w:pPr>
       <w:r>
@@ -1538,12 +1538,12 @@
           <w:i w:val="0"/>
           <w:sz w:val="23"/>
         </w:rPr>
-        <w:t>o LOCATÁRIO obriga-se a manter sigilo sobre as informações comerciais, administrativas, financeiras e cadastrais a que tiver acesso em razão da locação, bem como sobre dados de pacientes, fornecedores e convênios do LOCADOR, não podendo utilizá-los, reproduzi-los ou divulgá-los para finalidade estranha ao contrato. Encerrada a locação, cessa imediatamente qualquer direito de uso do nome, da marca, do logotipo, das redes sociais, do endereço e dos canais de comunicação do LOCADOR, vedada a sua utilização ou a indução dos pacientes a erro quanto ao local de atendimento. A infração sujeita o LOCATÁRIO às perdas e danos e à multa prevista na Cláusula Décima Sétima, Parágrafo Segundo.</w:t>
+        <w:t>O LOCATÁRIO obriga-se a manter sigilo sobre as informações comerciais, administrativas, financeiras e cadastrais a que tiver acesso em razão da locação, bem como sobre dados de pacientes, fornecedores e convênios do LOCADOR, não podendo utilizá-los, reproduzi-los ou divulgá-los para finalidade estranha ao contrato. Encerrada a locação, cessa imediatamente qualquer direito de uso do nome, da marca, do logotipo, das redes sociais, do endereço e dos canais de comunicação do LOCADOR, vedada a sua utilização ou a indução dos pacientes a erro quanto ao local de atendimento. A infração sujeita o LOCATÁRIO às perdas e danos e à multa prevista na Cláusula Décima Sétima, Parágrafo Segundo.</w:t>
       </w:r>
     </w:p>
     <w:p>
       <w:pPr>
-        <w:spacing w:after="120" w:before="80" w:line="269" w:lineRule="auto"/>
+        <w:spacing w:after="120" w:before="180" w:line="269" w:lineRule="auto"/>
         <w:jc w:val="both"/>
       </w:pPr>
       <w:r>
@@ -1563,12 +1563,12 @@
           <w:i w:val="0"/>
           <w:sz w:val="23"/>
         </w:rPr>
-        <w:t>fica eleito o foro da Comarca de Cuiabá/MT, com renúncia expressa a qualquer outro, por mais privilegiado que seja, para dirimir as questões oriundas deste instrumento.</w:t>
+        <w:t>Fica eleito o foro da Comarca de Cuiabá/MT, com renúncia expressa a qualquer outro, por mais privilegiado que seja, para dirimir as questões oriundas deste instrumento.</w:t>
       </w:r>
     </w:p>
     <w:p>
       <w:pPr>
-        <w:spacing w:after="120" w:before="80" w:line="269" w:lineRule="auto"/>
+        <w:spacing w:after="120" w:before="180" w:line="269" w:lineRule="auto"/>
         <w:jc w:val="both"/>
       </w:pPr>
       <w:r>
@@ -1588,12 +1588,12 @@
           <w:i w:val="0"/>
           <w:sz w:val="23"/>
         </w:rPr>
-        <w:t>o descumprimento de qualquer cláusula deste contrato, por qualquer das partes signatárias, implica infração à obrigação contratual e acarreta, em favor da outra parte, justa causa para a rescisão deste instrumento e para a adoção das demais providências cabíveis.</w:t>
+        <w:t>O descumprimento de qualquer cláusula deste contrato, por qualquer das partes signatárias, implica infração à obrigação contratual e acarreta, em favor da outra parte, justa causa para a rescisão deste instrumento e para a adoção das demais providências cabíveis.</w:t>
       </w:r>
     </w:p>
     <w:p>
       <w:pPr>
-        <w:spacing w:after="120" w:before="120" w:line="269" w:lineRule="auto"/>
+        <w:spacing w:after="120" w:before="160" w:line="269" w:lineRule="auto"/>
         <w:jc w:val="both"/>
       </w:pPr>
       <w:r>
@@ -1603,18 +1603,18 @@
           <w:i w:val="0"/>
           <w:sz w:val="23"/>
         </w:rPr>
-        <w:t>E, por estarem assim justos e contratados, LOCADOR e LOCATÁRIO, após lerem e conferirem o presente contrato, firmam-no na presença das testemunhas abaixo, em 2 (duas) vias de igual teor e para um só efeito de direito.</w:t>
+        <w:t>E, por estarem assim justos e contratados, LOCADOR e LOCATÁRIO, após lerem e conferirem o presente contrato, firmam-no na presença das duas testemunhas abaixo, em 2 (duas) vias de igual teor e para um só efeito de direito.</w:t>
       </w:r>
     </w:p>
     <w:p>
       <w:pPr>
-        <w:spacing w:after="280" w:before="0" w:line="269" w:lineRule="auto"/>
+        <w:spacing w:after="40" w:before="0" w:line="269" w:lineRule="auto"/>
         <w:jc w:val="right"/>
       </w:pPr>
       <w:r>
         <w:rPr>
           <w:rFonts w:ascii="Times New Roman" w:hAnsi="Times New Roman" w:cs="Times New Roman"/>
-          <w:b w:val="0"/>
+          <w:b/>
           <w:i w:val="0"/>
           <w:sz w:val="23"/>
         </w:rPr>
@@ -1638,7 +1638,21 @@
     </w:p>
     <w:p>
       <w:pPr>
-        <w:spacing w:after="0" w:before="160" w:line="240" w:lineRule="auto"/>
+        <w:spacing w:after="0" w:before="440" w:line="240" w:lineRule="auto"/>
+        <w:jc w:val="both"/>
+      </w:pPr>
+      <w:r>
+        <w:rPr>
+          <w:rFonts w:ascii="Times New Roman" w:hAnsi="Times New Roman" w:cs="Times New Roman"/>
+          <w:b w:val="0"/>
+          <w:i w:val="0"/>
+          <w:sz w:val="23"/>
+        </w:rPr>
+      </w:r>
+    </w:p>
+    <w:p>
+      <w:pPr>
+        <w:spacing w:after="0" w:before="0" w:line="240" w:lineRule="auto"/>
         <w:jc w:val="center"/>
       </w:pPr>
       <w:r>
@@ -1668,7 +1682,23 @@
     </w:p>
     <w:p>
       <w:pPr>
-        <w:spacing w:after="80" w:before="0" w:line="240" w:lineRule="auto"/>
+        <w:spacing w:after="0" w:before="0" w:line="240" w:lineRule="auto"/>
+        <w:jc w:val="center"/>
+      </w:pPr>
+      <w:r>
+        <w:rPr>
+          <w:rFonts w:ascii="Times New Roman" w:hAnsi="Times New Roman" w:cs="Times New Roman"/>
+          <w:b w:val="0"/>
+          <w:i w:val="0"/>
+          <w:color w:val="666666"/>
+          <w:sz w:val="19"/>
+        </w:rPr>
+        <w:t>CPF {{cpf}}</w:t>
+      </w:r>
+    </w:p>
+    <w:p>
+      <w:pPr>
+        <w:spacing w:after="40" w:before="0" w:line="240" w:lineRule="auto"/>
         <w:jc w:val="center"/>
       </w:pPr>
       <w:r>
@@ -1677,7 +1707,8 @@
           <w:b w:val="0"/>
           <w:i w:val="0"/>
           <w:color w:val="666666"/>
-          <w:sz w:val="19"/>
+          <w:sz w:val="17"/>
+          <w:smallCaps/>
         </w:rPr>
         <w:t>LOCATÁRIO {{numero}}</w:t>
       </w:r>
@@ -1714,7 +1745,21 @@
     </w:p>
     <w:p>
       <w:pPr>
-        <w:spacing w:after="0" w:before="160" w:line="240" w:lineRule="auto"/>
+        <w:spacing w:after="0" w:before="440" w:line="240" w:lineRule="auto"/>
+        <w:jc w:val="both"/>
+      </w:pPr>
+      <w:r>
+        <w:rPr>
+          <w:rFonts w:ascii="Times New Roman" w:hAnsi="Times New Roman" w:cs="Times New Roman"/>
+          <w:b w:val="0"/>
+          <w:i w:val="0"/>
+          <w:sz w:val="23"/>
+        </w:rPr>
+      </w:r>
+    </w:p>
+    <w:p>
+      <w:pPr>
+        <w:spacing w:after="0" w:before="0" w:line="240" w:lineRule="auto"/>
         <w:jc w:val="center"/>
       </w:pPr>
       <w:r>
@@ -1744,7 +1789,23 @@
     </w:p>
     <w:p>
       <w:pPr>
-        <w:spacing w:after="80" w:before="0" w:line="240" w:lineRule="auto"/>
+        <w:spacing w:after="0" w:before="0" w:line="240" w:lineRule="auto"/>
+        <w:jc w:val="center"/>
+      </w:pPr>
+      <w:r>
+        <w:rPr>
+          <w:rFonts w:ascii="Times New Roman" w:hAnsi="Times New Roman" w:cs="Times New Roman"/>
+          <w:b w:val="0"/>
+          <w:i w:val="0"/>
+          <w:color w:val="666666"/>
+          <w:sz w:val="19"/>
+        </w:rPr>
+        <w:t>CPF {{cpf}}</w:t>
+      </w:r>
+    </w:p>
+    <w:p>
+      <w:pPr>
+        <w:spacing w:after="40" w:before="0" w:line="240" w:lineRule="auto"/>
         <w:jc w:val="center"/>
       </w:pPr>
       <w:r>
@@ -1753,7 +1814,8 @@
           <w:b w:val="0"/>
           <w:i w:val="0"/>
           <w:color w:val="666666"/>
-          <w:sz w:val="19"/>
+          <w:sz w:val="17"/>
+          <w:smallCaps/>
         </w:rPr>
         <w:t>FIADOR {{numero}}</w:t>
       </w:r>
@@ -1775,7 +1837,21 @@
     </w:p>
     <w:p>
       <w:pPr>
-        <w:spacing w:after="0" w:before="160" w:line="240" w:lineRule="auto"/>
+        <w:spacing w:after="0" w:before="440" w:line="240" w:lineRule="auto"/>
+        <w:jc w:val="both"/>
+      </w:pPr>
+      <w:r>
+        <w:rPr>
+          <w:rFonts w:ascii="Times New Roman" w:hAnsi="Times New Roman" w:cs="Times New Roman"/>
+          <w:b w:val="0"/>
+          <w:i w:val="0"/>
+          <w:sz w:val="23"/>
+        </w:rPr>
+      </w:r>
+    </w:p>
+    <w:p>
+      <w:pPr>
+        <w:spacing w:after="0" w:before="0" w:line="240" w:lineRule="auto"/>
         <w:jc w:val="center"/>
       </w:pPr>
       <w:r>
@@ -1805,7 +1881,23 @@
     </w:p>
     <w:p>
       <w:pPr>
-        <w:spacing w:after="80" w:before="0" w:line="240" w:lineRule="auto"/>
+        <w:spacing w:after="0" w:before="0" w:line="240" w:lineRule="auto"/>
+        <w:jc w:val="center"/>
+      </w:pPr>
+      <w:r>
+        <w:rPr>
+          <w:rFonts w:ascii="Times New Roman" w:hAnsi="Times New Roman" w:cs="Times New Roman"/>
+          <w:b w:val="0"/>
+          <w:i w:val="0"/>
+          <w:color w:val="666666"/>
+          <w:sz w:val="19"/>
+        </w:rPr>
+        <w:t>CPF {{conjugeCpf}}</w:t>
+      </w:r>
+    </w:p>
+    <w:p>
+      <w:pPr>
+        <w:spacing w:after="40" w:before="0" w:line="240" w:lineRule="auto"/>
         <w:jc w:val="center"/>
       </w:pPr>
       <w:r>
@@ -1814,7 +1906,8 @@
           <w:b w:val="0"/>
           <w:i w:val="0"/>
           <w:color w:val="666666"/>
-          <w:sz w:val="19"/>
+          <w:sz w:val="17"/>
+          <w:smallCaps/>
         </w:rPr>
         <w:t>CÔNJUGE ANUENTE DO FIADOR {{numero}}</w:t>
       </w:r>
@@ -1851,7 +1944,21 @@
     </w:p>
     <w:p>
       <w:pPr>
-        <w:spacing w:after="0" w:before="160" w:line="240" w:lineRule="auto"/>
+        <w:spacing w:after="0" w:before="440" w:line="240" w:lineRule="auto"/>
+        <w:jc w:val="both"/>
+      </w:pPr>
+      <w:r>
+        <w:rPr>
+          <w:rFonts w:ascii="Times New Roman" w:hAnsi="Times New Roman" w:cs="Times New Roman"/>
+          <w:b w:val="0"/>
+          <w:i w:val="0"/>
+          <w:sz w:val="23"/>
+        </w:rPr>
+      </w:r>
+    </w:p>
+    <w:p>
+      <w:pPr>
+        <w:spacing w:after="0" w:before="0" w:line="240" w:lineRule="auto"/>
         <w:jc w:val="center"/>
       </w:pPr>
       <w:r>
@@ -1881,7 +1988,23 @@
     </w:p>
     <w:p>
       <w:pPr>
-        <w:spacing w:after="200" w:before="0" w:line="240" w:lineRule="auto"/>
+        <w:spacing w:after="0" w:before="0" w:line="240" w:lineRule="auto"/>
+        <w:jc w:val="center"/>
+      </w:pPr>
+      <w:r>
+        <w:rPr>
+          <w:rFonts w:ascii="Times New Roman" w:hAnsi="Times New Roman" w:cs="Times New Roman"/>
+          <w:b w:val="0"/>
+          <w:i w:val="0"/>
+          <w:color w:val="666666"/>
+          <w:sz w:val="19"/>
+        </w:rPr>
+        <w:t>CNPJ 06.226.847/0001-75</w:t>
+      </w:r>
+    </w:p>
+    <w:p>
+      <w:pPr>
+        <w:spacing w:after="40" w:before="0" w:line="240" w:lineRule="auto"/>
         <w:jc w:val="center"/>
       </w:pPr>
       <w:r>
@@ -1890,14 +2013,32 @@
           <w:b w:val="0"/>
           <w:i w:val="0"/>
           <w:color w:val="666666"/>
-          <w:sz w:val="19"/>
+          <w:sz w:val="17"/>
+          <w:smallCaps/>
         </w:rPr>
         <w:t>LOCADOR</w:t>
       </w:r>
     </w:p>
     <w:p>
       <w:pPr>
-        <w:spacing w:after="40" w:before="0" w:line="269" w:lineRule="auto"/>
+        <w:spacing w:after="160" w:before="480" w:line="269" w:lineRule="auto"/>
+        <w:jc w:val="both"/>
+      </w:pPr>
+      <w:r>
+        <w:rPr>
+          <w:rFonts w:ascii="Arial" w:hAnsi="Arial" w:cs="Arial"/>
+          <w:b/>
+          <w:i w:val="0"/>
+          <w:color w:val="8A6520"/>
+          <w:sz w:val="20"/>
+          <w:smallCaps/>
+        </w:rPr>
+        <w:t>Testemunhas</w:t>
+      </w:r>
+    </w:p>
+    <w:p>
+      <w:pPr>
+        <w:spacing w:after="240" w:before="0" w:line="269" w:lineRule="auto"/>
         <w:jc w:val="both"/>
       </w:pPr>
       <w:r>
@@ -1907,8 +2048,14 @@
           <w:i w:val="0"/>
           <w:sz w:val="23"/>
         </w:rPr>
-        <w:t xml:space="preserve">Testemunha 1: </w:t>
+        <w:t>1)  ____________________________________     Nome: ____________________________     CPF: ____________________</w:t>
       </w:r>
+    </w:p>
+    <w:p>
+      <w:pPr>
+        <w:spacing w:after="120" w:before="0" w:line="269" w:lineRule="auto"/>
+        <w:jc w:val="both"/>
+      </w:pPr>
       <w:r>
         <w:rPr>
           <w:rFonts w:ascii="Times New Roman" w:hAnsi="Times New Roman" w:cs="Times New Roman"/>
@@ -1916,37 +2063,13 @@
           <w:i w:val="0"/>
           <w:sz w:val="23"/>
         </w:rPr>
-        <w:t>______________________________   CPF: ____________________</w:t>
+        <w:t>2)  ____________________________________     Nome: ____________________________     CPF: ____________________</w:t>
       </w:r>
     </w:p>
     <w:p>
       <w:pPr>
-        <w:spacing w:after="120" w:before="0" w:line="269" w:lineRule="auto"/>
-        <w:jc w:val="both"/>
-      </w:pPr>
-      <w:r>
-        <w:rPr>
-          <w:rFonts w:ascii="Times New Roman" w:hAnsi="Times New Roman" w:cs="Times New Roman"/>
-          <w:b w:val="0"/>
-          <w:i w:val="0"/>
-          <w:sz w:val="23"/>
-        </w:rPr>
-        <w:t xml:space="preserve">Testemunha 2: </w:t>
-      </w:r>
-      <w:r>
-        <w:rPr>
-          <w:rFonts w:ascii="Times New Roman" w:hAnsi="Times New Roman" w:cs="Times New Roman"/>
-          <w:b w:val="0"/>
-          <w:i w:val="0"/>
-          <w:sz w:val="23"/>
-        </w:rPr>
-        <w:t>______________________________   CPF: ____________________</w:t>
-      </w:r>
-    </w:p>
-    <w:p>
-      <w:pPr>
         <w:pageBreakBefore/>
-        <w:spacing w:after="160" w:before="0" w:line="269" w:lineRule="auto"/>
+        <w:spacing w:after="60" w:before="0" w:line="240" w:lineRule="auto"/>
         <w:jc w:val="center"/>
       </w:pPr>
       <w:r>
@@ -1955,15 +2078,50 @@
           <w:b/>
           <w:i w:val="0"/>
           <w:color w:val="8A6520"/>
-          <w:sz w:val="28"/>
+          <w:sz w:val="18"/>
           <w:smallCaps/>
+        </w:rPr>
+        <w:t>DOCUMENTO COMPLEMENTAR</w:t>
+      </w:r>
+    </w:p>
+    <w:p>
+      <w:pPr>
+        <w:spacing w:after="60" w:before="0" w:line="240" w:lineRule="auto"/>
+        <w:jc w:val="center"/>
+      </w:pPr>
+      <w:r>
+        <w:rPr>
+          <w:rFonts w:ascii="Arial" w:hAnsi="Arial" w:cs="Arial"/>
+          <w:b/>
+          <w:i w:val="0"/>
+          <w:color w:val="1A1A1A"/>
+          <w:sz w:val="32"/>
         </w:rPr>
         <w:t>NORMAS E ROTINAS</w:t>
       </w:r>
     </w:p>
     <w:p>
       <w:pPr>
-        <w:spacing w:after="60" w:before="120" w:line="269" w:lineRule="auto"/>
+        <w:spacing w:after="280" w:before="0" w:line="240" w:lineRule="auto"/>
+        <w:jc w:val="center"/>
+        <w:pBdr>
+          <w:bottom w:val="single" w:sz="6" w:space="6" w:color="8A6520"/>
+        </w:pBdr>
+      </w:pPr>
+      <w:r>
+        <w:rPr>
+          <w:rFonts w:ascii="Arial" w:hAnsi="Arial" w:cs="Arial"/>
+          <w:b w:val="0"/>
+          <w:i/>
+          <w:color w:val="666666"/>
+          <w:sz w:val="19"/>
+        </w:rPr>
+        <w:t>Biossegurança e controle de infecção do consultório</w:t>
+      </w:r>
+    </w:p>
+    <w:p>
+      <w:pPr>
+        <w:spacing w:after="60" w:before="160" w:line="269" w:lineRule="auto"/>
         <w:jc w:val="both"/>
       </w:pPr>
       <w:r>
@@ -2024,7 +2182,7 @@
     </w:p>
     <w:p>
       <w:pPr>
-        <w:spacing w:after="60" w:before="120" w:line="269" w:lineRule="auto"/>
+        <w:spacing w:after="60" w:before="160" w:line="269" w:lineRule="auto"/>
         <w:jc w:val="both"/>
       </w:pPr>
       <w:r>
@@ -2115,7 +2273,7 @@
     </w:p>
     <w:p>
       <w:pPr>
-        <w:spacing w:after="60" w:before="120" w:line="269" w:lineRule="auto"/>
+        <w:spacing w:after="60" w:before="160" w:line="269" w:lineRule="auto"/>
         <w:jc w:val="both"/>
       </w:pPr>
       <w:r>
@@ -2296,7 +2454,7 @@
     </w:p>
     <w:p>
       <w:pPr>
-        <w:spacing w:after="60" w:before="120" w:line="269" w:lineRule="auto"/>
+        <w:spacing w:after="60" w:before="160" w:line="269" w:lineRule="auto"/>
         <w:jc w:val="both"/>
       </w:pPr>
       <w:r>
@@ -2327,7 +2485,7 @@
     </w:p>
     <w:p>
       <w:pPr>
-        <w:spacing w:after="60" w:before="120" w:line="269" w:lineRule="auto"/>
+        <w:spacing w:after="60" w:before="160" w:line="269" w:lineRule="auto"/>
         <w:jc w:val="both"/>
       </w:pPr>
       <w:r>
@@ -2358,7 +2516,7 @@
     </w:p>
     <w:p>
       <w:pPr>
-        <w:spacing w:after="60" w:before="120" w:line="269" w:lineRule="auto"/>
+        <w:spacing w:after="60" w:before="160" w:line="269" w:lineRule="auto"/>
         <w:jc w:val="both"/>
       </w:pPr>
       <w:r>
@@ -2404,8 +2562,26 @@
     </w:p>
     <w:p>
       <w:pPr>
-        <w:spacing w:after="60" w:before="120" w:line="269" w:lineRule="auto"/>
-        <w:jc w:val="both"/>
+        <w:pageBreakBefore/>
+        <w:spacing w:after="60" w:before="0" w:line="240" w:lineRule="auto"/>
+        <w:jc w:val="center"/>
+      </w:pPr>
+      <w:r>
+        <w:rPr>
+          <w:rFonts w:ascii="Arial" w:hAnsi="Arial" w:cs="Arial"/>
+          <w:b/>
+          <w:i w:val="0"/>
+          <w:color w:val="8A6520"/>
+          <w:sz w:val="18"/>
+          <w:smallCaps/>
+        </w:rPr>
+        <w:t>DOCUMENTO COMPLEMENTAR</w:t>
+      </w:r>
+    </w:p>
+    <w:p>
+      <w:pPr>
+        <w:spacing w:after="60" w:before="0" w:line="240" w:lineRule="auto"/>
+        <w:jc w:val="center"/>
       </w:pPr>
       <w:r>
         <w:rPr>
@@ -2413,9 +2589,28 @@
           <w:b/>
           <w:i w:val="0"/>
           <w:color w:val="1A1A1A"/>
-          <w:sz w:val="22"/>
+          <w:sz w:val="32"/>
         </w:rPr>
-        <w:t>Procedimento operacional padrão</w:t>
+        <w:t>PROCEDIMENTO OPERACIONAL PADRÃO</w:t>
+      </w:r>
+    </w:p>
+    <w:p>
+      <w:pPr>
+        <w:spacing w:after="280" w:before="0" w:line="240" w:lineRule="auto"/>
+        <w:jc w:val="center"/>
+        <w:pBdr>
+          <w:bottom w:val="single" w:sz="6" w:space="6" w:color="8A6520"/>
+        </w:pBdr>
+      </w:pPr>
+      <w:r>
+        <w:rPr>
+          <w:rFonts w:ascii="Arial" w:hAnsi="Arial" w:cs="Arial"/>
+          <w:b w:val="0"/>
+          <w:i/>
+          <w:color w:val="666666"/>
+          <w:sz w:val="19"/>
+        </w:rPr>
+        <w:t>Rotina de segurança no atendimento odontológico</w:t>
       </w:r>
     </w:p>
     <w:p>
@@ -2466,7 +2661,7 @@
     <w:p>
       <w:pPr>
         <w:pageBreakBefore/>
-        <w:spacing w:after="160" w:before="0" w:line="269" w:lineRule="auto"/>
+        <w:spacing w:after="60" w:before="0" w:line="240" w:lineRule="auto"/>
         <w:jc w:val="center"/>
       </w:pPr>
       <w:r>
@@ -2475,10 +2670,45 @@
           <w:b/>
           <w:i w:val="0"/>
           <w:color w:val="8A6520"/>
-          <w:sz w:val="26"/>
+          <w:sz w:val="18"/>
           <w:smallCaps/>
         </w:rPr>
+        <w:t>DOCUMENTO COMPLEMENTAR</w:t>
+      </w:r>
+    </w:p>
+    <w:p>
+      <w:pPr>
+        <w:spacing w:after="60" w:before="0" w:line="240" w:lineRule="auto"/>
+        <w:jc w:val="center"/>
+      </w:pPr>
+      <w:r>
+        <w:rPr>
+          <w:rFonts w:ascii="Arial" w:hAnsi="Arial" w:cs="Arial"/>
+          <w:b/>
+          <w:i w:val="0"/>
+          <w:color w:val="1A1A1A"/>
+          <w:sz w:val="32"/>
+        </w:rPr>
         <w:t>SOLICITAÇÃO DE INTEGRAÇÃO AO CORPO CLÍNICO</w:t>
+      </w:r>
+    </w:p>
+    <w:p>
+      <w:pPr>
+        <w:spacing w:after="280" w:before="0" w:line="240" w:lineRule="auto"/>
+        <w:jc w:val="center"/>
+        <w:pBdr>
+          <w:bottom w:val="single" w:sz="6" w:space="6" w:color="8A6520"/>
+        </w:pBdr>
+      </w:pPr>
+      <w:r>
+        <w:rPr>
+          <w:rFonts w:ascii="Arial" w:hAnsi="Arial" w:cs="Arial"/>
+          <w:b w:val="0"/>
+          <w:i/>
+          <w:color w:val="666666"/>
+          <w:sz w:val="19"/>
+        </w:rPr>
+        <w:t>Adesão ao atendimento dos convênios credenciados</w:t>
       </w:r>
     </w:p>
     <w:p>
@@ -2588,8 +2818,23 @@
     </w:p>
     <w:p>
       <w:pPr>
-        <w:spacing w:after="320" w:before="0" w:line="269" w:lineRule="auto"/>
+        <w:spacing w:after="40" w:before="0" w:line="269" w:lineRule="auto"/>
         <w:jc w:val="right"/>
+      </w:pPr>
+      <w:r>
+        <w:rPr>
+          <w:rFonts w:ascii="Times New Roman" w:hAnsi="Times New Roman" w:cs="Times New Roman"/>
+          <w:b/>
+          <w:i w:val="0"/>
+          <w:sz w:val="23"/>
+        </w:rPr>
+        <w:t>Cuiabá/MT, {{inicioContrato}}.</w:t>
+      </w:r>
+    </w:p>
+    <w:p>
+      <w:pPr>
+        <w:spacing w:after="0" w:before="440" w:line="240" w:lineRule="auto"/>
+        <w:jc w:val="both"/>
       </w:pPr>
       <w:r>
         <w:rPr>
@@ -2598,7 +2843,6 @@
           <w:i w:val="0"/>
           <w:sz w:val="23"/>
         </w:rPr>
-        <w:t>Cuiabá/MT, {{inicioContrato}}.</w:t>
       </w:r>
     </w:p>
     <w:p>
@@ -2633,7 +2877,7 @@
     </w:p>
     <w:p>
       <w:pPr>
-        <w:spacing w:after="80" w:before="0" w:line="240" w:lineRule="auto"/>
+        <w:spacing w:after="40" w:before="0" w:line="240" w:lineRule="auto"/>
         <w:jc w:val="center"/>
       </w:pPr>
       <w:r>
@@ -2642,7 +2886,8 @@
           <w:b w:val="0"/>
           <w:i w:val="0"/>
           <w:color w:val="666666"/>
-          <w:sz w:val="19"/>
+          <w:sz w:val="17"/>
+          <w:smallCaps/>
         </w:rPr>
         <w:t>CRO {{rg}}</w:t>
       </w:r>

</xml_diff>

<commit_message>
Formatação de contrato: recuo de primeira linha, entrelinha 1,5 e página de assinaturas própria
- Recuo de primeira linha (1,25 cm) nas cláusulas, parágrafos e textos corridos —
  aparência típica de contrato.
- Entrelinha 1,4 no corpo (leitura mais arejada).
- Assinaturas passam a iniciar em página própria ("ENCERRAMENTO E ASSINATURAS").

Co-Authored-By: Claude Opus 4.8 (1M context) <noreply@anthropic.com>
</commit_message>
<xml_diff>
--- a/clinica.docx
+++ b/clinica.docx
@@ -56,7 +56,8 @@
     </w:p>
     <w:p>
       <w:pPr>
-        <w:spacing w:after="120" w:before="0" w:line="269" w:lineRule="auto"/>
+        <w:spacing w:after="120" w:before="0" w:line="336" w:lineRule="auto"/>
+        <w:ind w:firstLine="709"/>
         <w:jc w:val="both"/>
       </w:pPr>
       <w:r>
@@ -71,7 +72,7 @@
     </w:p>
     <w:p>
       <w:pPr>
-        <w:spacing w:after="80" w:before="120" w:line="269" w:lineRule="auto"/>
+        <w:spacing w:after="80" w:before="120" w:line="336" w:lineRule="auto"/>
         <w:jc w:val="both"/>
       </w:pPr>
       <w:r>
@@ -88,7 +89,7 @@
     </w:p>
     <w:p>
       <w:pPr>
-        <w:spacing w:after="120" w:before="0" w:line="269" w:lineRule="auto"/>
+        <w:spacing w:after="120" w:before="0" w:line="336" w:lineRule="auto"/>
         <w:jc w:val="both"/>
       </w:pPr>
       <w:r>
@@ -127,7 +128,7 @@
     </w:p>
     <w:p>
       <w:pPr>
-        <w:spacing w:after="120" w:before="0" w:line="269" w:lineRule="auto"/>
+        <w:spacing w:after="120" w:before="0" w:line="336" w:lineRule="auto"/>
         <w:jc w:val="both"/>
       </w:pPr>
       <w:r>
@@ -181,7 +182,7 @@
     </w:p>
     <w:p>
       <w:pPr>
-        <w:spacing w:after="120" w:before="0" w:line="269" w:lineRule="auto"/>
+        <w:spacing w:after="120" w:before="0" w:line="336" w:lineRule="auto"/>
         <w:jc w:val="both"/>
       </w:pPr>
       <w:r>
@@ -220,7 +221,8 @@
     </w:p>
     <w:p>
       <w:pPr>
-        <w:spacing w:after="120" w:before="0" w:line="269" w:lineRule="auto"/>
+        <w:spacing w:after="120" w:before="0" w:line="336" w:lineRule="auto"/>
+        <w:ind w:firstLine="709"/>
         <w:jc w:val="both"/>
       </w:pPr>
       <w:r>
@@ -235,7 +237,8 @@
     </w:p>
     <w:p>
       <w:pPr>
-        <w:spacing w:after="120" w:before="180" w:line="269" w:lineRule="auto"/>
+        <w:spacing w:after="120" w:before="180" w:line="336" w:lineRule="auto"/>
+        <w:ind w:firstLine="709"/>
         <w:jc w:val="both"/>
       </w:pPr>
       <w:r>
@@ -260,7 +263,8 @@
     </w:p>
     <w:p>
       <w:pPr>
-        <w:spacing w:after="120" w:before="0" w:line="269" w:lineRule="auto"/>
+        <w:spacing w:after="120" w:before="0" w:line="336" w:lineRule="auto"/>
+        <w:ind w:firstLine="709"/>
         <w:jc w:val="both"/>
       </w:pPr>
       <w:r>
@@ -284,7 +288,8 @@
     </w:p>
     <w:p>
       <w:pPr>
-        <w:spacing w:after="120" w:before="0" w:line="269" w:lineRule="auto"/>
+        <w:spacing w:after="120" w:before="0" w:line="336" w:lineRule="auto"/>
+        <w:ind w:firstLine="709"/>
         <w:jc w:val="both"/>
       </w:pPr>
       <w:r>
@@ -308,7 +313,8 @@
     </w:p>
     <w:p>
       <w:pPr>
-        <w:spacing w:after="120" w:before="180" w:line="269" w:lineRule="auto"/>
+        <w:spacing w:after="120" w:before="180" w:line="336" w:lineRule="auto"/>
+        <w:ind w:firstLine="709"/>
         <w:jc w:val="both"/>
       </w:pPr>
       <w:r>
@@ -333,7 +339,8 @@
     </w:p>
     <w:p>
       <w:pPr>
-        <w:spacing w:after="120" w:before="0" w:line="269" w:lineRule="auto"/>
+        <w:spacing w:after="120" w:before="0" w:line="336" w:lineRule="auto"/>
+        <w:ind w:firstLine="709"/>
         <w:jc w:val="both"/>
       </w:pPr>
       <w:r>
@@ -357,7 +364,8 @@
     </w:p>
     <w:p>
       <w:pPr>
-        <w:spacing w:after="120" w:before="0" w:line="269" w:lineRule="auto"/>
+        <w:spacing w:after="120" w:before="0" w:line="336" w:lineRule="auto"/>
+        <w:ind w:firstLine="709"/>
         <w:jc w:val="both"/>
       </w:pPr>
       <w:r>
@@ -381,7 +389,8 @@
     </w:p>
     <w:p>
       <w:pPr>
-        <w:spacing w:after="120" w:before="180" w:line="269" w:lineRule="auto"/>
+        <w:spacing w:after="120" w:before="180" w:line="336" w:lineRule="auto"/>
+        <w:ind w:firstLine="709"/>
         <w:jc w:val="both"/>
       </w:pPr>
       <w:r>
@@ -406,7 +415,8 @@
     </w:p>
     <w:p>
       <w:pPr>
-        <w:spacing w:after="120" w:before="0" w:line="269" w:lineRule="auto"/>
+        <w:spacing w:after="120" w:before="0" w:line="336" w:lineRule="auto"/>
+        <w:ind w:firstLine="709"/>
         <w:jc w:val="both"/>
       </w:pPr>
       <w:r>
@@ -430,7 +440,8 @@
     </w:p>
     <w:p>
       <w:pPr>
-        <w:spacing w:after="120" w:before="0" w:line="269" w:lineRule="auto"/>
+        <w:spacing w:after="120" w:before="0" w:line="336" w:lineRule="auto"/>
+        <w:ind w:firstLine="709"/>
         <w:jc w:val="both"/>
       </w:pPr>
       <w:r>
@@ -454,7 +465,8 @@
     </w:p>
     <w:p>
       <w:pPr>
-        <w:spacing w:after="120" w:before="180" w:line="269" w:lineRule="auto"/>
+        <w:spacing w:after="120" w:before="180" w:line="336" w:lineRule="auto"/>
+        <w:ind w:firstLine="709"/>
         <w:jc w:val="both"/>
       </w:pPr>
       <w:r>
@@ -479,7 +491,8 @@
     </w:p>
     <w:p>
       <w:pPr>
-        <w:spacing w:after="120" w:before="0" w:line="269" w:lineRule="auto"/>
+        <w:spacing w:after="120" w:before="0" w:line="336" w:lineRule="auto"/>
+        <w:ind w:firstLine="709"/>
         <w:jc w:val="both"/>
       </w:pPr>
       <w:r>
@@ -503,7 +516,8 @@
     </w:p>
     <w:p>
       <w:pPr>
-        <w:spacing w:after="120" w:before="0" w:line="269" w:lineRule="auto"/>
+        <w:spacing w:after="120" w:before="0" w:line="336" w:lineRule="auto"/>
+        <w:ind w:firstLine="709"/>
         <w:jc w:val="both"/>
       </w:pPr>
       <w:r>
@@ -527,7 +541,8 @@
     </w:p>
     <w:p>
       <w:pPr>
-        <w:spacing w:after="120" w:before="180" w:line="269" w:lineRule="auto"/>
+        <w:spacing w:after="120" w:before="180" w:line="336" w:lineRule="auto"/>
+        <w:ind w:firstLine="709"/>
         <w:jc w:val="both"/>
       </w:pPr>
       <w:r>
@@ -570,7 +585,8 @@
     </w:p>
     <w:p>
       <w:pPr>
-        <w:spacing w:after="120" w:before="0" w:line="269" w:lineRule="auto"/>
+        <w:spacing w:after="120" w:before="0" w:line="336" w:lineRule="auto"/>
+        <w:ind w:firstLine="709"/>
         <w:jc w:val="both"/>
       </w:pPr>
       <w:r>
@@ -594,7 +610,8 @@
     </w:p>
     <w:p>
       <w:pPr>
-        <w:spacing w:after="120" w:before="0" w:line="269" w:lineRule="auto"/>
+        <w:spacing w:after="120" w:before="0" w:line="336" w:lineRule="auto"/>
+        <w:ind w:firstLine="709"/>
         <w:jc w:val="both"/>
       </w:pPr>
       <w:r>
@@ -618,7 +635,8 @@
     </w:p>
     <w:p>
       <w:pPr>
-        <w:spacing w:after="120" w:before="80" w:line="269" w:lineRule="auto"/>
+        <w:spacing w:after="120" w:before="180" w:line="336" w:lineRule="auto"/>
+        <w:ind w:firstLine="709"/>
         <w:jc w:val="both"/>
       </w:pPr>
       <w:r>
@@ -643,7 +661,8 @@
     </w:p>
     <w:p>
       <w:pPr>
-        <w:spacing w:after="120" w:before="0" w:line="269" w:lineRule="auto"/>
+        <w:spacing w:after="120" w:before="0" w:line="336" w:lineRule="auto"/>
+        <w:ind w:firstLine="709"/>
         <w:jc w:val="both"/>
       </w:pPr>
       <w:r>
@@ -658,7 +677,8 @@
     </w:p>
     <w:p>
       <w:pPr>
-        <w:spacing w:after="120" w:before="0" w:line="269" w:lineRule="auto"/>
+        <w:spacing w:after="120" w:before="0" w:line="336" w:lineRule="auto"/>
+        <w:ind w:firstLine="709"/>
         <w:jc w:val="both"/>
       </w:pPr>
       <w:r>
@@ -673,7 +693,8 @@
     </w:p>
     <w:p>
       <w:pPr>
-        <w:spacing w:after="120" w:before="180" w:line="269" w:lineRule="auto"/>
+        <w:spacing w:after="120" w:before="180" w:line="336" w:lineRule="auto"/>
+        <w:ind w:firstLine="709"/>
         <w:jc w:val="both"/>
       </w:pPr>
       <w:r>
@@ -698,7 +719,8 @@
     </w:p>
     <w:p>
       <w:pPr>
-        <w:spacing w:after="120" w:before="180" w:line="269" w:lineRule="auto"/>
+        <w:spacing w:after="120" w:before="180" w:line="336" w:lineRule="auto"/>
+        <w:ind w:firstLine="709"/>
         <w:jc w:val="both"/>
       </w:pPr>
       <w:r>
@@ -723,7 +745,8 @@
     </w:p>
     <w:p>
       <w:pPr>
-        <w:spacing w:after="120" w:before="180" w:line="269" w:lineRule="auto"/>
+        <w:spacing w:after="120" w:before="180" w:line="336" w:lineRule="auto"/>
+        <w:ind w:firstLine="709"/>
         <w:jc w:val="both"/>
       </w:pPr>
       <w:r>
@@ -748,7 +771,8 @@
     </w:p>
     <w:p>
       <w:pPr>
-        <w:spacing w:after="120" w:before="180" w:line="269" w:lineRule="auto"/>
+        <w:spacing w:after="120" w:before="180" w:line="336" w:lineRule="auto"/>
+        <w:ind w:firstLine="709"/>
         <w:jc w:val="both"/>
       </w:pPr>
       <w:r>
@@ -773,7 +797,8 @@
     </w:p>
     <w:p>
       <w:pPr>
-        <w:spacing w:after="120" w:before="180" w:line="269" w:lineRule="auto"/>
+        <w:spacing w:after="120" w:before="180" w:line="336" w:lineRule="auto"/>
+        <w:ind w:firstLine="709"/>
         <w:jc w:val="both"/>
       </w:pPr>
       <w:r>
@@ -816,7 +841,8 @@
     </w:p>
     <w:p>
       <w:pPr>
-        <w:spacing w:after="120" w:before="0" w:line="269" w:lineRule="auto"/>
+        <w:spacing w:after="120" w:before="0" w:line="336" w:lineRule="auto"/>
+        <w:ind w:firstLine="709"/>
         <w:jc w:val="both"/>
       </w:pPr>
       <w:r>
@@ -831,7 +857,7 @@
     </w:p>
     <w:p>
       <w:pPr>
-        <w:spacing w:after="120" w:before="0" w:line="269" w:lineRule="auto"/>
+        <w:spacing w:after="120" w:before="0" w:line="336" w:lineRule="auto"/>
         <w:jc w:val="both"/>
       </w:pPr>
       <w:r>
@@ -855,7 +881,8 @@
     </w:p>
     <w:p>
       <w:pPr>
-        <w:spacing w:after="120" w:before="180" w:line="269" w:lineRule="auto"/>
+        <w:spacing w:after="120" w:before="180" w:line="336" w:lineRule="auto"/>
+        <w:ind w:firstLine="709"/>
         <w:jc w:val="both"/>
       </w:pPr>
       <w:r>
@@ -880,7 +907,8 @@
     </w:p>
     <w:p>
       <w:pPr>
-        <w:spacing w:after="120" w:before="180" w:line="269" w:lineRule="auto"/>
+        <w:spacing w:after="120" w:before="180" w:line="336" w:lineRule="auto"/>
+        <w:ind w:firstLine="709"/>
         <w:jc w:val="both"/>
       </w:pPr>
       <w:r>
@@ -905,7 +933,8 @@
     </w:p>
     <w:p>
       <w:pPr>
-        <w:spacing w:after="120" w:before="180" w:line="269" w:lineRule="auto"/>
+        <w:spacing w:after="120" w:before="180" w:line="336" w:lineRule="auto"/>
+        <w:ind w:firstLine="709"/>
         <w:jc w:val="both"/>
       </w:pPr>
       <w:r>
@@ -930,7 +959,8 @@
     </w:p>
     <w:p>
       <w:pPr>
-        <w:spacing w:after="120" w:before="180" w:line="269" w:lineRule="auto"/>
+        <w:spacing w:after="120" w:before="180" w:line="336" w:lineRule="auto"/>
+        <w:ind w:firstLine="709"/>
         <w:jc w:val="both"/>
       </w:pPr>
       <w:r>
@@ -955,7 +985,8 @@
     </w:p>
     <w:p>
       <w:pPr>
-        <w:spacing w:after="120" w:before="180" w:line="269" w:lineRule="auto"/>
+        <w:spacing w:after="120" w:before="180" w:line="336" w:lineRule="auto"/>
+        <w:ind w:firstLine="709"/>
         <w:jc w:val="both"/>
       </w:pPr>
       <w:r>
@@ -980,7 +1011,8 @@
     </w:p>
     <w:p>
       <w:pPr>
-        <w:spacing w:after="120" w:before="0" w:line="269" w:lineRule="auto"/>
+        <w:spacing w:after="120" w:before="0" w:line="336" w:lineRule="auto"/>
+        <w:ind w:firstLine="709"/>
         <w:jc w:val="both"/>
       </w:pPr>
       <w:r>
@@ -1004,7 +1036,8 @@
     </w:p>
     <w:p>
       <w:pPr>
-        <w:spacing w:after="120" w:before="0" w:line="269" w:lineRule="auto"/>
+        <w:spacing w:after="120" w:before="0" w:line="336" w:lineRule="auto"/>
+        <w:ind w:firstLine="709"/>
         <w:jc w:val="both"/>
       </w:pPr>
       <w:r>
@@ -1028,7 +1061,8 @@
     </w:p>
     <w:p>
       <w:pPr>
-        <w:spacing w:after="120" w:before="180" w:line="269" w:lineRule="auto"/>
+        <w:spacing w:after="120" w:before="180" w:line="336" w:lineRule="auto"/>
+        <w:ind w:firstLine="709"/>
         <w:jc w:val="both"/>
       </w:pPr>
       <w:r>
@@ -1053,7 +1087,8 @@
     </w:p>
     <w:p>
       <w:pPr>
-        <w:spacing w:after="120" w:before="0" w:line="269" w:lineRule="auto"/>
+        <w:spacing w:after="120" w:before="0" w:line="336" w:lineRule="auto"/>
+        <w:ind w:firstLine="709"/>
         <w:jc w:val="both"/>
       </w:pPr>
       <w:r>
@@ -1077,7 +1112,8 @@
     </w:p>
     <w:p>
       <w:pPr>
-        <w:spacing w:after="120" w:before="0" w:line="269" w:lineRule="auto"/>
+        <w:spacing w:after="120" w:before="0" w:line="336" w:lineRule="auto"/>
+        <w:ind w:firstLine="709"/>
         <w:jc w:val="both"/>
       </w:pPr>
       <w:r>
@@ -1101,7 +1137,8 @@
     </w:p>
     <w:p>
       <w:pPr>
-        <w:spacing w:after="120" w:before="180" w:line="269" w:lineRule="auto"/>
+        <w:spacing w:after="120" w:before="180" w:line="336" w:lineRule="auto"/>
+        <w:ind w:firstLine="709"/>
         <w:jc w:val="both"/>
       </w:pPr>
       <w:r>
@@ -1126,7 +1163,8 @@
     </w:p>
     <w:p>
       <w:pPr>
-        <w:spacing w:after="120" w:before="180" w:line="269" w:lineRule="auto"/>
+        <w:spacing w:after="120" w:before="180" w:line="336" w:lineRule="auto"/>
+        <w:ind w:firstLine="709"/>
         <w:jc w:val="both"/>
       </w:pPr>
       <w:r>
@@ -1151,7 +1189,8 @@
     </w:p>
     <w:p>
       <w:pPr>
-        <w:spacing w:after="120" w:before="180" w:line="269" w:lineRule="auto"/>
+        <w:spacing w:after="120" w:before="180" w:line="336" w:lineRule="auto"/>
+        <w:ind w:firstLine="709"/>
         <w:jc w:val="both"/>
       </w:pPr>
       <w:r>
@@ -1176,7 +1215,8 @@
     </w:p>
     <w:p>
       <w:pPr>
-        <w:spacing w:after="120" w:before="0" w:line="269" w:lineRule="auto"/>
+        <w:spacing w:after="120" w:before="0" w:line="336" w:lineRule="auto"/>
+        <w:ind w:firstLine="709"/>
         <w:jc w:val="both"/>
       </w:pPr>
       <w:r>
@@ -1200,7 +1240,8 @@
     </w:p>
     <w:p>
       <w:pPr>
-        <w:spacing w:after="120" w:before="0" w:line="269" w:lineRule="auto"/>
+        <w:spacing w:after="120" w:before="0" w:line="336" w:lineRule="auto"/>
+        <w:ind w:firstLine="709"/>
         <w:jc w:val="both"/>
       </w:pPr>
       <w:r>
@@ -1224,7 +1265,8 @@
     </w:p>
     <w:p>
       <w:pPr>
-        <w:spacing w:after="120" w:before="0" w:line="269" w:lineRule="auto"/>
+        <w:spacing w:after="120" w:before="0" w:line="336" w:lineRule="auto"/>
+        <w:ind w:firstLine="709"/>
         <w:jc w:val="both"/>
       </w:pPr>
       <w:r>
@@ -1248,7 +1290,8 @@
     </w:p>
     <w:p>
       <w:pPr>
-        <w:spacing w:after="120" w:before="180" w:line="269" w:lineRule="auto"/>
+        <w:spacing w:after="120" w:before="180" w:line="336" w:lineRule="auto"/>
+        <w:ind w:firstLine="709"/>
         <w:jc w:val="both"/>
       </w:pPr>
       <w:r>
@@ -1273,7 +1316,8 @@
     </w:p>
     <w:p>
       <w:pPr>
-        <w:spacing w:after="120" w:before="0" w:line="269" w:lineRule="auto"/>
+        <w:spacing w:after="120" w:before="0" w:line="336" w:lineRule="auto"/>
+        <w:ind w:firstLine="709"/>
         <w:jc w:val="both"/>
       </w:pPr>
       <w:r>
@@ -1297,7 +1341,8 @@
     </w:p>
     <w:p>
       <w:pPr>
-        <w:spacing w:after="120" w:before="180" w:line="269" w:lineRule="auto"/>
+        <w:spacing w:after="120" w:before="180" w:line="336" w:lineRule="auto"/>
+        <w:ind w:firstLine="709"/>
         <w:jc w:val="both"/>
       </w:pPr>
       <w:r>
@@ -1322,7 +1367,8 @@
     </w:p>
     <w:p>
       <w:pPr>
-        <w:spacing w:after="120" w:before="180" w:line="269" w:lineRule="auto"/>
+        <w:spacing w:after="120" w:before="180" w:line="336" w:lineRule="auto"/>
+        <w:ind w:firstLine="709"/>
         <w:jc w:val="both"/>
       </w:pPr>
       <w:r>
@@ -1347,7 +1393,8 @@
     </w:p>
     <w:p>
       <w:pPr>
-        <w:spacing w:after="120" w:before="180" w:line="269" w:lineRule="auto"/>
+        <w:spacing w:after="120" w:before="180" w:line="336" w:lineRule="auto"/>
+        <w:ind w:firstLine="709"/>
         <w:jc w:val="both"/>
       </w:pPr>
       <w:r>
@@ -1372,7 +1419,8 @@
     </w:p>
     <w:p>
       <w:pPr>
-        <w:spacing w:after="120" w:before="0" w:line="269" w:lineRule="auto"/>
+        <w:spacing w:after="120" w:before="0" w:line="336" w:lineRule="auto"/>
+        <w:ind w:firstLine="709"/>
         <w:jc w:val="both"/>
       </w:pPr>
       <w:r>
@@ -1396,7 +1444,8 @@
     </w:p>
     <w:p>
       <w:pPr>
-        <w:spacing w:after="120" w:before="0" w:line="269" w:lineRule="auto"/>
+        <w:spacing w:after="120" w:before="0" w:line="336" w:lineRule="auto"/>
+        <w:ind w:firstLine="709"/>
         <w:jc w:val="both"/>
       </w:pPr>
       <w:r>
@@ -1420,7 +1469,8 @@
     </w:p>
     <w:p>
       <w:pPr>
-        <w:spacing w:after="120" w:before="180" w:line="269" w:lineRule="auto"/>
+        <w:spacing w:after="120" w:before="180" w:line="336" w:lineRule="auto"/>
+        <w:ind w:firstLine="709"/>
         <w:jc w:val="both"/>
       </w:pPr>
       <w:r>
@@ -1445,7 +1495,8 @@
     </w:p>
     <w:p>
       <w:pPr>
-        <w:spacing w:after="120" w:before="0" w:line="269" w:lineRule="auto"/>
+        <w:spacing w:after="120" w:before="0" w:line="336" w:lineRule="auto"/>
+        <w:ind w:firstLine="709"/>
         <w:jc w:val="both"/>
       </w:pPr>
       <w:r>
@@ -1469,7 +1520,8 @@
     </w:p>
     <w:p>
       <w:pPr>
-        <w:spacing w:after="120" w:before="0" w:line="269" w:lineRule="auto"/>
+        <w:spacing w:after="120" w:before="0" w:line="336" w:lineRule="auto"/>
+        <w:ind w:firstLine="709"/>
         <w:jc w:val="both"/>
       </w:pPr>
       <w:r>
@@ -1493,7 +1545,8 @@
     </w:p>
     <w:p>
       <w:pPr>
-        <w:spacing w:after="120" w:before="180" w:line="269" w:lineRule="auto"/>
+        <w:spacing w:after="120" w:before="180" w:line="336" w:lineRule="auto"/>
+        <w:ind w:firstLine="709"/>
         <w:jc w:val="both"/>
       </w:pPr>
       <w:r>
@@ -1518,7 +1571,8 @@
     </w:p>
     <w:p>
       <w:pPr>
-        <w:spacing w:after="120" w:before="180" w:line="269" w:lineRule="auto"/>
+        <w:spacing w:after="120" w:before="180" w:line="336" w:lineRule="auto"/>
+        <w:ind w:firstLine="709"/>
         <w:jc w:val="both"/>
       </w:pPr>
       <w:r>
@@ -1543,7 +1597,8 @@
     </w:p>
     <w:p>
       <w:pPr>
-        <w:spacing w:after="120" w:before="180" w:line="269" w:lineRule="auto"/>
+        <w:spacing w:after="120" w:before="180" w:line="336" w:lineRule="auto"/>
+        <w:ind w:firstLine="709"/>
         <w:jc w:val="both"/>
       </w:pPr>
       <w:r>
@@ -1568,7 +1623,8 @@
     </w:p>
     <w:p>
       <w:pPr>
-        <w:spacing w:after="120" w:before="180" w:line="269" w:lineRule="auto"/>
+        <w:spacing w:after="120" w:before="180" w:line="336" w:lineRule="auto"/>
+        <w:ind w:firstLine="709"/>
         <w:jc w:val="both"/>
       </w:pPr>
       <w:r>
@@ -1593,7 +1649,26 @@
     </w:p>
     <w:p>
       <w:pPr>
-        <w:spacing w:after="120" w:before="160" w:line="269" w:lineRule="auto"/>
+        <w:pageBreakBefore/>
+        <w:spacing w:after="200" w:before="0" w:line="240" w:lineRule="auto"/>
+        <w:jc w:val="center"/>
+      </w:pPr>
+      <w:r>
+        <w:rPr>
+          <w:rFonts w:ascii="Arial" w:hAnsi="Arial" w:cs="Arial"/>
+          <w:b/>
+          <w:i w:val="0"/>
+          <w:color w:val="8A6520"/>
+          <w:sz w:val="22"/>
+          <w:smallCaps/>
+        </w:rPr>
+        <w:t>ENCERRAMENTO E ASSINATURAS</w:t>
+      </w:r>
+    </w:p>
+    <w:p>
+      <w:pPr>
+        <w:spacing w:after="120" w:before="0" w:line="336" w:lineRule="auto"/>
+        <w:ind w:firstLine="709"/>
         <w:jc w:val="both"/>
       </w:pPr>
       <w:r>
@@ -1608,7 +1683,7 @@
     </w:p>
     <w:p>
       <w:pPr>
-        <w:spacing w:after="40" w:before="0" w:line="269" w:lineRule="auto"/>
+        <w:spacing w:after="40" w:before="80" w:line="336" w:lineRule="auto"/>
         <w:jc w:val="right"/>
       </w:pPr>
       <w:r>
@@ -2021,7 +2096,7 @@
     </w:p>
     <w:p>
       <w:pPr>
-        <w:spacing w:after="160" w:before="480" w:line="269" w:lineRule="auto"/>
+        <w:spacing w:after="160" w:before="480" w:line="336" w:lineRule="auto"/>
         <w:jc w:val="both"/>
       </w:pPr>
       <w:r>
@@ -2038,7 +2113,7 @@
     </w:p>
     <w:p>
       <w:pPr>
-        <w:spacing w:after="240" w:before="0" w:line="269" w:lineRule="auto"/>
+        <w:spacing w:after="240" w:before="0" w:line="336" w:lineRule="auto"/>
         <w:jc w:val="both"/>
       </w:pPr>
       <w:r>
@@ -2053,7 +2128,7 @@
     </w:p>
     <w:p>
       <w:pPr>
-        <w:spacing w:after="120" w:before="0" w:line="269" w:lineRule="auto"/>
+        <w:spacing w:after="120" w:before="0" w:line="336" w:lineRule="auto"/>
         <w:jc w:val="both"/>
       </w:pPr>
       <w:r>
@@ -2121,7 +2196,7 @@
     </w:p>
     <w:p>
       <w:pPr>
-        <w:spacing w:after="60" w:before="160" w:line="269" w:lineRule="auto"/>
+        <w:spacing w:after="60" w:before="160" w:line="336" w:lineRule="auto"/>
         <w:jc w:val="both"/>
       </w:pPr>
       <w:r>
@@ -2137,7 +2212,8 @@
     </w:p>
     <w:p>
       <w:pPr>
-        <w:spacing w:after="120" w:before="0" w:line="269" w:lineRule="auto"/>
+        <w:spacing w:after="120" w:before="0" w:line="336" w:lineRule="auto"/>
+        <w:ind w:firstLine="709"/>
         <w:jc w:val="both"/>
       </w:pPr>
       <w:r>
@@ -2152,7 +2228,8 @@
     </w:p>
     <w:p>
       <w:pPr>
-        <w:spacing w:after="120" w:before="0" w:line="269" w:lineRule="auto"/>
+        <w:spacing w:after="120" w:before="0" w:line="336" w:lineRule="auto"/>
+        <w:ind w:firstLine="709"/>
         <w:jc w:val="both"/>
       </w:pPr>
       <w:r>
@@ -2167,7 +2244,8 @@
     </w:p>
     <w:p>
       <w:pPr>
-        <w:spacing w:after="120" w:before="0" w:line="269" w:lineRule="auto"/>
+        <w:spacing w:after="120" w:before="0" w:line="336" w:lineRule="auto"/>
+        <w:ind w:firstLine="709"/>
         <w:jc w:val="both"/>
       </w:pPr>
       <w:r>
@@ -2182,7 +2260,7 @@
     </w:p>
     <w:p>
       <w:pPr>
-        <w:spacing w:after="60" w:before="160" w:line="269" w:lineRule="auto"/>
+        <w:spacing w:after="60" w:before="160" w:line="336" w:lineRule="auto"/>
         <w:jc w:val="both"/>
       </w:pPr>
       <w:r>
@@ -2198,7 +2276,8 @@
     </w:p>
     <w:p>
       <w:pPr>
-        <w:spacing w:after="120" w:before="0" w:line="269" w:lineRule="auto"/>
+        <w:spacing w:after="120" w:before="0" w:line="336" w:lineRule="auto"/>
+        <w:ind w:firstLine="709"/>
         <w:jc w:val="both"/>
       </w:pPr>
       <w:r>
@@ -2213,7 +2292,8 @@
     </w:p>
     <w:p>
       <w:pPr>
-        <w:spacing w:after="120" w:before="0" w:line="269" w:lineRule="auto"/>
+        <w:spacing w:after="120" w:before="0" w:line="336" w:lineRule="auto"/>
+        <w:ind w:firstLine="709"/>
         <w:jc w:val="both"/>
       </w:pPr>
       <w:r>
@@ -2228,7 +2308,8 @@
     </w:p>
     <w:p>
       <w:pPr>
-        <w:spacing w:after="120" w:before="0" w:line="269" w:lineRule="auto"/>
+        <w:spacing w:after="120" w:before="0" w:line="336" w:lineRule="auto"/>
+        <w:ind w:firstLine="709"/>
         <w:jc w:val="both"/>
       </w:pPr>
       <w:r>
@@ -2243,7 +2324,8 @@
     </w:p>
     <w:p>
       <w:pPr>
-        <w:spacing w:after="120" w:before="0" w:line="269" w:lineRule="auto"/>
+        <w:spacing w:after="120" w:before="0" w:line="336" w:lineRule="auto"/>
+        <w:ind w:firstLine="709"/>
         <w:jc w:val="both"/>
       </w:pPr>
       <w:r>
@@ -2258,7 +2340,8 @@
     </w:p>
     <w:p>
       <w:pPr>
-        <w:spacing w:after="120" w:before="0" w:line="269" w:lineRule="auto"/>
+        <w:spacing w:after="120" w:before="0" w:line="336" w:lineRule="auto"/>
+        <w:ind w:firstLine="709"/>
         <w:jc w:val="both"/>
       </w:pPr>
       <w:r>
@@ -2273,7 +2356,7 @@
     </w:p>
     <w:p>
       <w:pPr>
-        <w:spacing w:after="60" w:before="160" w:line="269" w:lineRule="auto"/>
+        <w:spacing w:after="60" w:before="160" w:line="336" w:lineRule="auto"/>
         <w:jc w:val="both"/>
       </w:pPr>
       <w:r>
@@ -2289,7 +2372,8 @@
     </w:p>
     <w:p>
       <w:pPr>
-        <w:spacing w:after="120" w:before="0" w:line="269" w:lineRule="auto"/>
+        <w:spacing w:after="120" w:before="0" w:line="336" w:lineRule="auto"/>
+        <w:ind w:firstLine="709"/>
         <w:jc w:val="both"/>
       </w:pPr>
       <w:r>
@@ -2304,7 +2388,8 @@
     </w:p>
     <w:p>
       <w:pPr>
-        <w:spacing w:after="40" w:before="0" w:line="269" w:lineRule="auto"/>
+        <w:spacing w:after="40" w:before="0" w:line="336" w:lineRule="auto"/>
+        <w:ind w:firstLine="709"/>
         <w:jc w:val="both"/>
       </w:pPr>
       <w:r>
@@ -2319,7 +2404,8 @@
     </w:p>
     <w:p>
       <w:pPr>
-        <w:spacing w:after="40" w:before="0" w:line="269" w:lineRule="auto"/>
+        <w:spacing w:after="40" w:before="0" w:line="336" w:lineRule="auto"/>
+        <w:ind w:firstLine="709"/>
         <w:jc w:val="both"/>
       </w:pPr>
       <w:r>
@@ -2334,7 +2420,8 @@
     </w:p>
     <w:p>
       <w:pPr>
-        <w:spacing w:after="40" w:before="0" w:line="269" w:lineRule="auto"/>
+        <w:spacing w:after="40" w:before="0" w:line="336" w:lineRule="auto"/>
+        <w:ind w:firstLine="709"/>
         <w:jc w:val="both"/>
       </w:pPr>
       <w:r>
@@ -2349,7 +2436,8 @@
     </w:p>
     <w:p>
       <w:pPr>
-        <w:spacing w:after="40" w:before="0" w:line="269" w:lineRule="auto"/>
+        <w:spacing w:after="40" w:before="0" w:line="336" w:lineRule="auto"/>
+        <w:ind w:firstLine="709"/>
         <w:jc w:val="both"/>
       </w:pPr>
       <w:r>
@@ -2364,7 +2452,8 @@
     </w:p>
     <w:p>
       <w:pPr>
-        <w:spacing w:after="40" w:before="0" w:line="269" w:lineRule="auto"/>
+        <w:spacing w:after="40" w:before="0" w:line="336" w:lineRule="auto"/>
+        <w:ind w:firstLine="709"/>
         <w:jc w:val="both"/>
       </w:pPr>
       <w:r>
@@ -2379,7 +2468,8 @@
     </w:p>
     <w:p>
       <w:pPr>
-        <w:spacing w:after="40" w:before="0" w:line="269" w:lineRule="auto"/>
+        <w:spacing w:after="40" w:before="0" w:line="336" w:lineRule="auto"/>
+        <w:ind w:firstLine="709"/>
         <w:jc w:val="both"/>
       </w:pPr>
       <w:r>
@@ -2394,7 +2484,8 @@
     </w:p>
     <w:p>
       <w:pPr>
-        <w:spacing w:after="40" w:before="0" w:line="269" w:lineRule="auto"/>
+        <w:spacing w:after="40" w:before="0" w:line="336" w:lineRule="auto"/>
+        <w:ind w:firstLine="709"/>
         <w:jc w:val="both"/>
       </w:pPr>
       <w:r>
@@ -2409,7 +2500,8 @@
     </w:p>
     <w:p>
       <w:pPr>
-        <w:spacing w:after="40" w:before="0" w:line="269" w:lineRule="auto"/>
+        <w:spacing w:after="40" w:before="0" w:line="336" w:lineRule="auto"/>
+        <w:ind w:firstLine="709"/>
         <w:jc w:val="both"/>
       </w:pPr>
       <w:r>
@@ -2424,7 +2516,8 @@
     </w:p>
     <w:p>
       <w:pPr>
-        <w:spacing w:after="40" w:before="0" w:line="269" w:lineRule="auto"/>
+        <w:spacing w:after="40" w:before="0" w:line="336" w:lineRule="auto"/>
+        <w:ind w:firstLine="709"/>
         <w:jc w:val="both"/>
       </w:pPr>
       <w:r>
@@ -2439,7 +2532,8 @@
     </w:p>
     <w:p>
       <w:pPr>
-        <w:spacing w:after="40" w:before="0" w:line="269" w:lineRule="auto"/>
+        <w:spacing w:after="40" w:before="0" w:line="336" w:lineRule="auto"/>
+        <w:ind w:firstLine="709"/>
         <w:jc w:val="both"/>
       </w:pPr>
       <w:r>
@@ -2454,7 +2548,7 @@
     </w:p>
     <w:p>
       <w:pPr>
-        <w:spacing w:after="60" w:before="160" w:line="269" w:lineRule="auto"/>
+        <w:spacing w:after="60" w:before="160" w:line="336" w:lineRule="auto"/>
         <w:jc w:val="both"/>
       </w:pPr>
       <w:r>
@@ -2470,7 +2564,8 @@
     </w:p>
     <w:p>
       <w:pPr>
-        <w:spacing w:after="120" w:before="0" w:line="269" w:lineRule="auto"/>
+        <w:spacing w:after="120" w:before="0" w:line="336" w:lineRule="auto"/>
+        <w:ind w:firstLine="709"/>
         <w:jc w:val="both"/>
       </w:pPr>
       <w:r>
@@ -2485,7 +2580,7 @@
     </w:p>
     <w:p>
       <w:pPr>
-        <w:spacing w:after="60" w:before="160" w:line="269" w:lineRule="auto"/>
+        <w:spacing w:after="60" w:before="160" w:line="336" w:lineRule="auto"/>
         <w:jc w:val="both"/>
       </w:pPr>
       <w:r>
@@ -2501,7 +2596,8 @@
     </w:p>
     <w:p>
       <w:pPr>
-        <w:spacing w:after="120" w:before="0" w:line="269" w:lineRule="auto"/>
+        <w:spacing w:after="120" w:before="0" w:line="336" w:lineRule="auto"/>
+        <w:ind w:firstLine="709"/>
         <w:jc w:val="both"/>
       </w:pPr>
       <w:r>
@@ -2516,7 +2612,7 @@
     </w:p>
     <w:p>
       <w:pPr>
-        <w:spacing w:after="60" w:before="160" w:line="269" w:lineRule="auto"/>
+        <w:spacing w:after="60" w:before="160" w:line="336" w:lineRule="auto"/>
         <w:jc w:val="both"/>
       </w:pPr>
       <w:r>
@@ -2532,7 +2628,8 @@
     </w:p>
     <w:p>
       <w:pPr>
-        <w:spacing w:after="120" w:before="0" w:line="269" w:lineRule="auto"/>
+        <w:spacing w:after="120" w:before="0" w:line="336" w:lineRule="auto"/>
+        <w:ind w:firstLine="709"/>
         <w:jc w:val="both"/>
       </w:pPr>
       <w:r>
@@ -2547,7 +2644,8 @@
     </w:p>
     <w:p>
       <w:pPr>
-        <w:spacing w:after="120" w:before="0" w:line="269" w:lineRule="auto"/>
+        <w:spacing w:after="120" w:before="0" w:line="336" w:lineRule="auto"/>
+        <w:ind w:firstLine="709"/>
         <w:jc w:val="both"/>
       </w:pPr>
       <w:r>
@@ -2615,7 +2713,8 @@
     </w:p>
     <w:p>
       <w:pPr>
-        <w:spacing w:after="120" w:before="0" w:line="269" w:lineRule="auto"/>
+        <w:spacing w:after="120" w:before="0" w:line="336" w:lineRule="auto"/>
+        <w:ind w:firstLine="709"/>
         <w:jc w:val="both"/>
       </w:pPr>
       <w:r>
@@ -2630,7 +2729,8 @@
     </w:p>
     <w:p>
       <w:pPr>
-        <w:spacing w:after="120" w:before="0" w:line="269" w:lineRule="auto"/>
+        <w:spacing w:after="120" w:before="0" w:line="336" w:lineRule="auto"/>
+        <w:ind w:firstLine="709"/>
         <w:jc w:val="both"/>
       </w:pPr>
       <w:r>
@@ -2713,7 +2813,7 @@
     </w:p>
     <w:p>
       <w:pPr>
-        <w:spacing w:after="120" w:before="0" w:line="269" w:lineRule="auto"/>
+        <w:spacing w:after="120" w:before="0" w:line="336" w:lineRule="auto"/>
         <w:jc w:val="both"/>
       </w:pPr>
       <w:r>
@@ -2728,7 +2828,8 @@
     </w:p>
     <w:p>
       <w:pPr>
-        <w:spacing w:after="120" w:before="0" w:line="269" w:lineRule="auto"/>
+        <w:spacing w:after="120" w:before="0" w:line="336" w:lineRule="auto"/>
+        <w:ind w:firstLine="709"/>
         <w:jc w:val="both"/>
       </w:pPr>
       <w:r>
@@ -2743,7 +2844,8 @@
     </w:p>
     <w:p>
       <w:pPr>
-        <w:spacing w:after="120" w:before="0" w:line="269" w:lineRule="auto"/>
+        <w:spacing w:after="120" w:before="0" w:line="336" w:lineRule="auto"/>
+        <w:ind w:firstLine="709"/>
         <w:jc w:val="both"/>
       </w:pPr>
       <w:r>
@@ -2758,7 +2860,8 @@
     </w:p>
     <w:p>
       <w:pPr>
-        <w:spacing w:after="120" w:before="0" w:line="269" w:lineRule="auto"/>
+        <w:spacing w:after="120" w:before="0" w:line="336" w:lineRule="auto"/>
+        <w:ind w:firstLine="709"/>
         <w:jc w:val="both"/>
       </w:pPr>
       <w:r>
@@ -2773,7 +2876,8 @@
     </w:p>
     <w:p>
       <w:pPr>
-        <w:spacing w:after="120" w:before="0" w:line="269" w:lineRule="auto"/>
+        <w:spacing w:after="120" w:before="0" w:line="336" w:lineRule="auto"/>
+        <w:ind w:firstLine="709"/>
         <w:jc w:val="both"/>
       </w:pPr>
       <w:r>
@@ -2788,7 +2892,8 @@
     </w:p>
     <w:p>
       <w:pPr>
-        <w:spacing w:after="120" w:before="0" w:line="269" w:lineRule="auto"/>
+        <w:spacing w:after="120" w:before="0" w:line="336" w:lineRule="auto"/>
+        <w:ind w:firstLine="709"/>
         <w:jc w:val="both"/>
       </w:pPr>
       <w:r>
@@ -2803,7 +2908,8 @@
     </w:p>
     <w:p>
       <w:pPr>
-        <w:spacing w:after="120" w:before="0" w:line="269" w:lineRule="auto"/>
+        <w:spacing w:after="120" w:before="0" w:line="336" w:lineRule="auto"/>
+        <w:ind w:firstLine="709"/>
         <w:jc w:val="both"/>
       </w:pPr>
       <w:r>
@@ -2818,7 +2924,7 @@
     </w:p>
     <w:p>
       <w:pPr>
-        <w:spacing w:after="40" w:before="0" w:line="269" w:lineRule="auto"/>
+        <w:spacing w:after="40" w:before="0" w:line="336" w:lineRule="auto"/>
         <w:jc w:val="right"/>
       </w:pPr>
       <w:r>

</xml_diff>

<commit_message>
Identidade visual moderna (estilo Canva): faixa verde de título, selos de seção e rodapé colorido
Espelha o modelo de referência do cliente, mantendo o conteúdo e os campos dinâmicos:
- Paleta verde-petróleo (#1C6B5B) como acento (no lugar do dourado).
- Faixa verde de título em cada um dos 4 documentos (CONTRATO + complementares).
- Selos verdes nas seções (Qualificação das Partes, Encerramento e Assinaturas, Testemunhas).
- Títulos das cláusulas em verde; rodapé em faixa verde com endereço + nº de página.
- Verificado: o preenchimento de cor sobrevive à conversão Google Docs -> PDF.

Co-Authored-By: Claude Opus 4.8 (1M context) <noreply@anthropic.com>
</commit_message>
<xml_diff>
--- a/clinica.docx
+++ b/clinica.docx
@@ -4,54 +4,52 @@
   <w:body>
     <w:p>
       <w:pPr>
-        <w:spacing w:after="60" w:before="0" w:line="240" w:lineRule="auto"/>
+        <w:spacing w:after="280" w:before="0" w:line="240" w:lineRule="auto"/>
         <w:jc w:val="center"/>
-      </w:pPr>
+        <w:shd w:val="clear" w:color="auto" w:fill="1C6B5B"/>
+      </w:pPr>
+      <w:r>
+        <w:rPr>
+          <w:rFonts w:ascii="Arial" w:hAnsi="Arial" w:cs="Arial"/>
+          <w:b w:val="0"/>
+          <w:i w:val="0"/>
+          <w:color w:val="FFFFFF"/>
+          <w:sz w:val="12"/>
+        </w:rPr>
+        <w:br/>
+      </w:r>
       <w:r>
         <w:rPr>
           <w:rFonts w:ascii="Arial" w:hAnsi="Arial" w:cs="Arial"/>
           <w:b/>
           <w:i w:val="0"/>
-          <w:color w:val="8A6520"/>
-          <w:sz w:val="18"/>
-          <w:smallCaps/>
+          <w:color w:val="FFFFFF"/>
+          <w:sz w:val="52"/>
         </w:rPr>
-        <w:t>INSTRUMENTO PARTICULAR</w:t>
+        <w:t>CONTRATO</w:t>
       </w:r>
-    </w:p>
-    <w:p>
-      <w:pPr>
-        <w:spacing w:after="60" w:before="0" w:line="240" w:lineRule="auto"/>
-        <w:jc w:val="center"/>
-      </w:pPr>
       <w:r>
-        <w:rPr>
-          <w:rFonts w:ascii="Arial" w:hAnsi="Arial" w:cs="Arial"/>
-          <w:b/>
-          <w:i w:val="0"/>
-          <w:color w:val="1A1A1A"/>
-          <w:sz w:val="32"/>
-        </w:rPr>
-        <w:t>CONTRATO DE LOCAÇÃO DE CONSULTÓRIO ODONTOLÓGICO</w:t>
+        <w:br/>
       </w:r>
-    </w:p>
-    <w:p>
-      <w:pPr>
-        <w:spacing w:after="280" w:before="0" w:line="240" w:lineRule="auto"/>
-        <w:jc w:val="center"/>
-        <w:pBdr>
-          <w:bottom w:val="single" w:sz="6" w:space="6" w:color="8A6520"/>
-        </w:pBdr>
-      </w:pPr>
       <w:r>
         <w:rPr>
           <w:rFonts w:ascii="Arial" w:hAnsi="Arial" w:cs="Arial"/>
           <w:b w:val="0"/>
-          <w:i/>
-          <w:color w:val="666666"/>
-          <w:sz w:val="19"/>
+          <w:i w:val="0"/>
+          <w:color w:val="FFFFFF"/>
+          <w:sz w:val="22"/>
         </w:rPr>
-        <w:t>Regido pela Lei nº 8.245/1991</w:t>
+        <w:t>Contrato de Locação de Consultório Odontológico  ·  Lei nº 8.245/1991</w:t>
+      </w:r>
+      <w:r>
+        <w:rPr>
+          <w:rFonts w:ascii="Arial" w:hAnsi="Arial" w:cs="Arial"/>
+          <w:b w:val="0"/>
+          <w:i w:val="0"/>
+          <w:color w:val="FFFFFF"/>
+          <w:sz w:val="12"/>
+        </w:rPr>
+        <w:br/>
       </w:r>
     </w:p>
     <w:p>
@@ -72,19 +70,20 @@
     </w:p>
     <w:p>
       <w:pPr>
-        <w:spacing w:after="80" w:before="120" w:line="336" w:lineRule="auto"/>
-        <w:jc w:val="both"/>
+        <w:spacing w:after="120" w:before="200" w:line="240" w:lineRule="auto"/>
+        <w:jc w:val="left"/>
       </w:pPr>
       <w:r>
         <w:rPr>
           <w:rFonts w:ascii="Arial" w:hAnsi="Arial" w:cs="Arial"/>
           <w:b/>
           <w:i w:val="0"/>
-          <w:color w:val="8A6520"/>
-          <w:sz w:val="22"/>
+          <w:color w:val="FFFFFF"/>
+          <w:sz w:val="21"/>
           <w:smallCaps/>
+          <w:shd w:val="clear" w:color="auto" w:fill="1C6B5B"/>
         </w:rPr>
-        <w:t>QUALIFICAÇÃO DAS PARTES</w:t>
+        <w:t xml:space="preserve">  Qualificação das Partes  </w:t>
       </w:r>
     </w:p>
     <w:p>
@@ -246,7 +245,7 @@
           <w:rFonts w:ascii="Times New Roman" w:hAnsi="Times New Roman" w:cs="Times New Roman"/>
           <w:b/>
           <w:i w:val="0"/>
-          <w:color w:val="1A1A1A"/>
+          <w:color w:val="1C6B5B"/>
           <w:sz w:val="23"/>
         </w:rPr>
         <w:t xml:space="preserve">CLÁUSULA PRIMEIRA – DO OBJETO DA LOCAÇÃO: </w:t>
@@ -322,7 +321,7 @@
           <w:rFonts w:ascii="Times New Roman" w:hAnsi="Times New Roman" w:cs="Times New Roman"/>
           <w:b/>
           <w:i w:val="0"/>
-          <w:color w:val="1A1A1A"/>
+          <w:color w:val="1C6B5B"/>
           <w:sz w:val="23"/>
         </w:rPr>
         <w:t xml:space="preserve">CLÁUSULA SEGUNDA – DO PRAZO: </w:t>
@@ -398,7 +397,7 @@
           <w:rFonts w:ascii="Times New Roman" w:hAnsi="Times New Roman" w:cs="Times New Roman"/>
           <w:b/>
           <w:i w:val="0"/>
-          <w:color w:val="1A1A1A"/>
+          <w:color w:val="1C6B5B"/>
           <w:sz w:val="23"/>
         </w:rPr>
         <w:t xml:space="preserve">CLÁUSULA TERCEIRA – DA FIANÇA: </w:t>
@@ -474,7 +473,7 @@
           <w:rFonts w:ascii="Times New Roman" w:hAnsi="Times New Roman" w:cs="Times New Roman"/>
           <w:b/>
           <w:i w:val="0"/>
-          <w:color w:val="1A1A1A"/>
+          <w:color w:val="1C6B5B"/>
           <w:sz w:val="23"/>
         </w:rPr>
         <w:t xml:space="preserve">CLÁUSULA QUARTA – DO VALOR DO ALUGUEL: </w:t>
@@ -550,7 +549,7 @@
           <w:rFonts w:ascii="Times New Roman" w:hAnsi="Times New Roman" w:cs="Times New Roman"/>
           <w:b/>
           <w:i w:val="0"/>
-          <w:color w:val="1A1A1A"/>
+          <w:color w:val="1C6B5B"/>
           <w:sz w:val="23"/>
         </w:rPr>
         <w:t xml:space="preserve">CLÁUSULA QUINTA – DO VENCIMENTO: </w:t>
@@ -644,7 +643,7 @@
           <w:rFonts w:ascii="Times New Roman" w:hAnsi="Times New Roman" w:cs="Times New Roman"/>
           <w:b/>
           <w:i w:val="0"/>
-          <w:color w:val="1A1A1A"/>
+          <w:color w:val="1C6B5B"/>
           <w:sz w:val="23"/>
         </w:rPr>
         <w:t xml:space="preserve">CLÁUSULA SEXTA – DO RATEIO DAS DESPESAS DE USO COMUM (CONDOMÍNIO): </w:t>
@@ -702,7 +701,7 @@
           <w:rFonts w:ascii="Times New Roman" w:hAnsi="Times New Roman" w:cs="Times New Roman"/>
           <w:b/>
           <w:i w:val="0"/>
-          <w:color w:val="1A1A1A"/>
+          <w:color w:val="1C6B5B"/>
           <w:sz w:val="23"/>
         </w:rPr>
         <w:t xml:space="preserve">CLÁUSULA SÉTIMA – DA VEDAÇÃO À CESSÃO E À SUBLOCAÇÃO: </w:t>
@@ -728,7 +727,7 @@
           <w:rFonts w:ascii="Times New Roman" w:hAnsi="Times New Roman" w:cs="Times New Roman"/>
           <w:b/>
           <w:i w:val="0"/>
-          <w:color w:val="1A1A1A"/>
+          <w:color w:val="1C6B5B"/>
           <w:sz w:val="23"/>
         </w:rPr>
         <w:t xml:space="preserve">CLÁUSULA OITAVA – DA REGULARIDADE: </w:t>
@@ -754,7 +753,7 @@
           <w:rFonts w:ascii="Times New Roman" w:hAnsi="Times New Roman" w:cs="Times New Roman"/>
           <w:b/>
           <w:i w:val="0"/>
-          <w:color w:val="1A1A1A"/>
+          <w:color w:val="1C6B5B"/>
           <w:sz w:val="23"/>
         </w:rPr>
         <w:t xml:space="preserve">CLÁUSULA NONA – DA EXTINÇÃO POR FALÊNCIA OU RECUPERAÇÃO JUDICIAL DO LOCADOR: </w:t>
@@ -780,7 +779,7 @@
           <w:rFonts w:ascii="Times New Roman" w:hAnsi="Times New Roman" w:cs="Times New Roman"/>
           <w:b/>
           <w:i w:val="0"/>
-          <w:color w:val="1A1A1A"/>
+          <w:color w:val="1C6B5B"/>
           <w:sz w:val="23"/>
         </w:rPr>
         <w:t xml:space="preserve">CLÁUSULA DÉCIMA – DAS BENFEITORIAS E OBRAS: </w:t>
@@ -806,7 +805,7 @@
           <w:rFonts w:ascii="Times New Roman" w:hAnsi="Times New Roman" w:cs="Times New Roman"/>
           <w:b/>
           <w:i w:val="0"/>
-          <w:color w:val="1A1A1A"/>
+          <w:color w:val="1C6B5B"/>
           <w:sz w:val="23"/>
         </w:rPr>
         <w:t xml:space="preserve">CLÁUSULA DÉCIMA PRIMEIRA – DO ESTADO E DA CONSERVAÇÃO DO IMÓVEL: </w:t>
@@ -890,7 +889,7 @@
           <w:rFonts w:ascii="Times New Roman" w:hAnsi="Times New Roman" w:cs="Times New Roman"/>
           <w:b/>
           <w:i w:val="0"/>
-          <w:color w:val="1A1A1A"/>
+          <w:color w:val="1C6B5B"/>
           <w:sz w:val="23"/>
         </w:rPr>
         <w:t xml:space="preserve">CLÁUSULA DÉCIMA SEGUNDA – DO REGULAMENTO INTERNO: </w:t>
@@ -916,7 +915,7 @@
           <w:rFonts w:ascii="Times New Roman" w:hAnsi="Times New Roman" w:cs="Times New Roman"/>
           <w:b/>
           <w:i w:val="0"/>
-          <w:color w:val="1A1A1A"/>
+          <w:color w:val="1C6B5B"/>
           <w:sz w:val="23"/>
         </w:rPr>
         <w:t xml:space="preserve">CLÁUSULA DÉCIMA TERCEIRA – DO DIREITO DE VISTORIA: </w:t>
@@ -942,7 +941,7 @@
           <w:rFonts w:ascii="Times New Roman" w:hAnsi="Times New Roman" w:cs="Times New Roman"/>
           <w:b/>
           <w:i w:val="0"/>
-          <w:color w:val="1A1A1A"/>
+          <w:color w:val="1C6B5B"/>
           <w:sz w:val="23"/>
         </w:rPr>
         <w:t xml:space="preserve">CLÁUSULA DÉCIMA QUARTA – DA MANUTENÇÃO DAS CONDIÇÕES NA PRORROGAÇÃO: </w:t>
@@ -968,7 +967,7 @@
           <w:rFonts w:ascii="Times New Roman" w:hAnsi="Times New Roman" w:cs="Times New Roman"/>
           <w:b/>
           <w:i w:val="0"/>
-          <w:color w:val="1A1A1A"/>
+          <w:color w:val="1C6B5B"/>
           <w:sz w:val="23"/>
         </w:rPr>
         <w:t xml:space="preserve">CLÁUSULA DÉCIMA QUINTA – DA DESOCUPAÇÃO: </w:t>
@@ -994,7 +993,7 @@
           <w:rFonts w:ascii="Times New Roman" w:hAnsi="Times New Roman" w:cs="Times New Roman"/>
           <w:b/>
           <w:i w:val="0"/>
-          <w:color w:val="1A1A1A"/>
+          <w:color w:val="1C6B5B"/>
           <w:sz w:val="23"/>
         </w:rPr>
         <w:t xml:space="preserve">CLÁUSULA DÉCIMA SEXTA – DO ABANDONO: </w:t>
@@ -1070,7 +1069,7 @@
           <w:rFonts w:ascii="Times New Roman" w:hAnsi="Times New Roman" w:cs="Times New Roman"/>
           <w:b/>
           <w:i w:val="0"/>
-          <w:color w:val="1A1A1A"/>
+          <w:color w:val="1C6B5B"/>
           <w:sz w:val="23"/>
         </w:rPr>
         <w:t xml:space="preserve">CLÁUSULA DÉCIMA SÉTIMA – DA MULTA CONTRATUAL: </w:t>
@@ -1146,7 +1145,7 @@
           <w:rFonts w:ascii="Times New Roman" w:hAnsi="Times New Roman" w:cs="Times New Roman"/>
           <w:b/>
           <w:i w:val="0"/>
-          <w:color w:val="1A1A1A"/>
+          <w:color w:val="1C6B5B"/>
           <w:sz w:val="23"/>
         </w:rPr>
         <w:t xml:space="preserve">CLÁUSULA DÉCIMA OITAVA – DOS BENS DEIXADOS: </w:t>
@@ -1172,7 +1171,7 @@
           <w:rFonts w:ascii="Times New Roman" w:hAnsi="Times New Roman" w:cs="Times New Roman"/>
           <w:b/>
           <w:i w:val="0"/>
-          <w:color w:val="1A1A1A"/>
+          <w:color w:val="1C6B5B"/>
           <w:sz w:val="23"/>
         </w:rPr>
         <w:t xml:space="preserve">CLÁUSULA DÉCIMA NONA – DO DIREITO DE PREFERÊNCIA: </w:t>
@@ -1198,7 +1197,7 @@
           <w:rFonts w:ascii="Times New Roman" w:hAnsi="Times New Roman" w:cs="Times New Roman"/>
           <w:b/>
           <w:i w:val="0"/>
-          <w:color w:val="1A1A1A"/>
+          <w:color w:val="1C6B5B"/>
           <w:sz w:val="23"/>
         </w:rPr>
         <w:t xml:space="preserve">CLÁUSULA VIGÉSIMA – DO CORPO CLÍNICO: </w:t>
@@ -1299,7 +1298,7 @@
           <w:rFonts w:ascii="Times New Roman" w:hAnsi="Times New Roman" w:cs="Times New Roman"/>
           <w:b/>
           <w:i w:val="0"/>
-          <w:color w:val="1A1A1A"/>
+          <w:color w:val="1C6B5B"/>
           <w:sz w:val="23"/>
         </w:rPr>
         <w:t xml:space="preserve">CLÁUSULA VIGÉSIMA PRIMEIRA – DA CONTINUIDADE DO ATENDIMENTO: </w:t>
@@ -1350,7 +1349,7 @@
           <w:rFonts w:ascii="Times New Roman" w:hAnsi="Times New Roman" w:cs="Times New Roman"/>
           <w:b/>
           <w:i w:val="0"/>
-          <w:color w:val="1A1A1A"/>
+          <w:color w:val="1C6B5B"/>
           <w:sz w:val="23"/>
         </w:rPr>
         <w:t xml:space="preserve">CLÁUSULA VIGÉSIMA SEGUNDA – DOS PRONTUÁRIOS: </w:t>
@@ -1376,7 +1375,7 @@
           <w:rFonts w:ascii="Times New Roman" w:hAnsi="Times New Roman" w:cs="Times New Roman"/>
           <w:b/>
           <w:i w:val="0"/>
-          <w:color w:val="1A1A1A"/>
+          <w:color w:val="1C6B5B"/>
           <w:sz w:val="23"/>
         </w:rPr>
         <w:t xml:space="preserve">CLÁUSULA VIGÉSIMA TERCEIRA – DA PROTEÇÃO DE DADOS: </w:t>
@@ -1402,7 +1401,7 @@
           <w:rFonts w:ascii="Times New Roman" w:hAnsi="Times New Roman" w:cs="Times New Roman"/>
           <w:b/>
           <w:i w:val="0"/>
-          <w:color w:val="1A1A1A"/>
+          <w:color w:val="1C6B5B"/>
           <w:sz w:val="23"/>
         </w:rPr>
         <w:t xml:space="preserve">CLÁUSULA VIGÉSIMA QUARTA – DO NÃO ALICIAMENTO DE PACIENTES: </w:t>
@@ -1478,7 +1477,7 @@
           <w:rFonts w:ascii="Times New Roman" w:hAnsi="Times New Roman" w:cs="Times New Roman"/>
           <w:b/>
           <w:i w:val="0"/>
-          <w:color w:val="1A1A1A"/>
+          <w:color w:val="1C6B5B"/>
           <w:sz w:val="23"/>
         </w:rPr>
         <w:t xml:space="preserve">CLÁUSULA VIGÉSIMA QUINTA – DA TRANSIÇÃO E DA COMUNICAÇÃO DE SAÍDA: </w:t>
@@ -1554,7 +1553,7 @@
           <w:rFonts w:ascii="Times New Roman" w:hAnsi="Times New Roman" w:cs="Times New Roman"/>
           <w:b/>
           <w:i w:val="0"/>
-          <w:color w:val="1A1A1A"/>
+          <w:color w:val="1C6B5B"/>
           <w:sz w:val="23"/>
         </w:rPr>
         <w:t xml:space="preserve">CLÁUSULA VIGÉSIMA SEXTA – DO NÃO ALICIAMENTO DE PROFISSIONAIS: </w:t>
@@ -1580,7 +1579,7 @@
           <w:rFonts w:ascii="Times New Roman" w:hAnsi="Times New Roman" w:cs="Times New Roman"/>
           <w:b/>
           <w:i w:val="0"/>
-          <w:color w:val="1A1A1A"/>
+          <w:color w:val="1C6B5B"/>
           <w:sz w:val="23"/>
         </w:rPr>
         <w:t xml:space="preserve">CLÁUSULA VIGÉSIMA SÉTIMA – DA CONFIDENCIALIDADE E DO USO DA MARCA: </w:t>
@@ -1606,7 +1605,7 @@
           <w:rFonts w:ascii="Times New Roman" w:hAnsi="Times New Roman" w:cs="Times New Roman"/>
           <w:b/>
           <w:i w:val="0"/>
-          <w:color w:val="1A1A1A"/>
+          <w:color w:val="1C6B5B"/>
           <w:sz w:val="23"/>
         </w:rPr>
         <w:t xml:space="preserve">CLÁUSULA VIGÉSIMA OITAVA – DO FORO: </w:t>
@@ -1632,7 +1631,7 @@
           <w:rFonts w:ascii="Times New Roman" w:hAnsi="Times New Roman" w:cs="Times New Roman"/>
           <w:b/>
           <w:i w:val="0"/>
-          <w:color w:val="1A1A1A"/>
+          <w:color w:val="1C6B5B"/>
           <w:sz w:val="23"/>
         </w:rPr>
         <w:t xml:space="preserve">CLÁUSULA VIGÉSIMA NONA – DA INFRAÇÃO CONTRATUAL: </w:t>
@@ -1650,19 +1649,20 @@
     <w:p>
       <w:pPr>
         <w:pageBreakBefore/>
-        <w:spacing w:after="200" w:before="0" w:line="240" w:lineRule="auto"/>
-        <w:jc w:val="center"/>
+        <w:spacing w:after="120" w:before="200" w:line="240" w:lineRule="auto"/>
+        <w:jc w:val="left"/>
       </w:pPr>
       <w:r>
         <w:rPr>
           <w:rFonts w:ascii="Arial" w:hAnsi="Arial" w:cs="Arial"/>
           <w:b/>
           <w:i w:val="0"/>
-          <w:color w:val="8A6520"/>
-          <w:sz w:val="22"/>
+          <w:color w:val="FFFFFF"/>
+          <w:sz w:val="21"/>
           <w:smallCaps/>
+          <w:shd w:val="clear" w:color="auto" w:fill="1C6B5B"/>
         </w:rPr>
-        <w:t>ENCERRAMENTO E ASSINATURAS</w:t>
+        <w:t xml:space="preserve">  Encerramento e Assinaturas  </w:t>
       </w:r>
     </w:p>
     <w:p>
@@ -2096,19 +2096,20 @@
     </w:p>
     <w:p>
       <w:pPr>
-        <w:spacing w:after="160" w:before="480" w:line="336" w:lineRule="auto"/>
-        <w:jc w:val="both"/>
+        <w:spacing w:after="120" w:before="200" w:line="240" w:lineRule="auto"/>
+        <w:jc w:val="left"/>
       </w:pPr>
       <w:r>
         <w:rPr>
           <w:rFonts w:ascii="Arial" w:hAnsi="Arial" w:cs="Arial"/>
           <w:b/>
           <w:i w:val="0"/>
-          <w:color w:val="8A6520"/>
-          <w:sz w:val="20"/>
+          <w:color w:val="FFFFFF"/>
+          <w:sz w:val="21"/>
           <w:smallCaps/>
+          <w:shd w:val="clear" w:color="auto" w:fill="1C6B5B"/>
         </w:rPr>
-        <w:t>Testemunhas</w:t>
+        <w:t xml:space="preserve">  Testemunhas  </w:t>
       </w:r>
     </w:p>
     <w:p>
@@ -2144,54 +2145,52 @@
     <w:p>
       <w:pPr>
         <w:pageBreakBefore/>
-        <w:spacing w:after="60" w:before="0" w:line="240" w:lineRule="auto"/>
+        <w:spacing w:after="280" w:before="0" w:line="240" w:lineRule="auto"/>
         <w:jc w:val="center"/>
-      </w:pPr>
+        <w:shd w:val="clear" w:color="auto" w:fill="1C6B5B"/>
+      </w:pPr>
+      <w:r>
+        <w:rPr>
+          <w:rFonts w:ascii="Arial" w:hAnsi="Arial" w:cs="Arial"/>
+          <w:b w:val="0"/>
+          <w:i w:val="0"/>
+          <w:color w:val="FFFFFF"/>
+          <w:sz w:val="12"/>
+        </w:rPr>
+        <w:br/>
+      </w:r>
       <w:r>
         <w:rPr>
           <w:rFonts w:ascii="Arial" w:hAnsi="Arial" w:cs="Arial"/>
           <w:b/>
           <w:i w:val="0"/>
-          <w:color w:val="8A6520"/>
-          <w:sz w:val="18"/>
-          <w:smallCaps/>
-        </w:rPr>
-        <w:t>DOCUMENTO COMPLEMENTAR</w:t>
-      </w:r>
-    </w:p>
-    <w:p>
-      <w:pPr>
-        <w:spacing w:after="60" w:before="0" w:line="240" w:lineRule="auto"/>
-        <w:jc w:val="center"/>
-      </w:pPr>
-      <w:r>
-        <w:rPr>
-          <w:rFonts w:ascii="Arial" w:hAnsi="Arial" w:cs="Arial"/>
-          <w:b/>
-          <w:i w:val="0"/>
-          <w:color w:val="1A1A1A"/>
-          <w:sz w:val="32"/>
+          <w:color w:val="FFFFFF"/>
+          <w:sz w:val="36"/>
         </w:rPr>
         <w:t>NORMAS E ROTINAS</w:t>
       </w:r>
-    </w:p>
-    <w:p>
-      <w:pPr>
-        <w:spacing w:after="280" w:before="0" w:line="240" w:lineRule="auto"/>
-        <w:jc w:val="center"/>
-        <w:pBdr>
-          <w:bottom w:val="single" w:sz="6" w:space="6" w:color="8A6520"/>
-        </w:pBdr>
-      </w:pPr>
+      <w:r>
+        <w:br/>
+      </w:r>
       <w:r>
         <w:rPr>
           <w:rFonts w:ascii="Arial" w:hAnsi="Arial" w:cs="Arial"/>
           <w:b w:val="0"/>
-          <w:i/>
-          <w:color w:val="666666"/>
-          <w:sz w:val="19"/>
+          <w:i w:val="0"/>
+          <w:color w:val="FFFFFF"/>
+          <w:sz w:val="22"/>
         </w:rPr>
         <w:t>Biossegurança e controle de infecção do consultório</w:t>
+      </w:r>
+      <w:r>
+        <w:rPr>
+          <w:rFonts w:ascii="Arial" w:hAnsi="Arial" w:cs="Arial"/>
+          <w:b w:val="0"/>
+          <w:i w:val="0"/>
+          <w:color w:val="FFFFFF"/>
+          <w:sz w:val="12"/>
+        </w:rPr>
+        <w:br/>
       </w:r>
     </w:p>
     <w:p>
@@ -2661,54 +2660,52 @@
     <w:p>
       <w:pPr>
         <w:pageBreakBefore/>
-        <w:spacing w:after="60" w:before="0" w:line="240" w:lineRule="auto"/>
+        <w:spacing w:after="280" w:before="0" w:line="240" w:lineRule="auto"/>
         <w:jc w:val="center"/>
-      </w:pPr>
+        <w:shd w:val="clear" w:color="auto" w:fill="1C6B5B"/>
+      </w:pPr>
+      <w:r>
+        <w:rPr>
+          <w:rFonts w:ascii="Arial" w:hAnsi="Arial" w:cs="Arial"/>
+          <w:b w:val="0"/>
+          <w:i w:val="0"/>
+          <w:color w:val="FFFFFF"/>
+          <w:sz w:val="12"/>
+        </w:rPr>
+        <w:br/>
+      </w:r>
       <w:r>
         <w:rPr>
           <w:rFonts w:ascii="Arial" w:hAnsi="Arial" w:cs="Arial"/>
           <w:b/>
           <w:i w:val="0"/>
-          <w:color w:val="8A6520"/>
-          <w:sz w:val="18"/>
-          <w:smallCaps/>
-        </w:rPr>
-        <w:t>DOCUMENTO COMPLEMENTAR</w:t>
-      </w:r>
-    </w:p>
-    <w:p>
-      <w:pPr>
-        <w:spacing w:after="60" w:before="0" w:line="240" w:lineRule="auto"/>
-        <w:jc w:val="center"/>
-      </w:pPr>
-      <w:r>
-        <w:rPr>
-          <w:rFonts w:ascii="Arial" w:hAnsi="Arial" w:cs="Arial"/>
-          <w:b/>
-          <w:i w:val="0"/>
-          <w:color w:val="1A1A1A"/>
-          <w:sz w:val="32"/>
+          <w:color w:val="FFFFFF"/>
+          <w:sz w:val="36"/>
         </w:rPr>
         <w:t>PROCEDIMENTO OPERACIONAL PADRÃO</w:t>
       </w:r>
-    </w:p>
-    <w:p>
-      <w:pPr>
-        <w:spacing w:after="280" w:before="0" w:line="240" w:lineRule="auto"/>
-        <w:jc w:val="center"/>
-        <w:pBdr>
-          <w:bottom w:val="single" w:sz="6" w:space="6" w:color="8A6520"/>
-        </w:pBdr>
-      </w:pPr>
+      <w:r>
+        <w:br/>
+      </w:r>
       <w:r>
         <w:rPr>
           <w:rFonts w:ascii="Arial" w:hAnsi="Arial" w:cs="Arial"/>
           <w:b w:val="0"/>
-          <w:i/>
-          <w:color w:val="666666"/>
-          <w:sz w:val="19"/>
+          <w:i w:val="0"/>
+          <w:color w:val="FFFFFF"/>
+          <w:sz w:val="22"/>
         </w:rPr>
         <w:t>Rotina de segurança no atendimento odontológico</w:t>
+      </w:r>
+      <w:r>
+        <w:rPr>
+          <w:rFonts w:ascii="Arial" w:hAnsi="Arial" w:cs="Arial"/>
+          <w:b w:val="0"/>
+          <w:i w:val="0"/>
+          <w:color w:val="FFFFFF"/>
+          <w:sz w:val="12"/>
+        </w:rPr>
+        <w:br/>
       </w:r>
     </w:p>
     <w:p>
@@ -2761,54 +2758,52 @@
     <w:p>
       <w:pPr>
         <w:pageBreakBefore/>
-        <w:spacing w:after="60" w:before="0" w:line="240" w:lineRule="auto"/>
+        <w:spacing w:after="280" w:before="0" w:line="240" w:lineRule="auto"/>
         <w:jc w:val="center"/>
-      </w:pPr>
+        <w:shd w:val="clear" w:color="auto" w:fill="1C6B5B"/>
+      </w:pPr>
+      <w:r>
+        <w:rPr>
+          <w:rFonts w:ascii="Arial" w:hAnsi="Arial" w:cs="Arial"/>
+          <w:b w:val="0"/>
+          <w:i w:val="0"/>
+          <w:color w:val="FFFFFF"/>
+          <w:sz w:val="12"/>
+        </w:rPr>
+        <w:br/>
+      </w:r>
       <w:r>
         <w:rPr>
           <w:rFonts w:ascii="Arial" w:hAnsi="Arial" w:cs="Arial"/>
           <w:b/>
           <w:i w:val="0"/>
-          <w:color w:val="8A6520"/>
-          <w:sz w:val="18"/>
-          <w:smallCaps/>
-        </w:rPr>
-        <w:t>DOCUMENTO COMPLEMENTAR</w:t>
-      </w:r>
-    </w:p>
-    <w:p>
-      <w:pPr>
-        <w:spacing w:after="60" w:before="0" w:line="240" w:lineRule="auto"/>
-        <w:jc w:val="center"/>
-      </w:pPr>
-      <w:r>
-        <w:rPr>
-          <w:rFonts w:ascii="Arial" w:hAnsi="Arial" w:cs="Arial"/>
-          <w:b/>
-          <w:i w:val="0"/>
-          <w:color w:val="1A1A1A"/>
+          <w:color w:val="FFFFFF"/>
           <w:sz w:val="32"/>
         </w:rPr>
         <w:t>SOLICITAÇÃO DE INTEGRAÇÃO AO CORPO CLÍNICO</w:t>
       </w:r>
-    </w:p>
-    <w:p>
-      <w:pPr>
-        <w:spacing w:after="280" w:before="0" w:line="240" w:lineRule="auto"/>
-        <w:jc w:val="center"/>
-        <w:pBdr>
-          <w:bottom w:val="single" w:sz="6" w:space="6" w:color="8A6520"/>
-        </w:pBdr>
-      </w:pPr>
+      <w:r>
+        <w:br/>
+      </w:r>
       <w:r>
         <w:rPr>
           <w:rFonts w:ascii="Arial" w:hAnsi="Arial" w:cs="Arial"/>
           <w:b w:val="0"/>
-          <w:i/>
-          <w:color w:val="666666"/>
-          <w:sz w:val="19"/>
+          <w:i w:val="0"/>
+          <w:color w:val="FFFFFF"/>
+          <w:sz w:val="22"/>
         </w:rPr>
         <w:t>Adesão ao atendimento dos convênios credenciados</w:t>
+      </w:r>
+      <w:r>
+        <w:rPr>
+          <w:rFonts w:ascii="Arial" w:hAnsi="Arial" w:cs="Arial"/>
+          <w:b w:val="0"/>
+          <w:i w:val="0"/>
+          <w:color w:val="FFFFFF"/>
+          <w:sz w:val="12"/>
+        </w:rPr>
+        <w:br/>
       </w:r>
     </w:p>
     <w:p>
@@ -3032,9 +3027,7 @@
       <w:pStyle w:val="Footer"/>
       <w:spacing w:after="0" w:before="0" w:line="240" w:lineRule="auto"/>
       <w:jc w:val="center"/>
-      <w:pBdr>
-        <w:top w:val="single" w:sz="6" w:space="6" w:color="8A6520"/>
-      </w:pBdr>
+      <w:shd w:val="clear" w:color="auto" w:fill="1C6B5B"/>
     </w:pPr>
     <w:r/>
     <w:r>
@@ -3042,12 +3035,9 @@
         <w:rFonts w:ascii="Arial" w:hAnsi="Arial" w:cs="Arial"/>
         <w:b w:val="0"/>
         <w:i w:val="0"/>
-        <w:color w:val="666666"/>
-        <w:sz w:val="16"/>
-      </w:rPr>
-      <w:t>Rua Estevão de Mendonça, 552 · Bairro Popular · Cuiabá/MT · (65) 3623-0137</w:t>
-    </w:r>
-    <w:r>
+        <w:color w:val="FFFFFF"/>
+        <w:sz w:val="8"/>
+      </w:rPr>
       <w:br/>
     </w:r>
     <w:r>
@@ -3055,7 +3045,17 @@
         <w:rFonts w:ascii="Arial" w:hAnsi="Arial" w:cs="Arial"/>
         <w:b w:val="0"/>
         <w:i w:val="0"/>
-        <w:color w:val="666666"/>
+        <w:color w:val="FFFFFF"/>
+        <w:sz w:val="16"/>
+      </w:rPr>
+      <w:t xml:space="preserve">Rua Estevão de Mendonça, 552 · Bairro Popular · Cuiabá/MT · (65) 3623-0137      Página </w:t>
+    </w:r>
+    <w:r>
+      <w:rPr>
+        <w:rFonts w:ascii="Arial" w:hAnsi="Arial" w:cs="Arial"/>
+        <w:b w:val="0"/>
+        <w:i w:val="0"/>
+        <w:color w:val="FFFFFF"/>
         <w:sz w:val="16"/>
       </w:rPr>
       <w:fldChar w:fldCharType="begin"/>
@@ -3067,22 +3067,32 @@
         <w:rFonts w:ascii="Arial" w:hAnsi="Arial" w:cs="Arial"/>
         <w:b w:val="0"/>
         <w:i w:val="0"/>
-        <w:color w:val="666666"/>
+        <w:color w:val="FFFFFF"/>
         <w:sz w:val="16"/>
       </w:rPr>
-      <w:t xml:space="preserve"> / </w:t>
+      <w:t xml:space="preserve"> de </w:t>
     </w:r>
     <w:r>
       <w:rPr>
         <w:rFonts w:ascii="Arial" w:hAnsi="Arial" w:cs="Arial"/>
         <w:b w:val="0"/>
         <w:i w:val="0"/>
-        <w:color w:val="666666"/>
+        <w:color w:val="FFFFFF"/>
         <w:sz w:val="16"/>
       </w:rPr>
       <w:fldChar w:fldCharType="begin"/>
       <w:instrText xml:space="preserve"> NUMPAGES </w:instrText>
       <w:fldChar w:fldCharType="end"/>
+    </w:r>
+    <w:r>
+      <w:rPr>
+        <w:rFonts w:ascii="Arial" w:hAnsi="Arial" w:cs="Arial"/>
+        <w:b w:val="0"/>
+        <w:i w:val="0"/>
+        <w:color w:val="FFFFFF"/>
+        <w:sz w:val="8"/>
+      </w:rPr>
+      <w:br/>
     </w:r>
   </w:p>
 </w:ftr>
@@ -3105,7 +3115,7 @@
         <w:rFonts w:ascii="Arial" w:hAnsi="Arial" w:cs="Arial"/>
         <w:b/>
         <w:i w:val="0"/>
-        <w:color w:val="8A6520"/>
+        <w:color w:val="1C6B5B"/>
         <w:sz w:val="21"/>
         <w:smallCaps/>
       </w:rPr>

</xml_diff>

<commit_message>
Converte a identidade visual para escala de cinza (impressão laser P&B)
- Faixas de título, selos de seção e rodapé agora em cinza-escuro (#3A3A3A) com texto branco.
- Acento de títulos/cláusulas em cinza-escuro (#333333); filetes em cinza médio.
- Verificado no PDF real: tudo legível em P&B.

Co-Authored-By: Claude Opus 4.8 (1M context) <noreply@anthropic.com>
</commit_message>
<xml_diff>
--- a/clinica.docx
+++ b/clinica.docx
@@ -6,7 +6,7 @@
       <w:pPr>
         <w:spacing w:after="280" w:before="0" w:line="240" w:lineRule="auto"/>
         <w:jc w:val="center"/>
-        <w:shd w:val="clear" w:color="auto" w:fill="1C6B5B"/>
+        <w:shd w:val="clear" w:color="auto" w:fill="3A3A3A"/>
       </w:pPr>
       <w:r>
         <w:rPr>
@@ -81,7 +81,7 @@
           <w:color w:val="FFFFFF"/>
           <w:sz w:val="21"/>
           <w:smallCaps/>
-          <w:shd w:val="clear" w:color="auto" w:fill="1C6B5B"/>
+          <w:shd w:val="clear" w:color="auto" w:fill="3A3A3A"/>
         </w:rPr>
         <w:t xml:space="preserve">  Qualificação das Partes  </w:t>
       </w:r>
@@ -245,7 +245,7 @@
           <w:rFonts w:ascii="Times New Roman" w:hAnsi="Times New Roman" w:cs="Times New Roman"/>
           <w:b/>
           <w:i w:val="0"/>
-          <w:color w:val="1C6B5B"/>
+          <w:color w:val="333333"/>
           <w:sz w:val="23"/>
         </w:rPr>
         <w:t xml:space="preserve">CLÁUSULA PRIMEIRA – DO OBJETO DA LOCAÇÃO: </w:t>
@@ -321,7 +321,7 @@
           <w:rFonts w:ascii="Times New Roman" w:hAnsi="Times New Roman" w:cs="Times New Roman"/>
           <w:b/>
           <w:i w:val="0"/>
-          <w:color w:val="1C6B5B"/>
+          <w:color w:val="333333"/>
           <w:sz w:val="23"/>
         </w:rPr>
         <w:t xml:space="preserve">CLÁUSULA SEGUNDA – DO PRAZO: </w:t>
@@ -397,7 +397,7 @@
           <w:rFonts w:ascii="Times New Roman" w:hAnsi="Times New Roman" w:cs="Times New Roman"/>
           <w:b/>
           <w:i w:val="0"/>
-          <w:color w:val="1C6B5B"/>
+          <w:color w:val="333333"/>
           <w:sz w:val="23"/>
         </w:rPr>
         <w:t xml:space="preserve">CLÁUSULA TERCEIRA – DA FIANÇA: </w:t>
@@ -473,7 +473,7 @@
           <w:rFonts w:ascii="Times New Roman" w:hAnsi="Times New Roman" w:cs="Times New Roman"/>
           <w:b/>
           <w:i w:val="0"/>
-          <w:color w:val="1C6B5B"/>
+          <w:color w:val="333333"/>
           <w:sz w:val="23"/>
         </w:rPr>
         <w:t xml:space="preserve">CLÁUSULA QUARTA – DO VALOR DO ALUGUEL: </w:t>
@@ -549,7 +549,7 @@
           <w:rFonts w:ascii="Times New Roman" w:hAnsi="Times New Roman" w:cs="Times New Roman"/>
           <w:b/>
           <w:i w:val="0"/>
-          <w:color w:val="1C6B5B"/>
+          <w:color w:val="333333"/>
           <w:sz w:val="23"/>
         </w:rPr>
         <w:t xml:space="preserve">CLÁUSULA QUINTA – DO VENCIMENTO: </w:t>
@@ -643,7 +643,7 @@
           <w:rFonts w:ascii="Times New Roman" w:hAnsi="Times New Roman" w:cs="Times New Roman"/>
           <w:b/>
           <w:i w:val="0"/>
-          <w:color w:val="1C6B5B"/>
+          <w:color w:val="333333"/>
           <w:sz w:val="23"/>
         </w:rPr>
         <w:t xml:space="preserve">CLÁUSULA SEXTA – DO RATEIO DAS DESPESAS DE USO COMUM (CONDOMÍNIO): </w:t>
@@ -701,7 +701,7 @@
           <w:rFonts w:ascii="Times New Roman" w:hAnsi="Times New Roman" w:cs="Times New Roman"/>
           <w:b/>
           <w:i w:val="0"/>
-          <w:color w:val="1C6B5B"/>
+          <w:color w:val="333333"/>
           <w:sz w:val="23"/>
         </w:rPr>
         <w:t xml:space="preserve">CLÁUSULA SÉTIMA – DA VEDAÇÃO À CESSÃO E À SUBLOCAÇÃO: </w:t>
@@ -727,7 +727,7 @@
           <w:rFonts w:ascii="Times New Roman" w:hAnsi="Times New Roman" w:cs="Times New Roman"/>
           <w:b/>
           <w:i w:val="0"/>
-          <w:color w:val="1C6B5B"/>
+          <w:color w:val="333333"/>
           <w:sz w:val="23"/>
         </w:rPr>
         <w:t xml:space="preserve">CLÁUSULA OITAVA – DA REGULARIDADE: </w:t>
@@ -753,7 +753,7 @@
           <w:rFonts w:ascii="Times New Roman" w:hAnsi="Times New Roman" w:cs="Times New Roman"/>
           <w:b/>
           <w:i w:val="0"/>
-          <w:color w:val="1C6B5B"/>
+          <w:color w:val="333333"/>
           <w:sz w:val="23"/>
         </w:rPr>
         <w:t xml:space="preserve">CLÁUSULA NONA – DA EXTINÇÃO POR FALÊNCIA OU RECUPERAÇÃO JUDICIAL DO LOCADOR: </w:t>
@@ -779,7 +779,7 @@
           <w:rFonts w:ascii="Times New Roman" w:hAnsi="Times New Roman" w:cs="Times New Roman"/>
           <w:b/>
           <w:i w:val="0"/>
-          <w:color w:val="1C6B5B"/>
+          <w:color w:val="333333"/>
           <w:sz w:val="23"/>
         </w:rPr>
         <w:t xml:space="preserve">CLÁUSULA DÉCIMA – DAS BENFEITORIAS E OBRAS: </w:t>
@@ -805,7 +805,7 @@
           <w:rFonts w:ascii="Times New Roman" w:hAnsi="Times New Roman" w:cs="Times New Roman"/>
           <w:b/>
           <w:i w:val="0"/>
-          <w:color w:val="1C6B5B"/>
+          <w:color w:val="333333"/>
           <w:sz w:val="23"/>
         </w:rPr>
         <w:t xml:space="preserve">CLÁUSULA DÉCIMA PRIMEIRA – DO ESTADO E DA CONSERVAÇÃO DO IMÓVEL: </w:t>
@@ -889,7 +889,7 @@
           <w:rFonts w:ascii="Times New Roman" w:hAnsi="Times New Roman" w:cs="Times New Roman"/>
           <w:b/>
           <w:i w:val="0"/>
-          <w:color w:val="1C6B5B"/>
+          <w:color w:val="333333"/>
           <w:sz w:val="23"/>
         </w:rPr>
         <w:t xml:space="preserve">CLÁUSULA DÉCIMA SEGUNDA – DO REGULAMENTO INTERNO: </w:t>
@@ -915,7 +915,7 @@
           <w:rFonts w:ascii="Times New Roman" w:hAnsi="Times New Roman" w:cs="Times New Roman"/>
           <w:b/>
           <w:i w:val="0"/>
-          <w:color w:val="1C6B5B"/>
+          <w:color w:val="333333"/>
           <w:sz w:val="23"/>
         </w:rPr>
         <w:t xml:space="preserve">CLÁUSULA DÉCIMA TERCEIRA – DO DIREITO DE VISTORIA: </w:t>
@@ -941,7 +941,7 @@
           <w:rFonts w:ascii="Times New Roman" w:hAnsi="Times New Roman" w:cs="Times New Roman"/>
           <w:b/>
           <w:i w:val="0"/>
-          <w:color w:val="1C6B5B"/>
+          <w:color w:val="333333"/>
           <w:sz w:val="23"/>
         </w:rPr>
         <w:t xml:space="preserve">CLÁUSULA DÉCIMA QUARTA – DA MANUTENÇÃO DAS CONDIÇÕES NA PRORROGAÇÃO: </w:t>
@@ -967,7 +967,7 @@
           <w:rFonts w:ascii="Times New Roman" w:hAnsi="Times New Roman" w:cs="Times New Roman"/>
           <w:b/>
           <w:i w:val="0"/>
-          <w:color w:val="1C6B5B"/>
+          <w:color w:val="333333"/>
           <w:sz w:val="23"/>
         </w:rPr>
         <w:t xml:space="preserve">CLÁUSULA DÉCIMA QUINTA – DA DESOCUPAÇÃO: </w:t>
@@ -993,7 +993,7 @@
           <w:rFonts w:ascii="Times New Roman" w:hAnsi="Times New Roman" w:cs="Times New Roman"/>
           <w:b/>
           <w:i w:val="0"/>
-          <w:color w:val="1C6B5B"/>
+          <w:color w:val="333333"/>
           <w:sz w:val="23"/>
         </w:rPr>
         <w:t xml:space="preserve">CLÁUSULA DÉCIMA SEXTA – DO ABANDONO: </w:t>
@@ -1069,7 +1069,7 @@
           <w:rFonts w:ascii="Times New Roman" w:hAnsi="Times New Roman" w:cs="Times New Roman"/>
           <w:b/>
           <w:i w:val="0"/>
-          <w:color w:val="1C6B5B"/>
+          <w:color w:val="333333"/>
           <w:sz w:val="23"/>
         </w:rPr>
         <w:t xml:space="preserve">CLÁUSULA DÉCIMA SÉTIMA – DA MULTA CONTRATUAL: </w:t>
@@ -1145,7 +1145,7 @@
           <w:rFonts w:ascii="Times New Roman" w:hAnsi="Times New Roman" w:cs="Times New Roman"/>
           <w:b/>
           <w:i w:val="0"/>
-          <w:color w:val="1C6B5B"/>
+          <w:color w:val="333333"/>
           <w:sz w:val="23"/>
         </w:rPr>
         <w:t xml:space="preserve">CLÁUSULA DÉCIMA OITAVA – DOS BENS DEIXADOS: </w:t>
@@ -1171,7 +1171,7 @@
           <w:rFonts w:ascii="Times New Roman" w:hAnsi="Times New Roman" w:cs="Times New Roman"/>
           <w:b/>
           <w:i w:val="0"/>
-          <w:color w:val="1C6B5B"/>
+          <w:color w:val="333333"/>
           <w:sz w:val="23"/>
         </w:rPr>
         <w:t xml:space="preserve">CLÁUSULA DÉCIMA NONA – DO DIREITO DE PREFERÊNCIA: </w:t>
@@ -1197,7 +1197,7 @@
           <w:rFonts w:ascii="Times New Roman" w:hAnsi="Times New Roman" w:cs="Times New Roman"/>
           <w:b/>
           <w:i w:val="0"/>
-          <w:color w:val="1C6B5B"/>
+          <w:color w:val="333333"/>
           <w:sz w:val="23"/>
         </w:rPr>
         <w:t xml:space="preserve">CLÁUSULA VIGÉSIMA – DO CORPO CLÍNICO: </w:t>
@@ -1298,7 +1298,7 @@
           <w:rFonts w:ascii="Times New Roman" w:hAnsi="Times New Roman" w:cs="Times New Roman"/>
           <w:b/>
           <w:i w:val="0"/>
-          <w:color w:val="1C6B5B"/>
+          <w:color w:val="333333"/>
           <w:sz w:val="23"/>
         </w:rPr>
         <w:t xml:space="preserve">CLÁUSULA VIGÉSIMA PRIMEIRA – DA CONTINUIDADE DO ATENDIMENTO: </w:t>
@@ -1349,7 +1349,7 @@
           <w:rFonts w:ascii="Times New Roman" w:hAnsi="Times New Roman" w:cs="Times New Roman"/>
           <w:b/>
           <w:i w:val="0"/>
-          <w:color w:val="1C6B5B"/>
+          <w:color w:val="333333"/>
           <w:sz w:val="23"/>
         </w:rPr>
         <w:t xml:space="preserve">CLÁUSULA VIGÉSIMA SEGUNDA – DOS PRONTUÁRIOS: </w:t>
@@ -1375,7 +1375,7 @@
           <w:rFonts w:ascii="Times New Roman" w:hAnsi="Times New Roman" w:cs="Times New Roman"/>
           <w:b/>
           <w:i w:val="0"/>
-          <w:color w:val="1C6B5B"/>
+          <w:color w:val="333333"/>
           <w:sz w:val="23"/>
         </w:rPr>
         <w:t xml:space="preserve">CLÁUSULA VIGÉSIMA TERCEIRA – DA PROTEÇÃO DE DADOS: </w:t>
@@ -1401,7 +1401,7 @@
           <w:rFonts w:ascii="Times New Roman" w:hAnsi="Times New Roman" w:cs="Times New Roman"/>
           <w:b/>
           <w:i w:val="0"/>
-          <w:color w:val="1C6B5B"/>
+          <w:color w:val="333333"/>
           <w:sz w:val="23"/>
         </w:rPr>
         <w:t xml:space="preserve">CLÁUSULA VIGÉSIMA QUARTA – DO NÃO ALICIAMENTO DE PACIENTES: </w:t>
@@ -1477,7 +1477,7 @@
           <w:rFonts w:ascii="Times New Roman" w:hAnsi="Times New Roman" w:cs="Times New Roman"/>
           <w:b/>
           <w:i w:val="0"/>
-          <w:color w:val="1C6B5B"/>
+          <w:color w:val="333333"/>
           <w:sz w:val="23"/>
         </w:rPr>
         <w:t xml:space="preserve">CLÁUSULA VIGÉSIMA QUINTA – DA TRANSIÇÃO E DA COMUNICAÇÃO DE SAÍDA: </w:t>
@@ -1553,7 +1553,7 @@
           <w:rFonts w:ascii="Times New Roman" w:hAnsi="Times New Roman" w:cs="Times New Roman"/>
           <w:b/>
           <w:i w:val="0"/>
-          <w:color w:val="1C6B5B"/>
+          <w:color w:val="333333"/>
           <w:sz w:val="23"/>
         </w:rPr>
         <w:t xml:space="preserve">CLÁUSULA VIGÉSIMA SEXTA – DO NÃO ALICIAMENTO DE PROFISSIONAIS: </w:t>
@@ -1579,7 +1579,7 @@
           <w:rFonts w:ascii="Times New Roman" w:hAnsi="Times New Roman" w:cs="Times New Roman"/>
           <w:b/>
           <w:i w:val="0"/>
-          <w:color w:val="1C6B5B"/>
+          <w:color w:val="333333"/>
           <w:sz w:val="23"/>
         </w:rPr>
         <w:t xml:space="preserve">CLÁUSULA VIGÉSIMA SÉTIMA – DA CONFIDENCIALIDADE E DO USO DA MARCA: </w:t>
@@ -1605,7 +1605,7 @@
           <w:rFonts w:ascii="Times New Roman" w:hAnsi="Times New Roman" w:cs="Times New Roman"/>
           <w:b/>
           <w:i w:val="0"/>
-          <w:color w:val="1C6B5B"/>
+          <w:color w:val="333333"/>
           <w:sz w:val="23"/>
         </w:rPr>
         <w:t xml:space="preserve">CLÁUSULA VIGÉSIMA OITAVA – DO FORO: </w:t>
@@ -1631,7 +1631,7 @@
           <w:rFonts w:ascii="Times New Roman" w:hAnsi="Times New Roman" w:cs="Times New Roman"/>
           <w:b/>
           <w:i w:val="0"/>
-          <w:color w:val="1C6B5B"/>
+          <w:color w:val="333333"/>
           <w:sz w:val="23"/>
         </w:rPr>
         <w:t xml:space="preserve">CLÁUSULA VIGÉSIMA NONA – DA INFRAÇÃO CONTRATUAL: </w:t>
@@ -1660,7 +1660,7 @@
           <w:color w:val="FFFFFF"/>
           <w:sz w:val="21"/>
           <w:smallCaps/>
-          <w:shd w:val="clear" w:color="auto" w:fill="1C6B5B"/>
+          <w:shd w:val="clear" w:color="auto" w:fill="3A3A3A"/>
         </w:rPr>
         <w:t xml:space="preserve">  Encerramento e Assinaturas  </w:t>
       </w:r>
@@ -2107,7 +2107,7 @@
           <w:color w:val="FFFFFF"/>
           <w:sz w:val="21"/>
           <w:smallCaps/>
-          <w:shd w:val="clear" w:color="auto" w:fill="1C6B5B"/>
+          <w:shd w:val="clear" w:color="auto" w:fill="3A3A3A"/>
         </w:rPr>
         <w:t xml:space="preserve">  Testemunhas  </w:t>
       </w:r>
@@ -2147,7 +2147,7 @@
         <w:pageBreakBefore/>
         <w:spacing w:after="280" w:before="0" w:line="240" w:lineRule="auto"/>
         <w:jc w:val="center"/>
-        <w:shd w:val="clear" w:color="auto" w:fill="1C6B5B"/>
+        <w:shd w:val="clear" w:color="auto" w:fill="3A3A3A"/>
       </w:pPr>
       <w:r>
         <w:rPr>
@@ -2662,7 +2662,7 @@
         <w:pageBreakBefore/>
         <w:spacing w:after="280" w:before="0" w:line="240" w:lineRule="auto"/>
         <w:jc w:val="center"/>
-        <w:shd w:val="clear" w:color="auto" w:fill="1C6B5B"/>
+        <w:shd w:val="clear" w:color="auto" w:fill="3A3A3A"/>
       </w:pPr>
       <w:r>
         <w:rPr>
@@ -2760,7 +2760,7 @@
         <w:pageBreakBefore/>
         <w:spacing w:after="280" w:before="0" w:line="240" w:lineRule="auto"/>
         <w:jc w:val="center"/>
-        <w:shd w:val="clear" w:color="auto" w:fill="1C6B5B"/>
+        <w:shd w:val="clear" w:color="auto" w:fill="3A3A3A"/>
       </w:pPr>
       <w:r>
         <w:rPr>
@@ -3027,7 +3027,7 @@
       <w:pStyle w:val="Footer"/>
       <w:spacing w:after="0" w:before="0" w:line="240" w:lineRule="auto"/>
       <w:jc w:val="center"/>
-      <w:shd w:val="clear" w:color="auto" w:fill="1C6B5B"/>
+      <w:shd w:val="clear" w:color="auto" w:fill="3A3A3A"/>
     </w:pPr>
     <w:r/>
     <w:r>
@@ -3106,7 +3106,7 @@
       <w:spacing w:after="40" w:before="0" w:line="240" w:lineRule="auto"/>
       <w:jc w:val="center"/>
       <w:pBdr>
-        <w:bottom w:val="single" w:sz="6" w:space="6" w:color="8A6520"/>
+        <w:bottom w:val="single" w:sz="6" w:space="6" w:color="808080"/>
       </w:pBdr>
     </w:pPr>
     <w:r/>
@@ -3115,7 +3115,7 @@
         <w:rFonts w:ascii="Arial" w:hAnsi="Arial" w:cs="Arial"/>
         <w:b/>
         <w:i w:val="0"/>
-        <w:color w:val="1C6B5B"/>
+        <w:color w:val="333333"/>
         <w:sz w:val="21"/>
         <w:smallCaps/>
       </w:rPr>

</xml_diff>

<commit_message>
Esterilização: testes e livros de monitoramento são responsabilidade da clínica
Ajusta a Cláusula Vigésima Oitava: a realização, documentação e guarda
dos testes químicos e biológicos da autoclave e respectivos livros são
do LOCADOR — documentos da clínica para todos os inquilinos, não dados
individuais do dentista. Inquilino segue fornecendo insumos e
identificando seus pacotes. Parágrafo de regresso renumerado para Quarto.

Co-Authored-By: Claude Opus 4.8 (1M context) <noreply@anthropic.com>
</commit_message>
<xml_diff>
--- a/clinica.docx
+++ b/clinica.docx
@@ -1667,7 +1667,7 @@
           <w:i w:val="0"/>
           <w:sz w:val="23"/>
         </w:rPr>
-        <w:t>O LOCATÁRIO obriga-se a observar o fluxo unidirecional de processamento (área suja → área limpa → área estéril), a registrar e arquivar os resultados dos testes químicos e biológicos e a identificar cada pacote com data, lote, responsável e indicador, mantendo tais registros à disposição da fiscalização sanitária e do LOCADOR.</w:t>
+        <w:t>O LOCATÁRIO obriga-se a observar o fluxo unidirecional de processamento (área suja → área limpa → área estéril) e a identificar cada pacote dos seus instrumentais com data, lote, responsável e indicador químico, observadas as boas práticas de biossegurança.</w:t>
       </w:r>
     </w:p>
     <w:p>
@@ -1684,6 +1684,31 @@
           <w:sz w:val="23"/>
         </w:rPr>
         <w:t xml:space="preserve">Parágrafo Terceiro – </w:t>
+      </w:r>
+      <w:r>
+        <w:rPr>
+          <w:rFonts w:ascii="Times New Roman" w:hAnsi="Times New Roman" w:cs="Times New Roman"/>
+          <w:b w:val="0"/>
+          <w:i w:val="0"/>
+          <w:sz w:val="23"/>
+        </w:rPr>
+        <w:t>A realização, a documentação e a guarda dos testes químicos e biológicos de monitoramento da autoclave, bem como os respectivos livros e registros de controle, são de responsabilidade exclusiva do LOCADOR e constituem documentos da clínica referentes a todos os inquilinos, mantidos à disposição da fiscalização sanitária, não se confundindo com dados ou registros individuais do LOCATÁRIO.</w:t>
+      </w:r>
+    </w:p>
+    <w:p>
+      <w:pPr>
+        <w:spacing w:after="120" w:before="0" w:line="336" w:lineRule="auto"/>
+        <w:ind w:firstLine="709"/>
+        <w:jc w:val="both"/>
+      </w:pPr>
+      <w:r>
+        <w:rPr>
+          <w:rFonts w:ascii="Times New Roman" w:hAnsi="Times New Roman" w:cs="Times New Roman"/>
+          <w:b/>
+          <w:i w:val="0"/>
+          <w:sz w:val="23"/>
+        </w:rPr>
+        <w:t xml:space="preserve">Parágrafo Quarto – </w:t>
       </w:r>
       <w:r>
         <w:rPr>

</xml_diff>